<commit_message>
fix: agrupa condicionantes por item numerado (remove quebras de linha do texto) e troca checkbox por seletor atendida/nao atendida por condicionante
</commit_message>
<xml_diff>
--- a/src/lib/templates/relatorio-condicionantes/template.docx
+++ b/src/lib/templates/relatorio-condicionantes/template.docx
@@ -178,7 +178,7 @@
           </w:tcPr>
           <w:p>
             <w:pPr>
-              <w:jc w:val="both"/>
+              <w:jc w:val="left"/>
             </w:pPr>
             <w:r>
               <w:rPr>
@@ -212,7 +212,7 @@
               </w:rPr>
               <w:sz w:val="20"/>
               <w:szCs w:val="20"/>
-              <w:t xml:space="preserve">{@checkbox}</w:t>
+              <w:t xml:space="preserve">{@atendimento}</w:t>
             </w:r>
             <w:r>
               <w:rPr>

</xml_diff>

<commit_message>
fix: layout do relatorio de condicionantes (dropdown estatico no template, sem injecao de XML em w:t) e parsing de condicionantes
</commit_message>
<xml_diff>
--- a/src/lib/templates/relatorio-condicionantes/template.docx
+++ b/src/lib/templates/relatorio-condicionantes/template.docx
@@ -206,14 +206,25 @@
             <w:pPr>
               <w:jc w:val="center"/>
             </w:pPr>
-            <w:r>
-              <w:rPr>
-                <w:rFonts w:ascii="Ebrima" w:hAnsi="Ebrima"/>
-              </w:rPr>
-              <w:sz w:val="20"/>
-              <w:szCs w:val="20"/>
-              <w:t xml:space="preserve">{@atendimento}</w:t>
-            </w:r>
+            <w:sdt>
+              <w:sdtPr>
+                <w:dropDownList>
+                  <w:listItem w:displayText="Selecione..." w:value=""/>
+                  <w:listItem w:displayText="Atendida" w:value="Atendida"/>
+                  <w:listItem w:displayText="Não atendida" w:value="Não atendida"/>
+                </w:dropDownList>
+              </w:sdtPr>
+              <w:sdtContent>
+                <w:r>
+                  <w:rPr>
+                    <w:rFonts w:ascii="Ebrima" w:hAnsi="Ebrima"/>
+                    <w:sz w:val="20"/>
+                    <w:szCs w:val="20"/>
+                  </w:rPr>
+                  <w:t>Selecione...</w:t>
+                </w:r>
+              </w:sdtContent>
+            </w:sdt>
             <w:r>
               <w:rPr>
                 <w:rFonts w:ascii="Ebrima" w:hAnsi="Ebrima"/>

</xml_diff>

<commit_message>
feat: relatorio condicionantes com timbrado, titulo correto, tipo licenca dinamico e atendimento automatico
</commit_message>
<xml_diff>
--- a/src/lib/templates/relatorio-condicionantes/template.docx
+++ b/src/lib/templates/relatorio-condicionantes/template.docx
@@ -1,38 +1,7 @@
 
 <file path=word/document.xml><?xml version="1.0" encoding="utf-8"?>
-<w:document xmlns:wpc="http://schemas.microsoft.com/office/word/2010/wordprocessingCanvas" xmlns:cx="http://schemas.microsoft.com/office/drawing/2014/chartex" xmlns:cx1="http://schemas.microsoft.com/office/drawing/2015/9/8/chartex" xmlns:cx2="http://schemas.microsoft.com/office/drawing/2015/10/21/chartex" xmlns:cx3="http://schemas.microsoft.com/office/drawing/2016/5/9/chartex" xmlns:cx4="http://schemas.microsoft.com/office/drawing/2016/5/10/chartex" xmlns:cx5="http://schemas.microsoft.com/office/drawing/2016/5/11/chartex" xmlns:cx6="http://schemas.microsoft.com/office/drawing/2016/5/12/chartex" xmlns:cx7="http://schemas.microsoft.com/office/drawing/2016/5/13/chartex" xmlns:cx8="http://schemas.microsoft.com/office/drawing/2016/5/14/chartex" xmlns:mc="http://schemas.openxmlformats.org/markup-compatibility/2006" xmlns:aink="http://schemas.microsoft.com/office/drawing/2016/ink" xmlns:am3d="http://schemas.microsoft.com/office/drawing/2017/model3d" xmlns:o="urn:schemas-microsoft-com:office:office" xmlns:oel="http://schemas.microsoft.com/office/2019/extlst" xmlns:r="http://schemas.openxmlformats.org/officeDocument/2006/relationships" xmlns:m="http://schemas.openxmlformats.org/officeDocument/2006/math" xmlns:v="urn:schemas-microsoft-com:vml" xmlns:wp14="http://schemas.microsoft.com/office/word/2010/wordprocessingDrawing" xmlns:wp="http://schemas.openxmlformats.org/drawingml/2006/wordprocessingDrawing" xmlns:w10="urn:schemas-microsoft-com:office:word" xmlns:w="http://schemas.openxmlformats.org/wordprocessingml/2006/main" xmlns:w14="http://schemas.microsoft.com/office/word/2010/wordml" xmlns:w15="http://schemas.microsoft.com/office/word/2012/wordml" xmlns:w16cex="http://schemas.microsoft.com/office/word/2018/wordml/cex" xmlns:w16cid="http://schemas.microsoft.com/office/word/2016/wordml/cid" xmlns:w16="http://schemas.microsoft.com/office/word/2018/wordml" xmlns:w16du="http://schemas.microsoft.com/office/word/2023/wordml/word16du" xmlns:w16sdtdh="http://schemas.microsoft.com/office/word/2020/wordml/sdtdatahash" xmlns:w16sdtfl="http://schemas.microsoft.com/office/word/2024/wordml/sdtformatlock" xmlns:w16se="http://schemas.microsoft.com/office/word/2015/wordml/symex" xmlns:wpg="http://schemas.microsoft.com/office/word/2010/wordprocessingGroup" xmlns:wpi="http://schemas.microsoft.com/office/word/2010/wordprocessingInk" xmlns:wne="http://schemas.microsoft.com/office/word/2006/wordml" xmlns:wps="http://schemas.microsoft.com/office/word/2010/wordprocessingShape" mc:Ignorable="w14 w15 w16se w16cid w16 w16cex w16sdtdh w16sdtfl w16du wp14">
+<w:document xmlns:wpc="http://schemas.microsoft.com/office/word/2010/wordprocessingCanvas" xmlns:cx="http://schemas.microsoft.com/office/drawing/2014/chartex" xmlns:cx1="http://schemas.microsoft.com/office/drawing/2015/9/8/chartex" xmlns:cx2="http://schemas.microsoft.com/office/drawing/2015/10/21/chartex" xmlns:cx3="http://schemas.microsoft.com/office/drawing/2016/5/9/chartex" xmlns:cx4="http://schemas.microsoft.com/office/drawing/2016/5/10/chartex" xmlns:cx5="http://schemas.microsoft.com/office/drawing/2016/5/11/chartex" xmlns:cx6="http://schemas.microsoft.com/office/drawing/2016/5/12/chartex" xmlns:cx7="http://schemas.microsoft.com/office/drawing/2016/5/13/chartex" xmlns:cx8="http://schemas.microsoft.com/office/drawing/2016/5/14/chartex" xmlns:mc="http://schemas.openxmlformats.org/markup-compatibility/2006" xmlns:aink="http://schemas.microsoft.com/office/drawing/2016/ink" xmlns:am3d="http://schemas.microsoft.com/office/drawing/2017/model3d" xmlns:o="urn:schemas-microsoft-com:office:office" xmlns:oel="http://schemas.microsoft.com/office/2019/extlst" xmlns:r="http://schemas.openxmlformats.org/officeDocument/2006/relationships" xmlns:m="http://schemas.openxmlformats.org/officeDocument/2006/math" xmlns:v="urn:schemas-microsoft-com:vml" xmlns:wp14="http://schemas.microsoft.com/office/word/2010/wordprocessingDrawing" xmlns:wp="http://schemas.openxmlformats.org/drawingml/2006/wordprocessingDrawing" xmlns:w10="urn:schemas-microsoft-com:office:word" xmlns:w="http://schemas.openxmlformats.org/wordprocessingml/2006/main" xmlns:w14="http://schemas.microsoft.com/office/word/2010/wordml" xmlns:w15="http://schemas.microsoft.com/office/word/2012/wordml" xmlns:w16cei="http://schemas.microsoft.com/office/word/2026/wordml/cei" xmlns:w16cex="http://schemas.microsoft.com/office/word/2018/wordml/cex" xmlns:w16cid="http://schemas.microsoft.com/office/word/2016/wordml/cid" xmlns:w16="http://schemas.microsoft.com/office/word/2018/wordml" xmlns:w16du="http://schemas.microsoft.com/office/word/2023/wordml/word16du" xmlns:w16sdtdh="http://schemas.microsoft.com/office/word/2020/wordml/sdtdatahash" xmlns:w16sdtfl="http://schemas.microsoft.com/office/word/2024/wordml/sdtformatlock" xmlns:w16se="http://schemas.microsoft.com/office/word/2015/wordml/symex" xmlns:wpg="http://schemas.microsoft.com/office/word/2010/wordprocessingGroup" xmlns:wpi="http://schemas.microsoft.com/office/word/2010/wordprocessingInk" xmlns:wne="http://schemas.microsoft.com/office/word/2006/wordml" xmlns:wps="http://schemas.microsoft.com/office/word/2010/wordprocessingShape" mc:Ignorable="w14 w15 w16se w16cid w16 w16cex w16sdtdh w16sdtfl w16du wp14">
   <w:body>
-    <w:p>
-      <w:pPr>
-        <w:jc w:val="center"/>
-      </w:pPr>
-      <w:r>
-        <w:pict>
-          <v:shapetype id="_x0000_t75" coordsize="21600,21600" o:spt="75" o:preferrelative="t" path="m@4@5l@4@11@9@11@9@5xe" filled="f" stroked="f">
-            <v:stroke joinstyle="miter"/>
-            <v:formulas>
-              <v:f eqn="if lineDrawn pixelLineWidth 0"/>
-              <v:f eqn="sum @0 1 0"/>
-              <v:f eqn="sum 0 0 @1"/>
-              <v:f eqn="prod @2 1 2"/>
-              <v:f eqn="prod @3 21600 pixelWidth"/>
-              <v:f eqn="prod @3 21600 pixelHeight"/>
-              <v:f eqn="sum @0 0 1"/>
-              <v:f eqn="prod @6 1 2"/>
-              <v:f eqn="prod @7 21600 pixelWidth"/>
-              <v:f eqn="sum @8 21600 0"/>
-              <v:f eqn="prod @7 21600 pixelHeight"/>
-              <v:f eqn="sum @10 21600 0"/>
-            </v:formulas>
-            <v:path o:extrusionok="f" gradientshapeok="t" o:connecttype="rect"/>
-            <o:lock v:ext="edit" aspectratio="t"/>
-          </v:shapetype>
-          <v:shape id="_x0000_i1025" type="#_x0000_t75" style="width:85pt;height:79pt">
-            <v:imagedata r:id="rIdLogo100" o:title="LogoNagalli"/>
-          </v:shape>
-        </w:pict>
-      </w:r>
-    </w:p>
     <w:p>
       <w:pPr>
         <w:jc w:val="center"/>
@@ -41,9 +10,9 @@
           <w:b/>
           <w:bCs/>
           <w:u w:val="single"/>
+          <w:sz w:val="24"/>
+          <w:szCs w:val="24"/>
         </w:rPr>
-        <w:sz w:val="24"/>
-        <w:szCs w:val="24"/>
       </w:pPr>
       <w:r>
         <w:rPr>
@@ -51,9 +20,9 @@
           <w:b/>
           <w:bCs/>
           <w:u w:val="single"/>
+          <w:sz w:val="24"/>
+          <w:szCs w:val="24"/>
         </w:rPr>
-        <w:sz w:val="24"/>
-        <w:szCs w:val="24"/>
         <w:t xml:space="preserve">RELATÓRIO DE ATENDIMENTO A CONDICIONANTES</w:t>
       </w:r>
     </w:p>
@@ -64,41 +33,19 @@
           <w:rFonts w:ascii="Ebrima" w:hAnsi="Ebrima"/>
           <w:b/>
           <w:bCs/>
+          <w:sz w:val="22"/>
+          <w:szCs w:val="22"/>
         </w:rPr>
-        <w:sz w:val="22"/>
-        <w:szCs w:val="22"/>
       </w:pPr>
       <w:r>
         <w:rPr>
           <w:rFonts w:ascii="Ebrima" w:hAnsi="Ebrima"/>
           <w:b/>
           <w:bCs/>
+          <w:sz w:val="22"/>
+          <w:szCs w:val="22"/>
         </w:rPr>
-        <w:sz w:val="22"/>
-        <w:szCs w:val="22"/>
-        <w:t xml:space="preserve">LICENÇA DE OPERAÇÃO No {num_licenca}</w:t>
-      </w:r>
-    </w:p>
-    <w:p>
-      <w:pPr>
-        <w:jc w:val="center"/>
-        <w:rPr>
-          <w:rFonts w:ascii="Ebrima" w:hAnsi="Ebrima"/>
-          <w:b/>
-          <w:bCs/>
-        </w:rPr>
-        <w:sz w:val="20"/>
-        <w:szCs w:val="20"/>
-      </w:pPr>
-      <w:r>
-        <w:rPr>
-          <w:rFonts w:ascii="Ebrima" w:hAnsi="Ebrima"/>
-          <w:b/>
-          <w:bCs/>
-        </w:rPr>
-        <w:sz w:val="20"/>
-        <w:szCs w:val="20"/>
-        <w:t xml:space="preserve">{tipo}</w:t>
+        <w:t xml:space="preserve">{tipo} Nº {num_licenca}</w:t>
       </w:r>
     </w:p>
     <w:p>
@@ -106,16 +53,16 @@
         <w:jc w:val="both"/>
         <w:rPr>
           <w:rFonts w:ascii="Ebrima" w:hAnsi="Ebrima"/>
+          <w:sz w:val="20"/>
+          <w:szCs w:val="20"/>
         </w:rPr>
-        <w:sz w:val="20"/>
-        <w:szCs w:val="20"/>
       </w:pPr>
       <w:r>
         <w:rPr>
           <w:rFonts w:ascii="Ebrima" w:hAnsi="Ebrima"/>
+          <w:sz w:val="20"/>
+          <w:szCs w:val="20"/>
         </w:rPr>
-        <w:sz w:val="20"/>
-        <w:szCs w:val="20"/>
         <w:t xml:space="preserve">Estão previstos como Detalhamento dos Requisitos de Licenciamento:</w:t>
       </w:r>
     </w:p>
@@ -143,9 +90,9 @@
                 <w:rFonts w:ascii="Ebrima" w:hAnsi="Ebrima"/>
                 <w:b/>
                 <w:bCs/>
+                <w:sz w:val="20"/>
+                <w:szCs w:val="20"/>
               </w:rPr>
-              <w:sz w:val="20"/>
-              <w:szCs w:val="20"/>
               <w:t xml:space="preserve">Requisito</w:t>
             </w:r>
           </w:p>
@@ -163,9 +110,9 @@
                 <w:rFonts w:ascii="Ebrima" w:hAnsi="Ebrima"/>
                 <w:b/>
                 <w:bCs/>
+                <w:sz w:val="20"/>
+                <w:szCs w:val="20"/>
               </w:rPr>
-              <w:sz w:val="20"/>
-              <w:szCs w:val="20"/>
               <w:t xml:space="preserve">Atendimento</w:t>
             </w:r>
           </w:p>
@@ -183,18 +130,29 @@
             <w:r>
               <w:rPr>
                 <w:rFonts w:ascii="Ebrima" w:hAnsi="Ebrima"/>
+                <w:sz w:val="20"/>
+                <w:szCs w:val="20"/>
+                <w:noProof/>
               </w:rPr>
-              <w:sz w:val="20"/>
-              <w:szCs w:val="20"/>
               <w:t xml:space="preserve">{#condicionantes}</w:t>
             </w:r>
             <w:r>
               <w:rPr>
                 <w:rFonts w:ascii="Ebrima" w:hAnsi="Ebrima"/>
+                <w:sz w:val="20"/>
+                <w:szCs w:val="20"/>
+                <w:noProof/>
               </w:rPr>
-              <w:sz w:val="20"/>
-              <w:szCs w:val="20"/>
               <w:t xml:space="preserve">{descricao}</w:t>
+            </w:r>
+            <w:r>
+              <w:rPr>
+                <w:rFonts w:ascii="Ebrima" w:hAnsi="Ebrima"/>
+                <w:sz w:val="20"/>
+                <w:szCs w:val="20"/>
+                <w:noProof/>
+              </w:rPr>
+              <w:t xml:space="preserve">{/condicionantes}</w:t>
             </w:r>
           </w:p>
         </w:tc>
@@ -206,31 +164,30 @@
             <w:pPr>
               <w:jc w:val="center"/>
             </w:pPr>
-            <w:sdt>
-              <w:sdtPr>
-                <w:dropDownList>
-                  <w:listItem w:displayText="Selecione..." w:value=""/>
-                  <w:listItem w:displayText="Atendida" w:value="Atendida"/>
-                  <w:listItem w:displayText="Não atendida" w:value="Não atendida"/>
-                </w:dropDownList>
-              </w:sdtPr>
-              <w:sdtContent>
-                <w:r>
-                  <w:rPr>
-                    <w:rFonts w:ascii="Ebrima" w:hAnsi="Ebrima"/>
-                    <w:sz w:val="20"/>
-                    <w:szCs w:val="20"/>
-                  </w:rPr>
-                  <w:t>Selecione...</w:t>
-                </w:r>
-              </w:sdtContent>
-            </w:sdt>
             <w:r>
               <w:rPr>
                 <w:rFonts w:ascii="Ebrima" w:hAnsi="Ebrima"/>
+                <w:sz w:val="20"/>
+                <w:szCs w:val="20"/>
+                <w:noProof/>
               </w:rPr>
-              <w:sz w:val="20"/>
-              <w:szCs w:val="20"/>
+              <w:t xml:space="preserve">{#condicionantes}</w:t>
+            </w:r>
+            <w:r>
+              <w:rPr>
+                <w:rFonts w:ascii="Ebrima" w:hAnsi="Ebrima"/>
+                <w:sz w:val="20"/>
+                <w:szCs w:val="20"/>
+              </w:rPr>
+              <w:t xml:space="preserve">Item dispositivo/orientativo. Requisito atendido.</w:t>
+            </w:r>
+            <w:r>
+              <w:rPr>
+                <w:rFonts w:ascii="Ebrima" w:hAnsi="Ebrima"/>
+                <w:sz w:val="20"/>
+                <w:szCs w:val="20"/>
+                <w:noProof/>
+              </w:rPr>
               <w:t xml:space="preserve">{/condicionantes}</w:t>
             </w:r>
           </w:p>
@@ -242,16 +199,17 @@
         <w:jc w:val="center"/>
         <w:rPr>
           <w:rFonts w:ascii="Ebrima" w:hAnsi="Ebrima"/>
+          <w:sz w:val="20"/>
+          <w:szCs w:val="20"/>
         </w:rPr>
-        <w:sz w:val="20"/>
-        <w:szCs w:val="20"/>
       </w:pPr>
       <w:r>
         <w:rPr>
           <w:rFonts w:ascii="Ebrima" w:hAnsi="Ebrima"/>
+          <w:sz w:val="20"/>
+          <w:szCs w:val="20"/>
+          <w:noProof/>
         </w:rPr>
-        <w:sz w:val="20"/>
-        <w:szCs w:val="20"/>
         <w:t xml:space="preserve">{data_emissao}</w:t>
       </w:r>
     </w:p>
@@ -262,44 +220,30 @@
           <w:rFonts w:ascii="Ebrima" w:hAnsi="Ebrima"/>
           <w:b/>
           <w:bCs/>
+          <w:sz w:val="22"/>
+          <w:szCs w:val="22"/>
         </w:rPr>
-        <w:sz w:val="22"/>
-        <w:szCs w:val="22"/>
       </w:pPr>
       <w:r>
         <w:rPr>
           <w:rFonts w:ascii="Ebrima" w:hAnsi="Ebrima"/>
           <w:b/>
           <w:bCs/>
+          <w:sz w:val="22"/>
+          <w:szCs w:val="22"/>
         </w:rPr>
-        <w:sz w:val="22"/>
-        <w:szCs w:val="22"/>
         <w:t xml:space="preserve">{empresa}</w:t>
       </w:r>
     </w:p>
-    <w:p>
-      <w:pPr>
-        <w:jc w:val="center"/>
-        <w:rPr>
-          <w:rFonts w:ascii="Ebrima" w:hAnsi="Ebrima"/>
-        </w:rPr>
-        <w:sz w:val="16"/>
-        <w:szCs w:val="16"/>
-        <w:color w:val="808080"/>
-      </w:pPr>
-      <w:r>
-        <w:rPr>
-          <w:rFonts w:ascii="Ebrima" w:hAnsi="Ebrima"/>
-        </w:rPr>
-        <w:sz w:val="16"/>
-        <w:szCs w:val="16"/>
-        <w:color w:val="808080"/>
-        <w:t xml:space="preserve">© Nagalli Ambiental — Proibida a cópia e distribuição. Todos os direitos reservados.</w:t>
-      </w:r>
-    </w:p>
     <w:sectPr>
+      <w:headerReference w:type="even" r:id="rId7"/>
+      <w:headerReference w:type="default" r:id="rId8"/>
+      <w:footerReference w:type="even" r:id="rId9"/>
+      <w:footerReference w:type="default" r:id="rId10"/>
+      <w:headerReference w:type="first" r:id="rId11"/>
+      <w:footerReference w:type="first" r:id="rId12"/>
       <w:pgSz w:w="11906" w:h="16838"/>
-      <w:pgMar w:top="1417" w:right="1701" w:bottom="1417" w:left="1701" w:header="708" w:footer="708" w:gutter="0"/>
+      <w:pgMar w:top="1843" w:right="1418" w:bottom="1418" w:left="1701" w:header="567" w:footer="981" w:gutter="0"/>
       <w:cols w:space="708"/>
       <w:docGrid w:linePitch="360"/>
     </w:sectPr>
@@ -307,98 +251,368 @@
 </w:document>
 </file>
 
-<file path=word/numbering.xml><?xml version="1.0" encoding="utf-8"?>
-<w:numbering xmlns:wpc="http://schemas.microsoft.com/office/word/2010/wordprocessingCanvas" xmlns:cx="http://schemas.microsoft.com/office/drawing/2014/chartex" xmlns:cx1="http://schemas.microsoft.com/office/drawing/2015/9/8/chartex" xmlns:cx2="http://schemas.microsoft.com/office/drawing/2015/10/21/chartex" xmlns:cx3="http://schemas.microsoft.com/office/drawing/2016/5/9/chartex" xmlns:cx4="http://schemas.microsoft.com/office/drawing/2016/5/10/chartex" xmlns:cx5="http://schemas.microsoft.com/office/drawing/2016/5/11/chartex" xmlns:cx6="http://schemas.microsoft.com/office/drawing/2016/5/12/chartex" xmlns:cx7="http://schemas.microsoft.com/office/drawing/2016/5/13/chartex" xmlns:cx8="http://schemas.microsoft.com/office/drawing/2016/5/14/chartex" xmlns:mc="http://schemas.openxmlformats.org/markup-compatibility/2006" xmlns:aink="http://schemas.microsoft.com/office/drawing/2016/ink" xmlns:am3d="http://schemas.microsoft.com/office/drawing/2017/model3d" xmlns:o="urn:schemas-microsoft-com:office:office" xmlns:oel="http://schemas.microsoft.com/office/2019/extlst" xmlns:r="http://schemas.openxmlformats.org/officeDocument/2006/relationships" xmlns:m="http://schemas.openxmlformats.org/officeDocument/2006/math" xmlns:v="urn:schemas-microsoft-com:vml" xmlns:wp14="http://schemas.microsoft.com/office/word/2010/wordprocessingDrawing" xmlns:wp="http://schemas.openxmlformats.org/drawingml/2006/wordprocessingDrawing" xmlns:w10="urn:schemas-microsoft-com:office:word" xmlns:w="http://schemas.openxmlformats.org/wordprocessingml/2006/main" xmlns:w14="http://schemas.microsoft.com/office/word/2010/wordml" xmlns:w15="http://schemas.microsoft.com/office/word/2012/wordml" xmlns:w16cex="http://schemas.microsoft.com/office/word/2018/wordml/cex" xmlns:w16cid="http://schemas.microsoft.com/office/word/2016/wordml/cid" xmlns:w16="http://schemas.microsoft.com/office/word/2018/wordml" xmlns:w16du="http://schemas.microsoft.com/office/word/2023/wordml/word16du" xmlns:w16sdtdh="http://schemas.microsoft.com/office/word/2020/wordml/sdtdatahash" xmlns:w16sdtfl="http://schemas.microsoft.com/office/word/2024/wordml/sdtformatlock" xmlns:w16se="http://schemas.microsoft.com/office/word/2015/wordml/symex" xmlns:wpg="http://schemas.microsoft.com/office/word/2010/wordprocessingGroup" xmlns:wpi="http://schemas.microsoft.com/office/word/2010/wordprocessingInk" xmlns:wne="http://schemas.microsoft.com/office/word/2006/wordml" xmlns:wps="http://schemas.microsoft.com/office/word/2010/wordprocessingShape" mc:Ignorable="w14 w15 w16se w16cid w16 w16cex w16sdtdh w16sdtfl w16du wp14">
-  <w:abstractNum w:abstractNumId="0" w15:restartNumberingAfterBreak="0">
-    <w:nsid w:val="445E0F3B"/>
-    <w:multiLevelType w:val="hybridMultilevel"/>
-    <w:tmpl w:val="96C486BA"/>
-    <w:lvl w:ilvl="0" w:tplc="0416000F">
-      <w:start w:val="1"/>
-      <w:numFmt w:val="decimal"/>
-      <w:lvlText w:val="%1."/>
-      <w:lvlJc w:val="left"/>
+<file path=word/endnotes.xml><?xml version="1.0" encoding="utf-8"?>
+<w:endnotes xmlns:wpc="http://schemas.microsoft.com/office/word/2010/wordprocessingCanvas" xmlns:cx="http://schemas.microsoft.com/office/drawing/2014/chartex" xmlns:cx1="http://schemas.microsoft.com/office/drawing/2015/9/8/chartex" xmlns:cx2="http://schemas.microsoft.com/office/drawing/2015/10/21/chartex" xmlns:cx3="http://schemas.microsoft.com/office/drawing/2016/5/9/chartex" xmlns:cx4="http://schemas.microsoft.com/office/drawing/2016/5/10/chartex" xmlns:cx5="http://schemas.microsoft.com/office/drawing/2016/5/11/chartex" xmlns:cx6="http://schemas.microsoft.com/office/drawing/2016/5/12/chartex" xmlns:cx7="http://schemas.microsoft.com/office/drawing/2016/5/13/chartex" xmlns:cx8="http://schemas.microsoft.com/office/drawing/2016/5/14/chartex" xmlns:mc="http://schemas.openxmlformats.org/markup-compatibility/2006" xmlns:aink="http://schemas.microsoft.com/office/drawing/2016/ink" xmlns:am3d="http://schemas.microsoft.com/office/drawing/2017/model3d" xmlns:o="urn:schemas-microsoft-com:office:office" xmlns:oel="http://schemas.microsoft.com/office/2019/extlst" xmlns:r="http://schemas.openxmlformats.org/officeDocument/2006/relationships" xmlns:m="http://schemas.openxmlformats.org/officeDocument/2006/math" xmlns:v="urn:schemas-microsoft-com:vml" xmlns:wp14="http://schemas.microsoft.com/office/word/2010/wordprocessingDrawing" xmlns:wp="http://schemas.openxmlformats.org/drawingml/2006/wordprocessingDrawing" xmlns:w10="urn:schemas-microsoft-com:office:word" xmlns:w="http://schemas.openxmlformats.org/wordprocessingml/2006/main" xmlns:w14="http://schemas.microsoft.com/office/word/2010/wordml" xmlns:w15="http://schemas.microsoft.com/office/word/2012/wordml" xmlns:w16cei="http://schemas.microsoft.com/office/word/2026/wordml/cei" xmlns:w16cex="http://schemas.microsoft.com/office/word/2018/wordml/cex" xmlns:w16cid="http://schemas.microsoft.com/office/word/2016/wordml/cid" xmlns:w16="http://schemas.microsoft.com/office/word/2018/wordml" xmlns:w16du="http://schemas.microsoft.com/office/word/2023/wordml/word16du" xmlns:w16sdtdh="http://schemas.microsoft.com/office/word/2020/wordml/sdtdatahash" xmlns:w16sdtfl="http://schemas.microsoft.com/office/word/2024/wordml/sdtformatlock" xmlns:w16se="http://schemas.microsoft.com/office/word/2015/wordml/symex" xmlns:wpg="http://schemas.microsoft.com/office/word/2010/wordprocessingGroup" xmlns:wpi="http://schemas.microsoft.com/office/word/2010/wordprocessingInk" xmlns:wne="http://schemas.microsoft.com/office/word/2006/wordml" xmlns:wps="http://schemas.microsoft.com/office/word/2010/wordprocessingShape" mc:Ignorable="w14 w15 w16se w16cid w16 w16cex w16sdtdh w16sdtfl w16du wp14">
+  <w:endnote w:type="separator" w:id="-1">
+    <w:p>
       <w:pPr>
-        <w:ind w:left="720" w:hanging="360"/>
+        <w:spacing w:after="0" w:line="240" w:lineRule="auto"/>
       </w:pPr>
-    </w:lvl>
-    <w:lvl w:ilvl="1" w:tplc="04160019" w:tentative="1">
-      <w:start w:val="1"/>
-      <w:numFmt w:val="lowerLetter"/>
-      <w:lvlText w:val="%2."/>
-      <w:lvlJc w:val="left"/>
+      <w:r>
+        <w:separator/>
+      </w:r>
+    </w:p>
+  </w:endnote>
+  <w:endnote w:type="continuationSeparator" w:id="0">
+    <w:p>
       <w:pPr>
-        <w:ind w:left="1440" w:hanging="360"/>
+        <w:spacing w:after="0" w:line="240" w:lineRule="auto"/>
       </w:pPr>
-    </w:lvl>
-    <w:lvl w:ilvl="2" w:tplc="0416001B" w:tentative="1">
-      <w:start w:val="1"/>
-      <w:numFmt w:val="lowerRoman"/>
-      <w:lvlText w:val="%3."/>
-      <w:lvlJc w:val="right"/>
+      <w:r>
+        <w:continuationSeparator/>
+      </w:r>
+    </w:p>
+  </w:endnote>
+</w:endnotes>
+</file>
+
+<file path=word/footer1.xml><?xml version="1.0" encoding="utf-8"?>
+<w:ftr xmlns:wpc="http://schemas.microsoft.com/office/word/2010/wordprocessingCanvas" xmlns:cx="http://schemas.microsoft.com/office/drawing/2014/chartex" xmlns:cx1="http://schemas.microsoft.com/office/drawing/2015/9/8/chartex" xmlns:cx2="http://schemas.microsoft.com/office/drawing/2015/10/21/chartex" xmlns:cx3="http://schemas.microsoft.com/office/drawing/2016/5/9/chartex" xmlns:cx4="http://schemas.microsoft.com/office/drawing/2016/5/10/chartex" xmlns:cx5="http://schemas.microsoft.com/office/drawing/2016/5/11/chartex" xmlns:cx6="http://schemas.microsoft.com/office/drawing/2016/5/12/chartex" xmlns:cx7="http://schemas.microsoft.com/office/drawing/2016/5/13/chartex" xmlns:cx8="http://schemas.microsoft.com/office/drawing/2016/5/14/chartex" xmlns:mc="http://schemas.openxmlformats.org/markup-compatibility/2006" xmlns:aink="http://schemas.microsoft.com/office/drawing/2016/ink" xmlns:am3d="http://schemas.microsoft.com/office/drawing/2017/model3d" xmlns:o="urn:schemas-microsoft-com:office:office" xmlns:oel="http://schemas.microsoft.com/office/2019/extlst" xmlns:r="http://schemas.openxmlformats.org/officeDocument/2006/relationships" xmlns:m="http://schemas.openxmlformats.org/officeDocument/2006/math" xmlns:v="urn:schemas-microsoft-com:vml" xmlns:wp14="http://schemas.microsoft.com/office/word/2010/wordprocessingDrawing" xmlns:wp="http://schemas.openxmlformats.org/drawingml/2006/wordprocessingDrawing" xmlns:w10="urn:schemas-microsoft-com:office:word" xmlns:w="http://schemas.openxmlformats.org/wordprocessingml/2006/main" xmlns:w14="http://schemas.microsoft.com/office/word/2010/wordml" xmlns:w15="http://schemas.microsoft.com/office/word/2012/wordml" xmlns:w16cei="http://schemas.microsoft.com/office/word/2026/wordml/cei" xmlns:w16cex="http://schemas.microsoft.com/office/word/2018/wordml/cex" xmlns:w16cid="http://schemas.microsoft.com/office/word/2016/wordml/cid" xmlns:w16="http://schemas.microsoft.com/office/word/2018/wordml" xmlns:w16du="http://schemas.microsoft.com/office/word/2023/wordml/word16du" xmlns:w16sdtdh="http://schemas.microsoft.com/office/word/2020/wordml/sdtdatahash" xmlns:w16sdtfl="http://schemas.microsoft.com/office/word/2024/wordml/sdtformatlock" xmlns:w16se="http://schemas.microsoft.com/office/word/2015/wordml/symex" xmlns:wpg="http://schemas.microsoft.com/office/word/2010/wordprocessingGroup" xmlns:wpi="http://schemas.microsoft.com/office/word/2010/wordprocessingInk" xmlns:wne="http://schemas.microsoft.com/office/word/2006/wordml" xmlns:wps="http://schemas.microsoft.com/office/word/2010/wordprocessingShape" mc:Ignorable="w14 w15 w16se w16cid w16 w16cex w16sdtdh w16sdtfl w16du wp14">
+  <w:p>
+    <w:pPr>
+      <w:pStyle w:val="Rodap"/>
+    </w:pPr>
+  </w:p>
+</w:ftr>
+</file>
+
+<file path=word/footer2.xml><?xml version="1.0" encoding="utf-8"?>
+<w:ftr xmlns:wpc="http://schemas.microsoft.com/office/word/2010/wordprocessingCanvas" xmlns:cx="http://schemas.microsoft.com/office/drawing/2014/chartex" xmlns:cx1="http://schemas.microsoft.com/office/drawing/2015/9/8/chartex" xmlns:cx2="http://schemas.microsoft.com/office/drawing/2015/10/21/chartex" xmlns:cx3="http://schemas.microsoft.com/office/drawing/2016/5/9/chartex" xmlns:cx4="http://schemas.microsoft.com/office/drawing/2016/5/10/chartex" xmlns:cx5="http://schemas.microsoft.com/office/drawing/2016/5/11/chartex" xmlns:cx6="http://schemas.microsoft.com/office/drawing/2016/5/12/chartex" xmlns:cx7="http://schemas.microsoft.com/office/drawing/2016/5/13/chartex" xmlns:cx8="http://schemas.microsoft.com/office/drawing/2016/5/14/chartex" xmlns:mc="http://schemas.openxmlformats.org/markup-compatibility/2006" xmlns:aink="http://schemas.microsoft.com/office/drawing/2016/ink" xmlns:am3d="http://schemas.microsoft.com/office/drawing/2017/model3d" xmlns:o="urn:schemas-microsoft-com:office:office" xmlns:oel="http://schemas.microsoft.com/office/2019/extlst" xmlns:r="http://schemas.openxmlformats.org/officeDocument/2006/relationships" xmlns:m="http://schemas.openxmlformats.org/officeDocument/2006/math" xmlns:v="urn:schemas-microsoft-com:vml" xmlns:wp14="http://schemas.microsoft.com/office/word/2010/wordprocessingDrawing" xmlns:wp="http://schemas.openxmlformats.org/drawingml/2006/wordprocessingDrawing" xmlns:w10="urn:schemas-microsoft-com:office:word" xmlns:w="http://schemas.openxmlformats.org/wordprocessingml/2006/main" xmlns:w14="http://schemas.microsoft.com/office/word/2010/wordml" xmlns:w15="http://schemas.microsoft.com/office/word/2012/wordml" xmlns:w16cei="http://schemas.microsoft.com/office/word/2026/wordml/cei" xmlns:w16cex="http://schemas.microsoft.com/office/word/2018/wordml/cex" xmlns:w16cid="http://schemas.microsoft.com/office/word/2016/wordml/cid" xmlns:w16="http://schemas.microsoft.com/office/word/2018/wordml" xmlns:w16du="http://schemas.microsoft.com/office/word/2023/wordml/word16du" xmlns:w16sdtdh="http://schemas.microsoft.com/office/word/2020/wordml/sdtdatahash" xmlns:w16sdtfl="http://schemas.microsoft.com/office/word/2024/wordml/sdtformatlock" xmlns:w16se="http://schemas.microsoft.com/office/word/2015/wordml/symex" xmlns:wpg="http://schemas.microsoft.com/office/word/2010/wordprocessingGroup" xmlns:wpi="http://schemas.microsoft.com/office/word/2010/wordprocessingInk" xmlns:wne="http://schemas.microsoft.com/office/word/2006/wordml" xmlns:wps="http://schemas.microsoft.com/office/word/2010/wordprocessingShape" mc:Ignorable="w14 w15 w16se w16cid w16 w16cex w16sdtdh w16sdtfl w16du wp14">
+  <w:p>
+    <w:pPr>
+      <w:pStyle w:val="Cabealho"/>
+    </w:pPr>
+    <w:r>
+      <w:rPr>
+        <w:noProof/>
+      </w:rPr>
+      <mc:AlternateContent>
+        <mc:Choice Requires="wps">
+          <w:drawing>
+            <wp:anchor distT="0" distB="0" distL="114300" distR="114300" simplePos="0" relativeHeight="251666432" behindDoc="0" locked="0" layoutInCell="1" allowOverlap="1" wp14:anchorId="04A0C177" wp14:editId="0B88E321">
+              <wp:simplePos x="0" y="0"/>
+              <wp:positionH relativeFrom="column">
+                <wp:posOffset>-3562</wp:posOffset>
+              </wp:positionH>
+              <wp:positionV relativeFrom="paragraph">
+                <wp:posOffset>85642</wp:posOffset>
+              </wp:positionV>
+              <wp:extent cx="5578475" cy="0"/>
+              <wp:effectExtent l="19050" t="19050" r="98425" b="114300"/>
+              <wp:wrapNone/>
+              <wp:docPr id="195" name="Conector reto 195"/>
+              <wp:cNvGraphicFramePr/>
+              <a:graphic xmlns:a="http://schemas.openxmlformats.org/drawingml/2006/main">
+                <a:graphicData uri="http://schemas.microsoft.com/office/word/2010/wordprocessingShape">
+                  <wps:wsp>
+                    <wps:cNvCnPr/>
+                    <wps:spPr>
+                      <a:xfrm>
+                        <a:off x="0" y="0"/>
+                        <a:ext cx="5578475" cy="0"/>
+                      </a:xfrm>
+                      <a:prstGeom prst="line">
+                        <a:avLst/>
+                      </a:prstGeom>
+                      <a:effectLst>
+                        <a:outerShdw blurRad="50800" dist="50800" dir="2400000" algn="ctr" rotWithShape="0">
+                          <a:schemeClr val="accent1">
+                            <a:lumMod val="60000"/>
+                            <a:lumOff val="40000"/>
+                          </a:schemeClr>
+                        </a:outerShdw>
+                      </a:effectLst>
+                    </wps:spPr>
+                    <wps:style>
+                      <a:lnRef idx="3">
+                        <a:schemeClr val="accent6"/>
+                      </a:lnRef>
+                      <a:fillRef idx="0">
+                        <a:schemeClr val="accent6"/>
+                      </a:fillRef>
+                      <a:effectRef idx="2">
+                        <a:schemeClr val="accent6"/>
+                      </a:effectRef>
+                      <a:fontRef idx="minor">
+                        <a:schemeClr val="tx1"/>
+                      </a:fontRef>
+                    </wps:style>
+                    <wps:bodyPr/>
+                  </wps:wsp>
+                </a:graphicData>
+              </a:graphic>
+              <wp14:sizeRelH relativeFrom="margin">
+                <wp14:pctWidth>0</wp14:pctWidth>
+              </wp14:sizeRelH>
+            </wp:anchor>
+          </w:drawing>
+        </mc:Choice>
+        <mc:Fallback>
+          <w:pict>
+            <v:line w14:anchorId="52925A08" id="Conector reto 195" o:spid="_x0000_s1026" style="position:absolute;z-index:251666432;visibility:visible;mso-wrap-style:square;mso-width-percent:0;mso-wrap-distance-left:9pt;mso-wrap-distance-top:0;mso-wrap-distance-right:9pt;mso-wrap-distance-bottom:0;mso-position-horizontal:absolute;mso-position-horizontal-relative:text;mso-position-vertical:absolute;mso-position-vertical-relative:text;mso-width-percent:0;mso-width-relative:margin" from="-.3pt,6.75pt" to="438.95pt,6.75pt" o:gfxdata="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" strokecolor="#70ad47 [3209]" strokeweight="1.5pt">
+              <v:stroke joinstyle="miter"/>
+              <v:shadow on="t" color="#8eaadb [1940]" offset="1.081mm,.90706mm"/>
+            </v:line>
+          </w:pict>
+        </mc:Fallback>
+      </mc:AlternateContent>
+    </w:r>
+    <w:r>
+      <w:t xml:space="preserve">   </w:t>
+    </w:r>
+  </w:p>
+  <w:p>
+    <w:pPr>
+      <w:pStyle w:val="Cabealho"/>
+      <w:jc w:val="center"/>
+      <w:rPr>
+        <w:rFonts w:ascii="Bahnschrift SemiCondensed" w:hAnsi="Bahnschrift SemiCondensed"/>
+        <w:color w:val="538135" w:themeColor="accent6" w:themeShade="BF"/>
+        <w:sz w:val="18"/>
+        <w:szCs w:val="18"/>
+      </w:rPr>
+    </w:pPr>
+    <w:r>
+      <w:rPr>
+        <w:rFonts w:ascii="Bahnschrift SemiCondensed" w:hAnsi="Bahnschrift SemiCondensed"/>
+        <w:color w:val="538135" w:themeColor="accent6" w:themeShade="BF"/>
+        <w:sz w:val="18"/>
+        <w:szCs w:val="18"/>
+      </w:rPr>
+      <w:t>Av. Presidente Arthur da Silva Bernardes, 1514 - Portão, Curitiba - PR, 80320-300</w:t>
+    </w:r>
+    <w:r>
+      <w:rPr>
+        <w:rFonts w:ascii="Bahnschrift SemiCondensed" w:hAnsi="Bahnschrift SemiCondensed"/>
+        <w:color w:val="538135" w:themeColor="accent6" w:themeShade="BF"/>
+        <w:sz w:val="18"/>
+        <w:szCs w:val="18"/>
+      </w:rPr>
+      <w:t>. E-mail: nagalliambiental@gmail.com</w:t>
+    </w:r>
+  </w:p>
+</w:ftr>
+</file>
+
+<file path=word/footer3.xml><?xml version="1.0" encoding="utf-8"?>
+<w:ftr xmlns:wpc="http://schemas.microsoft.com/office/word/2010/wordprocessingCanvas" xmlns:cx="http://schemas.microsoft.com/office/drawing/2014/chartex" xmlns:cx1="http://schemas.microsoft.com/office/drawing/2015/9/8/chartex" xmlns:cx2="http://schemas.microsoft.com/office/drawing/2015/10/21/chartex" xmlns:cx3="http://schemas.microsoft.com/office/drawing/2016/5/9/chartex" xmlns:cx4="http://schemas.microsoft.com/office/drawing/2016/5/10/chartex" xmlns:cx5="http://schemas.microsoft.com/office/drawing/2016/5/11/chartex" xmlns:cx6="http://schemas.microsoft.com/office/drawing/2016/5/12/chartex" xmlns:cx7="http://schemas.microsoft.com/office/drawing/2016/5/13/chartex" xmlns:cx8="http://schemas.microsoft.com/office/drawing/2016/5/14/chartex" xmlns:mc="http://schemas.openxmlformats.org/markup-compatibility/2006" xmlns:aink="http://schemas.microsoft.com/office/drawing/2016/ink" xmlns:am3d="http://schemas.microsoft.com/office/drawing/2017/model3d" xmlns:o="urn:schemas-microsoft-com:office:office" xmlns:oel="http://schemas.microsoft.com/office/2019/extlst" xmlns:r="http://schemas.openxmlformats.org/officeDocument/2006/relationships" xmlns:m="http://schemas.openxmlformats.org/officeDocument/2006/math" xmlns:v="urn:schemas-microsoft-com:vml" xmlns:wp14="http://schemas.microsoft.com/office/word/2010/wordprocessingDrawing" xmlns:wp="http://schemas.openxmlformats.org/drawingml/2006/wordprocessingDrawing" xmlns:w10="urn:schemas-microsoft-com:office:word" xmlns:w="http://schemas.openxmlformats.org/wordprocessingml/2006/main" xmlns:w14="http://schemas.microsoft.com/office/word/2010/wordml" xmlns:w15="http://schemas.microsoft.com/office/word/2012/wordml" xmlns:w16cei="http://schemas.microsoft.com/office/word/2026/wordml/cei" xmlns:w16cex="http://schemas.microsoft.com/office/word/2018/wordml/cex" xmlns:w16cid="http://schemas.microsoft.com/office/word/2016/wordml/cid" xmlns:w16="http://schemas.microsoft.com/office/word/2018/wordml" xmlns:w16du="http://schemas.microsoft.com/office/word/2023/wordml/word16du" xmlns:w16sdtdh="http://schemas.microsoft.com/office/word/2020/wordml/sdtdatahash" xmlns:w16sdtfl="http://schemas.microsoft.com/office/word/2024/wordml/sdtformatlock" xmlns:w16se="http://schemas.microsoft.com/office/word/2015/wordml/symex" xmlns:wpg="http://schemas.microsoft.com/office/word/2010/wordprocessingGroup" xmlns:wpi="http://schemas.microsoft.com/office/word/2010/wordprocessingInk" xmlns:wne="http://schemas.microsoft.com/office/word/2006/wordml" xmlns:wps="http://schemas.microsoft.com/office/word/2010/wordprocessingShape" mc:Ignorable="w14 w15 w16se w16cid w16 w16cex w16sdtdh w16sdtfl w16du wp14">
+  <w:p>
+    <w:pPr>
+      <w:pStyle w:val="Rodap"/>
+    </w:pPr>
+  </w:p>
+</w:ftr>
+</file>
+
+<file path=word/footnotes.xml><?xml version="1.0" encoding="utf-8"?>
+<w:footnotes xmlns:wpc="http://schemas.microsoft.com/office/word/2010/wordprocessingCanvas" xmlns:cx="http://schemas.microsoft.com/office/drawing/2014/chartex" xmlns:cx1="http://schemas.microsoft.com/office/drawing/2015/9/8/chartex" xmlns:cx2="http://schemas.microsoft.com/office/drawing/2015/10/21/chartex" xmlns:cx3="http://schemas.microsoft.com/office/drawing/2016/5/9/chartex" xmlns:cx4="http://schemas.microsoft.com/office/drawing/2016/5/10/chartex" xmlns:cx5="http://schemas.microsoft.com/office/drawing/2016/5/11/chartex" xmlns:cx6="http://schemas.microsoft.com/office/drawing/2016/5/12/chartex" xmlns:cx7="http://schemas.microsoft.com/office/drawing/2016/5/13/chartex" xmlns:cx8="http://schemas.microsoft.com/office/drawing/2016/5/14/chartex" xmlns:mc="http://schemas.openxmlformats.org/markup-compatibility/2006" xmlns:aink="http://schemas.microsoft.com/office/drawing/2016/ink" xmlns:am3d="http://schemas.microsoft.com/office/drawing/2017/model3d" xmlns:o="urn:schemas-microsoft-com:office:office" xmlns:oel="http://schemas.microsoft.com/office/2019/extlst" xmlns:r="http://schemas.openxmlformats.org/officeDocument/2006/relationships" xmlns:m="http://schemas.openxmlformats.org/officeDocument/2006/math" xmlns:v="urn:schemas-microsoft-com:vml" xmlns:wp14="http://schemas.microsoft.com/office/word/2010/wordprocessingDrawing" xmlns:wp="http://schemas.openxmlformats.org/drawingml/2006/wordprocessingDrawing" xmlns:w10="urn:schemas-microsoft-com:office:word" xmlns:w="http://schemas.openxmlformats.org/wordprocessingml/2006/main" xmlns:w14="http://schemas.microsoft.com/office/word/2010/wordml" xmlns:w15="http://schemas.microsoft.com/office/word/2012/wordml" xmlns:w16cei="http://schemas.microsoft.com/office/word/2026/wordml/cei" xmlns:w16cex="http://schemas.microsoft.com/office/word/2018/wordml/cex" xmlns:w16cid="http://schemas.microsoft.com/office/word/2016/wordml/cid" xmlns:w16="http://schemas.microsoft.com/office/word/2018/wordml" xmlns:w16du="http://schemas.microsoft.com/office/word/2023/wordml/word16du" xmlns:w16sdtdh="http://schemas.microsoft.com/office/word/2020/wordml/sdtdatahash" xmlns:w16sdtfl="http://schemas.microsoft.com/office/word/2024/wordml/sdtformatlock" xmlns:w16se="http://schemas.microsoft.com/office/word/2015/wordml/symex" xmlns:wpg="http://schemas.microsoft.com/office/word/2010/wordprocessingGroup" xmlns:wpi="http://schemas.microsoft.com/office/word/2010/wordprocessingInk" xmlns:wne="http://schemas.microsoft.com/office/word/2006/wordml" xmlns:wps="http://schemas.microsoft.com/office/word/2010/wordprocessingShape" mc:Ignorable="w14 w15 w16se w16cid w16 w16cex w16sdtdh w16sdtfl w16du wp14">
+  <w:footnote w:type="separator" w:id="-1">
+    <w:p>
       <w:pPr>
-        <w:ind w:left="2160" w:hanging="180"/>
+        <w:spacing w:after="0" w:line="240" w:lineRule="auto"/>
       </w:pPr>
-    </w:lvl>
-    <w:lvl w:ilvl="3" w:tplc="0416000F" w:tentative="1">
-      <w:start w:val="1"/>
-      <w:numFmt w:val="decimal"/>
-      <w:lvlText w:val="%4."/>
-      <w:lvlJc w:val="left"/>
+      <w:r>
+        <w:separator/>
+      </w:r>
+    </w:p>
+  </w:footnote>
+  <w:footnote w:type="continuationSeparator" w:id="0">
+    <w:p>
       <w:pPr>
-        <w:ind w:left="2880" w:hanging="360"/>
+        <w:spacing w:after="0" w:line="240" w:lineRule="auto"/>
       </w:pPr>
-    </w:lvl>
-    <w:lvl w:ilvl="4" w:tplc="04160019" w:tentative="1">
-      <w:start w:val="1"/>
-      <w:numFmt w:val="lowerLetter"/>
-      <w:lvlText w:val="%5."/>
-      <w:lvlJc w:val="left"/>
-      <w:pPr>
-        <w:ind w:left="3600" w:hanging="360"/>
-      </w:pPr>
-    </w:lvl>
-    <w:lvl w:ilvl="5" w:tplc="0416001B" w:tentative="1">
-      <w:start w:val="1"/>
-      <w:numFmt w:val="lowerRoman"/>
-      <w:lvlText w:val="%6."/>
-      <w:lvlJc w:val="right"/>
-      <w:pPr>
-        <w:ind w:left="4320" w:hanging="180"/>
-      </w:pPr>
-    </w:lvl>
-    <w:lvl w:ilvl="6" w:tplc="0416000F" w:tentative="1">
-      <w:start w:val="1"/>
-      <w:numFmt w:val="decimal"/>
-      <w:lvlText w:val="%7."/>
-      <w:lvlJc w:val="left"/>
-      <w:pPr>
-        <w:ind w:left="5040" w:hanging="360"/>
-      </w:pPr>
-    </w:lvl>
-    <w:lvl w:ilvl="7" w:tplc="04160019" w:tentative="1">
-      <w:start w:val="1"/>
-      <w:numFmt w:val="lowerLetter"/>
-      <w:lvlText w:val="%8."/>
-      <w:lvlJc w:val="left"/>
-      <w:pPr>
-        <w:ind w:left="5760" w:hanging="360"/>
-      </w:pPr>
-    </w:lvl>
-    <w:lvl w:ilvl="8" w:tplc="0416001B" w:tentative="1">
-      <w:start w:val="1"/>
-      <w:numFmt w:val="lowerRoman"/>
-      <w:lvlText w:val="%9."/>
-      <w:lvlJc w:val="right"/>
-      <w:pPr>
-        <w:ind w:left="6480" w:hanging="180"/>
-      </w:pPr>
-    </w:lvl>
-  </w:abstractNum>
-  <w:num w:numId="1" w16cid:durableId="1272126196">
-    <w:abstractNumId w:val="0"/>
-  </w:num>
-</w:numbering>
+      <w:r>
+        <w:continuationSeparator/>
+      </w:r>
+    </w:p>
+  </w:footnote>
+</w:footnotes>
+</file>
+
+<file path=word/header1.xml><?xml version="1.0" encoding="utf-8"?>
+<w:hdr xmlns:wpc="http://schemas.microsoft.com/office/word/2010/wordprocessingCanvas" xmlns:cx="http://schemas.microsoft.com/office/drawing/2014/chartex" xmlns:cx1="http://schemas.microsoft.com/office/drawing/2015/9/8/chartex" xmlns:cx2="http://schemas.microsoft.com/office/drawing/2015/10/21/chartex" xmlns:cx3="http://schemas.microsoft.com/office/drawing/2016/5/9/chartex" xmlns:cx4="http://schemas.microsoft.com/office/drawing/2016/5/10/chartex" xmlns:cx5="http://schemas.microsoft.com/office/drawing/2016/5/11/chartex" xmlns:cx6="http://schemas.microsoft.com/office/drawing/2016/5/12/chartex" xmlns:cx7="http://schemas.microsoft.com/office/drawing/2016/5/13/chartex" xmlns:cx8="http://schemas.microsoft.com/office/drawing/2016/5/14/chartex" xmlns:mc="http://schemas.openxmlformats.org/markup-compatibility/2006" xmlns:aink="http://schemas.microsoft.com/office/drawing/2016/ink" xmlns:am3d="http://schemas.microsoft.com/office/drawing/2017/model3d" xmlns:o="urn:schemas-microsoft-com:office:office" xmlns:oel="http://schemas.microsoft.com/office/2019/extlst" xmlns:r="http://schemas.openxmlformats.org/officeDocument/2006/relationships" xmlns:m="http://schemas.openxmlformats.org/officeDocument/2006/math" xmlns:v="urn:schemas-microsoft-com:vml" xmlns:wp14="http://schemas.microsoft.com/office/word/2010/wordprocessingDrawing" xmlns:wp="http://schemas.openxmlformats.org/drawingml/2006/wordprocessingDrawing" xmlns:w10="urn:schemas-microsoft-com:office:word" xmlns:w="http://schemas.openxmlformats.org/wordprocessingml/2006/main" xmlns:w14="http://schemas.microsoft.com/office/word/2010/wordml" xmlns:w15="http://schemas.microsoft.com/office/word/2012/wordml" xmlns:w16cei="http://schemas.microsoft.com/office/word/2026/wordml/cei" xmlns:w16cex="http://schemas.microsoft.com/office/word/2018/wordml/cex" xmlns:w16cid="http://schemas.microsoft.com/office/word/2016/wordml/cid" xmlns:w16="http://schemas.microsoft.com/office/word/2018/wordml" xmlns:w16du="http://schemas.microsoft.com/office/word/2023/wordml/word16du" xmlns:w16sdtdh="http://schemas.microsoft.com/office/word/2020/wordml/sdtdatahash" xmlns:w16sdtfl="http://schemas.microsoft.com/office/word/2024/wordml/sdtformatlock" xmlns:w16se="http://schemas.microsoft.com/office/word/2015/wordml/symex" xmlns:wpg="http://schemas.microsoft.com/office/word/2010/wordprocessingGroup" xmlns:wpi="http://schemas.microsoft.com/office/word/2010/wordprocessingInk" xmlns:wne="http://schemas.microsoft.com/office/word/2006/wordml" xmlns:wps="http://schemas.microsoft.com/office/word/2010/wordprocessingShape" mc:Ignorable="w14 w15 w16se w16cid w16 w16cex w16sdtdh w16sdtfl w16du wp14">
+  <w:p>
+    <w:pPr>
+      <w:pStyle w:val="Cabealho"/>
+    </w:pPr>
+  </w:p>
+</w:hdr>
+</file>
+
+<file path=word/header2.xml><?xml version="1.0" encoding="utf-8"?>
+<w:hdr xmlns:wpc="http://schemas.microsoft.com/office/word/2010/wordprocessingCanvas" xmlns:cx="http://schemas.microsoft.com/office/drawing/2014/chartex" xmlns:cx1="http://schemas.microsoft.com/office/drawing/2015/9/8/chartex" xmlns:cx2="http://schemas.microsoft.com/office/drawing/2015/10/21/chartex" xmlns:cx3="http://schemas.microsoft.com/office/drawing/2016/5/9/chartex" xmlns:cx4="http://schemas.microsoft.com/office/drawing/2016/5/10/chartex" xmlns:cx5="http://schemas.microsoft.com/office/drawing/2016/5/11/chartex" xmlns:cx6="http://schemas.microsoft.com/office/drawing/2016/5/12/chartex" xmlns:cx7="http://schemas.microsoft.com/office/drawing/2016/5/13/chartex" xmlns:cx8="http://schemas.microsoft.com/office/drawing/2016/5/14/chartex" xmlns:mc="http://schemas.openxmlformats.org/markup-compatibility/2006" xmlns:aink="http://schemas.microsoft.com/office/drawing/2016/ink" xmlns:am3d="http://schemas.microsoft.com/office/drawing/2017/model3d" xmlns:o="urn:schemas-microsoft-com:office:office" xmlns:oel="http://schemas.microsoft.com/office/2019/extlst" xmlns:r="http://schemas.openxmlformats.org/officeDocument/2006/relationships" xmlns:m="http://schemas.openxmlformats.org/officeDocument/2006/math" xmlns:v="urn:schemas-microsoft-com:vml" xmlns:wp14="http://schemas.microsoft.com/office/word/2010/wordprocessingDrawing" xmlns:wp="http://schemas.openxmlformats.org/drawingml/2006/wordprocessingDrawing" xmlns:w10="urn:schemas-microsoft-com:office:word" xmlns:w="http://schemas.openxmlformats.org/wordprocessingml/2006/main" xmlns:w14="http://schemas.microsoft.com/office/word/2010/wordml" xmlns:w15="http://schemas.microsoft.com/office/word/2012/wordml" xmlns:w16cei="http://schemas.microsoft.com/office/word/2026/wordml/cei" xmlns:w16cex="http://schemas.microsoft.com/office/word/2018/wordml/cex" xmlns:w16cid="http://schemas.microsoft.com/office/word/2016/wordml/cid" xmlns:w16="http://schemas.microsoft.com/office/word/2018/wordml" xmlns:w16du="http://schemas.microsoft.com/office/word/2023/wordml/word16du" xmlns:w16sdtdh="http://schemas.microsoft.com/office/word/2020/wordml/sdtdatahash" xmlns:w16sdtfl="http://schemas.microsoft.com/office/word/2024/wordml/sdtformatlock" xmlns:w16se="http://schemas.microsoft.com/office/word/2015/wordml/symex" xmlns:wpg="http://schemas.microsoft.com/office/word/2010/wordprocessingGroup" xmlns:wpi="http://schemas.microsoft.com/office/word/2010/wordprocessingInk" xmlns:wne="http://schemas.microsoft.com/office/word/2006/wordml" xmlns:wps="http://schemas.microsoft.com/office/word/2010/wordprocessingShape" mc:Ignorable="w14 w15 w16se w16cid w16 w16cex w16sdtdh w16sdtfl w16du wp14">
+  <w:p>
+    <w:pPr>
+      <w:pStyle w:val="Cabealho"/>
+      <w:rPr>
+        <w:sz w:val="26"/>
+        <w:szCs w:val="26"/>
+      </w:rPr>
+    </w:pPr>
+    <w:r>
+      <w:rPr>
+        <w:noProof/>
+      </w:rPr>
+      <mc:AlternateContent>
+        <mc:Choice Requires="wps">
+          <w:drawing>
+            <wp:anchor distT="0" distB="0" distL="114300" distR="114300" simplePos="0" relativeHeight="251659264" behindDoc="0" locked="0" layoutInCell="1" allowOverlap="1" wp14:anchorId="20ED1568" wp14:editId="5AFACAD3">
+              <wp:simplePos x="0" y="0"/>
+              <wp:positionH relativeFrom="column">
+                <wp:posOffset>-3562</wp:posOffset>
+              </wp:positionH>
+              <wp:positionV relativeFrom="paragraph">
+                <wp:posOffset>533400</wp:posOffset>
+              </wp:positionV>
+              <wp:extent cx="5578668" cy="0"/>
+              <wp:effectExtent l="19050" t="19050" r="98425" b="114300"/>
+              <wp:wrapNone/>
+              <wp:docPr id="4" name="Conector reto 4"/>
+              <wp:cNvGraphicFramePr/>
+              <a:graphic xmlns:a="http://schemas.openxmlformats.org/drawingml/2006/main">
+                <a:graphicData uri="http://schemas.microsoft.com/office/word/2010/wordprocessingShape">
+                  <wps:wsp>
+                    <wps:cNvCnPr/>
+                    <wps:spPr>
+                      <a:xfrm>
+                        <a:off x="0" y="0"/>
+                        <a:ext cx="5578668" cy="0"/>
+                      </a:xfrm>
+                      <a:prstGeom prst="line">
+                        <a:avLst/>
+                      </a:prstGeom>
+                      <a:effectLst>
+                        <a:outerShdw blurRad="50800" dist="50800" dir="2400000" algn="ctr" rotWithShape="0">
+                          <a:schemeClr val="accent1">
+                            <a:lumMod val="60000"/>
+                            <a:lumOff val="40000"/>
+                          </a:schemeClr>
+                        </a:outerShdw>
+                      </a:effectLst>
+                    </wps:spPr>
+                    <wps:style>
+                      <a:lnRef idx="3">
+                        <a:schemeClr val="accent6"/>
+                      </a:lnRef>
+                      <a:fillRef idx="0">
+                        <a:schemeClr val="accent6"/>
+                      </a:fillRef>
+                      <a:effectRef idx="2">
+                        <a:schemeClr val="accent6"/>
+                      </a:effectRef>
+                      <a:fontRef idx="minor">
+                        <a:schemeClr val="tx1"/>
+                      </a:fontRef>
+                    </wps:style>
+                    <wps:bodyPr/>
+                  </wps:wsp>
+                </a:graphicData>
+              </a:graphic>
+              <wp14:sizeRelH relativeFrom="margin">
+                <wp14:pctWidth>0</wp14:pctWidth>
+              </wp14:sizeRelH>
+            </wp:anchor>
+          </w:drawing>
+        </mc:Choice>
+        <mc:Fallback>
+          <w:pict>
+            <v:line w14:anchorId="5C0491EA" id="Conector reto 4" o:spid="_x0000_s1026" style="position:absolute;z-index:251659264;visibility:visible;mso-wrap-style:square;mso-width-percent:0;mso-wrap-distance-left:9pt;mso-wrap-distance-top:0;mso-wrap-distance-right:9pt;mso-wrap-distance-bottom:0;mso-position-horizontal:absolute;mso-position-horizontal-relative:text;mso-position-vertical:absolute;mso-position-vertical-relative:text;mso-width-percent:0;mso-width-relative:margin" from="-.3pt,42pt" to="438.95pt,42pt" o:gfxdata="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" strokecolor="#70ad47 [3209]" strokeweight="1.5pt">
+              <v:stroke joinstyle="miter"/>
+              <v:shadow on="t" color="#8eaadb [1940]" offset="1.081mm,.90706mm"/>
+            </v:line>
+          </w:pict>
+        </mc:Fallback>
+      </mc:AlternateContent>
+    </w:r>
+    <w:r>
+      <w:rPr>
+        <w:noProof/>
+      </w:rPr>
+      <w:drawing>
+        <wp:inline distT="0" distB="0" distL="0" distR="0" wp14:anchorId="63807A89" wp14:editId="6D2DF0A5">
+          <wp:extent cx="486547" cy="461176"/>
+          <wp:effectExtent l="0" t="0" r="8890" b="0"/>
+          <wp:docPr id="194" name="Imagem 194"/>
+          <wp:cNvGraphicFramePr>
+            <a:graphicFrameLocks xmlns:a="http://schemas.openxmlformats.org/drawingml/2006/main" noChangeAspect="1"/>
+          </wp:cNvGraphicFramePr>
+          <a:graphic xmlns:a="http://schemas.openxmlformats.org/drawingml/2006/main">
+            <a:graphicData uri="http://schemas.openxmlformats.org/drawingml/2006/picture">
+              <pic:pic xmlns:pic="http://schemas.openxmlformats.org/drawingml/2006/picture">
+                <pic:nvPicPr>
+                  <pic:cNvPr id="0" name="Picture 1"/>
+                  <pic:cNvPicPr>
+                    <a:picLocks noChangeAspect="1" noChangeArrowheads="1"/>
+                  </pic:cNvPicPr>
+                </pic:nvPicPr>
+                <pic:blipFill>
+                  <a:blip r:embed="rId1">
+                    <a:extLst>
+                      <a:ext uri="{28A0092B-C50C-407E-A947-70E740481C1C}">
+                        <a14:useLocalDpi xmlns:a14="http://schemas.microsoft.com/office/drawing/2010/main" val="0"/>
+                      </a:ext>
+                    </a:extLst>
+                  </a:blip>
+                  <a:srcRect/>
+                  <a:stretch>
+                    <a:fillRect/>
+                  </a:stretch>
+                </pic:blipFill>
+                <pic:spPr bwMode="auto">
+                  <a:xfrm>
+                    <a:off x="0" y="0"/>
+                    <a:ext cx="511317" cy="484654"/>
+                  </a:xfrm>
+                  <a:prstGeom prst="rect">
+                    <a:avLst/>
+                  </a:prstGeom>
+                  <a:noFill/>
+                  <a:ln>
+                    <a:noFill/>
+                  </a:ln>
+                </pic:spPr>
+              </pic:pic>
+            </a:graphicData>
+          </a:graphic>
+        </wp:inline>
+      </w:drawing>
+    </w:r>
+    <w:r>
+      <w:t xml:space="preserve">   </w:t>
+    </w:r>
+    <w:r>
+      <w:rPr>
+        <w:rFonts w:ascii="Bahnschrift SemiCondensed" w:hAnsi="Bahnschrift SemiCondensed"/>
+        <w:b/>
+        <w:bCs/>
+        <w:color w:val="538135" w:themeColor="accent6" w:themeShade="BF"/>
+        <w:sz w:val="26"/>
+        <w:szCs w:val="26"/>
+      </w:rPr>
+      <w:t>Nagalli Ambiental Ltda.</w:t>
+    </w:r>
+  </w:p>
+</w:hdr>
+</file>
+
+<file path=word/header3.xml><?xml version="1.0" encoding="utf-8"?>
+<w:hdr xmlns:wpc="http://schemas.microsoft.com/office/word/2010/wordprocessingCanvas" xmlns:cx="http://schemas.microsoft.com/office/drawing/2014/chartex" xmlns:cx1="http://schemas.microsoft.com/office/drawing/2015/9/8/chartex" xmlns:cx2="http://schemas.microsoft.com/office/drawing/2015/10/21/chartex" xmlns:cx3="http://schemas.microsoft.com/office/drawing/2016/5/9/chartex" xmlns:cx4="http://schemas.microsoft.com/office/drawing/2016/5/10/chartex" xmlns:cx5="http://schemas.microsoft.com/office/drawing/2016/5/11/chartex" xmlns:cx6="http://schemas.microsoft.com/office/drawing/2016/5/12/chartex" xmlns:cx7="http://schemas.microsoft.com/office/drawing/2016/5/13/chartex" xmlns:cx8="http://schemas.microsoft.com/office/drawing/2016/5/14/chartex" xmlns:mc="http://schemas.openxmlformats.org/markup-compatibility/2006" xmlns:aink="http://schemas.microsoft.com/office/drawing/2016/ink" xmlns:am3d="http://schemas.microsoft.com/office/drawing/2017/model3d" xmlns:o="urn:schemas-microsoft-com:office:office" xmlns:oel="http://schemas.microsoft.com/office/2019/extlst" xmlns:r="http://schemas.openxmlformats.org/officeDocument/2006/relationships" xmlns:m="http://schemas.openxmlformats.org/officeDocument/2006/math" xmlns:v="urn:schemas-microsoft-com:vml" xmlns:wp14="http://schemas.microsoft.com/office/word/2010/wordprocessingDrawing" xmlns:wp="http://schemas.openxmlformats.org/drawingml/2006/wordprocessingDrawing" xmlns:w10="urn:schemas-microsoft-com:office:word" xmlns:w="http://schemas.openxmlformats.org/wordprocessingml/2006/main" xmlns:w14="http://schemas.microsoft.com/office/word/2010/wordml" xmlns:w15="http://schemas.microsoft.com/office/word/2012/wordml" xmlns:w16cei="http://schemas.microsoft.com/office/word/2026/wordml/cei" xmlns:w16cex="http://schemas.microsoft.com/office/word/2018/wordml/cex" xmlns:w16cid="http://schemas.microsoft.com/office/word/2016/wordml/cid" xmlns:w16="http://schemas.microsoft.com/office/word/2018/wordml" xmlns:w16du="http://schemas.microsoft.com/office/word/2023/wordml/word16du" xmlns:w16sdtdh="http://schemas.microsoft.com/office/word/2020/wordml/sdtdatahash" xmlns:w16sdtfl="http://schemas.microsoft.com/office/word/2024/wordml/sdtformatlock" xmlns:w16se="http://schemas.microsoft.com/office/word/2015/wordml/symex" xmlns:wpg="http://schemas.microsoft.com/office/word/2010/wordprocessingGroup" xmlns:wpi="http://schemas.microsoft.com/office/word/2010/wordprocessingInk" xmlns:wne="http://schemas.microsoft.com/office/word/2006/wordml" xmlns:wps="http://schemas.microsoft.com/office/word/2010/wordprocessingShape" mc:Ignorable="w14 w15 w16se w16cid w16 w16cex w16sdtdh w16sdtfl w16du wp14">
+  <w:p>
+    <w:pPr>
+      <w:pStyle w:val="Cabealho"/>
+    </w:pPr>
+  </w:p>
+</w:hdr>
 </file>
 
 <file path=word/styles.xml><?xml version="1.0" encoding="utf-8"?>
@@ -799,11 +1013,11 @@
   <w:style w:type="paragraph" w:default="1" w:styleId="Normal">
     <w:name w:val="Normal"/>
     <w:qFormat/>
+    <w:rsid w:val="004408EB"/>
   </w:style>
   <w:style w:type="character" w:default="1" w:styleId="Fontepargpadro">
     <w:name w:val="Default Paragraph Font"/>
     <w:uiPriority w:val="1"/>
-    <w:semiHidden/>
     <w:unhideWhenUsed/>
   </w:style>
   <w:style w:type="table" w:default="1" w:styleId="Tabelanormal">
@@ -827,130 +1041,49 @@
     <w:semiHidden/>
     <w:unhideWhenUsed/>
   </w:style>
-  <w:style w:type="table" w:styleId="Tabelacomgrade">
-    <w:name w:val="Table Grid"/>
-    <w:basedOn w:val="Tabelanormal"/>
-    <w:uiPriority w:val="39"/>
-    <w:rsid w:val="005E2CA3"/>
+  <w:style w:type="paragraph" w:styleId="Cabealho">
+    <w:name w:val="header"/>
+    <w:basedOn w:val="Normal"/>
+    <w:link w:val="CabealhoChar"/>
+    <w:uiPriority w:val="99"/>
+    <w:unhideWhenUsed/>
+    <w:rsid w:val="00114699"/>
     <w:pPr>
+      <w:tabs>
+        <w:tab w:val="center" w:pos="4252"/>
+        <w:tab w:val="right" w:pos="8504"/>
+      </w:tabs>
       <w:spacing w:after="0" w:line="240" w:lineRule="auto"/>
     </w:pPr>
-    <w:tblPr>
-      <w:tblBorders>
-        <w:top w:val="single" w:sz="4" w:space="0" w:color="auto"/>
-        <w:left w:val="single" w:sz="4" w:space="0" w:color="auto"/>
-        <w:bottom w:val="single" w:sz="4" w:space="0" w:color="auto"/>
-        <w:right w:val="single" w:sz="4" w:space="0" w:color="auto"/>
-        <w:insideH w:val="single" w:sz="4" w:space="0" w:color="auto"/>
-        <w:insideV w:val="single" w:sz="4" w:space="0" w:color="auto"/>
-      </w:tblBorders>
-    </w:tblPr>
   </w:style>
-  <w:style w:type="paragraph" w:customStyle="1" w:styleId="Corpo">
-    <w:name w:val="Corpo"/>
-    <w:rsid w:val="00845A35"/>
+  <w:style w:type="character" w:customStyle="1" w:styleId="CabealhoChar">
+    <w:name w:val="Cabeçalho Char"/>
+    <w:basedOn w:val="Fontepargpadro"/>
+    <w:link w:val="Cabealho"/>
+    <w:uiPriority w:val="99"/>
+    <w:rsid w:val="00114699"/>
+  </w:style>
+  <w:style w:type="paragraph" w:styleId="Rodap">
+    <w:name w:val="footer"/>
+    <w:basedOn w:val="Normal"/>
+    <w:link w:val="RodapChar"/>
+    <w:uiPriority w:val="99"/>
+    <w:unhideWhenUsed/>
+    <w:rsid w:val="00114699"/>
     <w:pPr>
       <w:tabs>
-        <w:tab w:val="left" w:pos="720"/>
-        <w:tab w:val="left" w:pos="1440"/>
-        <w:tab w:val="left" w:pos="2160"/>
-        <w:tab w:val="left" w:pos="2880"/>
-        <w:tab w:val="left" w:pos="3600"/>
-        <w:tab w:val="left" w:pos="4320"/>
-        <w:tab w:val="left" w:pos="5040"/>
-        <w:tab w:val="left" w:pos="5760"/>
-        <w:tab w:val="left" w:pos="6480"/>
-        <w:tab w:val="left" w:pos="7200"/>
-        <w:tab w:val="left" w:pos="7920"/>
-        <w:tab w:val="left" w:pos="8640"/>
+        <w:tab w:val="center" w:pos="4252"/>
+        <w:tab w:val="right" w:pos="8504"/>
       </w:tabs>
       <w:spacing w:after="0" w:line="240" w:lineRule="auto"/>
-      <w:jc w:val="both"/>
-    </w:pPr>
-    <w:rPr>
-      <w:rFonts w:ascii="Times New Roman" w:eastAsia="Times New Roman" w:hAnsi="Times New Roman" w:cs="Times New Roman"/>
-      <w:color w:val="000000"/>
-      <w:sz w:val="28"/>
-      <w:szCs w:val="20"/>
-      <w:lang w:eastAsia="pt-BR"/>
-    </w:rPr>
-  </w:style>
-  <w:style w:type="paragraph" w:styleId="PargrafodaLista">
-    <w:name w:val="List Paragraph"/>
-    <w:basedOn w:val="Normal"/>
-    <w:uiPriority w:val="34"/>
-    <w:qFormat/>
-    <w:rsid w:val="00F9316D"/>
-    <w:pPr>
-      <w:ind w:left="720"/>
-      <w:contextualSpacing/>
     </w:pPr>
   </w:style>
-  <w:style w:type="character" w:styleId="Refdecomentrio">
-    <w:name w:val="annotation reference"/>
+  <w:style w:type="character" w:customStyle="1" w:styleId="RodapChar">
+    <w:name w:val="Rodapé Char"/>
     <w:basedOn w:val="Fontepargpadro"/>
+    <w:link w:val="Rodap"/>
     <w:uiPriority w:val="99"/>
-    <w:semiHidden/>
-    <w:unhideWhenUsed/>
-    <w:rsid w:val="00432B35"/>
-    <w:rPr>
-      <w:sz w:val="16"/>
-      <w:szCs w:val="16"/>
-    </w:rPr>
-  </w:style>
-  <w:style w:type="paragraph" w:styleId="Textodecomentrio">
-    <w:name w:val="annotation text"/>
-    <w:basedOn w:val="Normal"/>
-    <w:link w:val="TextodecomentrioChar"/>
-    <w:uiPriority w:val="99"/>
-    <w:unhideWhenUsed/>
-    <w:rsid w:val="00432B35"/>
-    <w:pPr>
-      <w:spacing w:line="240" w:lineRule="auto"/>
-    </w:pPr>
-    <w:rPr>
-      <w:sz w:val="20"/>
-      <w:szCs w:val="20"/>
-    </w:rPr>
-  </w:style>
-  <w:style w:type="character" w:customStyle="1" w:styleId="TextodecomentrioChar">
-    <w:name w:val="Texto de comentário Char"/>
-    <w:basedOn w:val="Fontepargpadro"/>
-    <w:link w:val="Textodecomentrio"/>
-    <w:uiPriority w:val="99"/>
-    <w:rsid w:val="00432B35"/>
-    <w:rPr>
-      <w:sz w:val="20"/>
-      <w:szCs w:val="20"/>
-    </w:rPr>
-  </w:style>
-  <w:style w:type="paragraph" w:styleId="Assuntodocomentrio">
-    <w:name w:val="annotation subject"/>
-    <w:basedOn w:val="Textodecomentrio"/>
-    <w:next w:val="Textodecomentrio"/>
-    <w:link w:val="AssuntodocomentrioChar"/>
-    <w:uiPriority w:val="99"/>
-    <w:semiHidden/>
-    <w:unhideWhenUsed/>
-    <w:rsid w:val="00432B35"/>
-    <w:rPr>
-      <w:b/>
-      <w:bCs/>
-    </w:rPr>
-  </w:style>
-  <w:style w:type="character" w:customStyle="1" w:styleId="AssuntodocomentrioChar">
-    <w:name w:val="Assunto do comentário Char"/>
-    <w:basedOn w:val="TextodecomentrioChar"/>
-    <w:link w:val="Assuntodocomentrio"/>
-    <w:uiPriority w:val="99"/>
-    <w:semiHidden/>
-    <w:rsid w:val="00432B35"/>
-    <w:rPr>
-      <w:b/>
-      <w:bCs/>
-      <w:sz w:val="20"/>
-      <w:szCs w:val="20"/>
-    </w:rPr>
+    <w:rsid w:val="00114699"/>
   </w:style>
 </w:styles>
 </file>
@@ -1248,4 +1381,16 @@
     </a:ext>
   </a:extLst>
 </a:theme>
+</file>
+
+<file path=customXml/item1.xml><?xml version="1.0" encoding="utf-8"?>
+<b:Sources xmlns:b="http://schemas.openxmlformats.org/officeDocument/2006/bibliography" xmlns="http://schemas.openxmlformats.org/officeDocument/2006/bibliography" SelectedStyle="\APASixthEditionOfficeOnline.xsl" StyleName="APA" Version="6"/>
+</file>
+
+<file path=customXml/itemProps1.xml><?xml version="1.0" encoding="utf-8"?>
+<ds:datastoreItem xmlns:ds="http://schemas.openxmlformats.org/officeDocument/2006/customXml" ds:itemID="{A7DD5006-7470-48BE-9D47-026026213AC3}">
+  <ds:schemaRefs>
+    <ds:schemaRef ds:uri="http://schemas.openxmlformats.org/officeDocument/2006/bibliography"/>
+  </ds:schemaRefs>
+</ds:datastoreItem>
 </file>
</xml_diff>

<commit_message>
fix: tabela condicionantes com loop correto - cada condicionante em linha separada, coluna 2 com texto fixo
</commit_message>
<xml_diff>
--- a/src/lib/templates/relatorio-condicionantes/template.docx
+++ b/src/lib/templates/relatorio-condicionantes/template.docx
@@ -132,7 +132,6 @@
                 <w:rFonts w:ascii="Ebrima" w:hAnsi="Ebrima"/>
                 <w:sz w:val="20"/>
                 <w:szCs w:val="20"/>
-                <w:noProof/>
               </w:rPr>
               <w:t xml:space="preserve">{#condicionantes}</w:t>
             </w:r>
@@ -141,18 +140,8 @@
                 <w:rFonts w:ascii="Ebrima" w:hAnsi="Ebrima"/>
                 <w:sz w:val="20"/>
                 <w:szCs w:val="20"/>
-                <w:noProof/>
               </w:rPr>
               <w:t xml:space="preserve">{descricao}</w:t>
-            </w:r>
-            <w:r>
-              <w:rPr>
-                <w:rFonts w:ascii="Ebrima" w:hAnsi="Ebrima"/>
-                <w:sz w:val="20"/>
-                <w:szCs w:val="20"/>
-                <w:noProof/>
-              </w:rPr>
-              <w:t xml:space="preserve">{/condicionantes}</w:t>
             </w:r>
           </w:p>
         </w:tc>
@@ -169,15 +158,6 @@
                 <w:rFonts w:ascii="Ebrima" w:hAnsi="Ebrima"/>
                 <w:sz w:val="20"/>
                 <w:szCs w:val="20"/>
-                <w:noProof/>
-              </w:rPr>
-              <w:t xml:space="preserve">{#condicionantes}</w:t>
-            </w:r>
-            <w:r>
-              <w:rPr>
-                <w:rFonts w:ascii="Ebrima" w:hAnsi="Ebrima"/>
-                <w:sz w:val="20"/>
-                <w:szCs w:val="20"/>
               </w:rPr>
               <w:t xml:space="preserve">Item dispositivo/orientativo. Requisito atendido.</w:t>
             </w:r>
@@ -186,7 +166,6 @@
                 <w:rFonts w:ascii="Ebrima" w:hAnsi="Ebrima"/>
                 <w:sz w:val="20"/>
                 <w:szCs w:val="20"/>
-                <w:noProof/>
               </w:rPr>
               <w:t xml:space="preserve">{/condicionantes}</w:t>
             </w:r>

</xml_diff>

<commit_message>
fix: tabela condicionantes - coluna Requisito 75%, Atendimento 25%
</commit_message>
<xml_diff>
--- a/src/lib/templates/relatorio-condicionantes/template.docx
+++ b/src/lib/templates/relatorio-condicionantes/template.docx
@@ -73,13 +73,13 @@
         <w:tblLook w:val="04A0" w:firstRow="1" w:lastRow="0" w:firstColumn="1" w:lastColumn="0" w:noHBand="0" w:noVBand="1"/>
       </w:tblPr>
       <w:tblGrid>
-        <w:gridCol w:w="5665"/>
-        <w:gridCol w:w="3118"/>
+        <w:gridCol w:w="6587"/>
+        <w:gridCol w:w="2196"/>
       </w:tblGrid>
       <w:tr>
         <w:tc>
           <w:tcPr>
-            <w:tcW w:w="5665" w:type="dxa"/>
+            <w:tcW w:w="6587" w:type="dxa"/>
           </w:tcPr>
           <w:p>
             <w:pPr>
@@ -99,7 +99,7 @@
         </w:tc>
         <w:tc>
           <w:tcPr>
-            <w:tcW w:w="3118" w:type="dxa"/>
+            <w:tcW w:w="2196" w:type="dxa"/>
           </w:tcPr>
           <w:p>
             <w:pPr>
@@ -121,7 +121,7 @@
       <w:tr>
         <w:tc>
           <w:tcPr>
-            <w:tcW w:w="5665" w:type="dxa"/>
+            <w:tcW w:w="6587" w:type="dxa"/>
           </w:tcPr>
           <w:p>
             <w:pPr>
@@ -147,7 +147,7 @@
         </w:tc>
         <w:tc>
           <w:tcPr>
-            <w:tcW w:w="3118" w:type="dxa"/>
+            <w:tcW w:w="2196" w:type="dxa"/>
           </w:tcPr>
           <w:p>
             <w:pPr>

</xml_diff>

<commit_message>
fix: bordas pretas na tabela condicionantes (tblBorders + tcBorders)
</commit_message>
<xml_diff>
--- a/src/lib/templates/relatorio-condicionantes/template.docx
+++ b/src/lib/templates/relatorio-condicionantes/template.docx
@@ -68,8 +68,15 @@
     </w:p>
     <w:tbl>
       <w:tblPr>
-        <w:tblStyle w:val="Tabelacomgrade"/>
         <w:tblW w:w="8783" w:type="dxa"/>
+        <w:tblBorders>
+          <w:top w:val="single" w:sz="4" w:space="0" w:color="000000"/>
+          <w:left w:val="single" w:sz="4" w:space="0" w:color="000000"/>
+          <w:bottom w:val="single" w:sz="4" w:space="0" w:color="000000"/>
+          <w:right w:val="single" w:sz="4" w:space="0" w:color="000000"/>
+          <w:insideH w:val="single" w:sz="4" w:space="0" w:color="000000"/>
+          <w:insideV w:val="single" w:sz="4" w:space="0" w:color="000000"/>
+        </w:tblBorders>
         <w:tblLook w:val="04A0" w:firstRow="1" w:lastRow="0" w:firstColumn="1" w:lastColumn="0" w:noHBand="0" w:noVBand="1"/>
       </w:tblPr>
       <w:tblGrid>
@@ -80,6 +87,12 @@
         <w:tc>
           <w:tcPr>
             <w:tcW w:w="6587" w:type="dxa"/>
+            <w:tcBorders>
+              <w:top w:val="single" w:sz="4" w:space="0" w:color="000000"/>
+              <w:left w:val="single" w:sz="4" w:space="0" w:color="000000"/>
+              <w:bottom w:val="single" w:sz="4" w:space="0" w:color="000000"/>
+              <w:right w:val="single" w:sz="4" w:space="0" w:color="000000"/>
+            </w:tcBorders>
           </w:tcPr>
           <w:p>
             <w:pPr>
@@ -100,6 +113,12 @@
         <w:tc>
           <w:tcPr>
             <w:tcW w:w="2196" w:type="dxa"/>
+            <w:tcBorders>
+              <w:top w:val="single" w:sz="4" w:space="0" w:color="000000"/>
+              <w:left w:val="single" w:sz="4" w:space="0" w:color="000000"/>
+              <w:bottom w:val="single" w:sz="4" w:space="0" w:color="000000"/>
+              <w:right w:val="single" w:sz="4" w:space="0" w:color="000000"/>
+            </w:tcBorders>
           </w:tcPr>
           <w:p>
             <w:pPr>
@@ -122,6 +141,12 @@
         <w:tc>
           <w:tcPr>
             <w:tcW w:w="6587" w:type="dxa"/>
+            <w:tcBorders>
+              <w:top w:val="single" w:sz="4" w:space="0" w:color="000000"/>
+              <w:left w:val="single" w:sz="4" w:space="0" w:color="000000"/>
+              <w:bottom w:val="single" w:sz="4" w:space="0" w:color="000000"/>
+              <w:right w:val="single" w:sz="4" w:space="0" w:color="000000"/>
+            </w:tcBorders>
           </w:tcPr>
           <w:p>
             <w:pPr>
@@ -148,6 +173,12 @@
         <w:tc>
           <w:tcPr>
             <w:tcW w:w="2196" w:type="dxa"/>
+            <w:tcBorders>
+              <w:top w:val="single" w:sz="4" w:space="0" w:color="000000"/>
+              <w:left w:val="single" w:sz="4" w:space="0" w:color="000000"/>
+              <w:bottom w:val="single" w:sz="4" w:space="0" w:color="000000"/>
+              <w:right w:val="single" w:sz="4" w:space="0" w:color="000000"/>
+            </w:tcBorders>
           </w:tcPr>
           <w:p>
             <w:pPr>

</xml_diff>

<commit_message>
fix: update condicionantes report footer to match timbrado
</commit_message>
<xml_diff>
--- a/src/lib/templates/relatorio-condicionantes/template.docx
+++ b/src/lib/templates/relatorio-condicionantes/template.docx
@@ -1,5 +1,67 @@
 
-<file path=word/document.xml><?xml version="1.0" encoding="utf-8"?>
+<file path=customXml\item1.xml><?xml version="1.0" encoding="utf-8"?>
+<b:Sources xmlns:b="http://schemas.openxmlformats.org/officeDocument/2006/bibliography" xmlns="http://schemas.openxmlformats.org/officeDocument/2006/bibliography" SelectedStyle="\APASixthEditionOfficeOnline.xsl" StyleName="APA" Version="6"/>
+</file>
+
+<file path=customXml\itemProps1.xml><?xml version="1.0" encoding="utf-8"?>
+<ds:datastoreItem xmlns:ds="http://schemas.openxmlformats.org/officeDocument/2006/customXml" ds:itemID="{A7DD5006-7470-48BE-9D47-026026213AC3}">
+  <ds:schemaRefs>
+    <ds:schemaRef ds:uri="http://schemas.openxmlformats.org/officeDocument/2006/bibliography"/>
+  </ds:schemaRefs>
+</ds:datastoreItem>
+</file>
+
+<file path=docProps\app.xml><?xml version="1.0" encoding="utf-8"?>
+<Properties xmlns="http://schemas.openxmlformats.org/officeDocument/2006/extended-properties" xmlns:vt="http://schemas.openxmlformats.org/officeDocument/2006/docPropsVTypes">
+  <Template>Normal</Template>
+  <TotalTime>26</TotalTime>
+  <Pages>1</Pages>
+  <Words>0</Words>
+  <Characters>0</Characters>
+  <Application>Microsoft Office Word</Application>
+  <DocSecurity>0</DocSecurity>
+  <Lines>0</Lines>
+  <Paragraphs>0</Paragraphs>
+  <ScaleCrop>false</ScaleCrop>
+  <HeadingPairs>
+    <vt:vector size="2" baseType="variant">
+      <vt:variant>
+        <vt:lpstr>Título</vt:lpstr>
+      </vt:variant>
+      <vt:variant>
+        <vt:i4>1</vt:i4>
+      </vt:variant>
+    </vt:vector>
+  </HeadingPairs>
+  <TitlesOfParts>
+    <vt:vector size="1" baseType="lpstr">
+      <vt:lpstr/>
+    </vt:vector>
+  </TitlesOfParts>
+  <Company/>
+  <LinksUpToDate>false</LinksUpToDate>
+  <CharactersWithSpaces>0</CharactersWithSpaces>
+  <SharedDoc>false</SharedDoc>
+  <HyperlinksChanged>false</HyperlinksChanged>
+  <AppVersion>16.0000</AppVersion>
+</Properties>
+</file>
+
+<file path=docProps\core.xml><?xml version="1.0" encoding="utf-8"?>
+<cp:coreProperties xmlns:cp="http://schemas.openxmlformats.org/package/2006/metadata/core-properties" xmlns:dc="http://purl.org/dc/elements/1.1/" xmlns:dcterms="http://purl.org/dc/terms/" xmlns:dcmitype="http://purl.org/dc/dcmitype/" xmlns:xsi="http://www.w3.org/2001/XMLSchema-instance">
+  <dc:title/>
+  <dc:subject/>
+  <dc:creator>André Nagalli</dc:creator>
+  <cp:keywords/>
+  <dc:description/>
+  <cp:lastModifiedBy>André Nagalli</cp:lastModifiedBy>
+  <cp:revision>7</cp:revision>
+  <dcterms:created xsi:type="dcterms:W3CDTF">2020-09-07T14:36:00Z</dcterms:created>
+  <dcterms:modified xsi:type="dcterms:W3CDTF">2026-08-04T14:17:00Z</dcterms:modified>
+</cp:coreProperties>
+</file>
+
+<file path=word\document.xml><?xml version="1.0" encoding="utf-8"?>
 <w:document xmlns:wpc="http://schemas.microsoft.com/office/word/2010/wordprocessingCanvas" xmlns:cx="http://schemas.microsoft.com/office/drawing/2014/chartex" xmlns:cx1="http://schemas.microsoft.com/office/drawing/2015/9/8/chartex" xmlns:cx2="http://schemas.microsoft.com/office/drawing/2015/10/21/chartex" xmlns:cx3="http://schemas.microsoft.com/office/drawing/2016/5/9/chartex" xmlns:cx4="http://schemas.microsoft.com/office/drawing/2016/5/10/chartex" xmlns:cx5="http://schemas.microsoft.com/office/drawing/2016/5/11/chartex" xmlns:cx6="http://schemas.microsoft.com/office/drawing/2016/5/12/chartex" xmlns:cx7="http://schemas.microsoft.com/office/drawing/2016/5/13/chartex" xmlns:cx8="http://schemas.microsoft.com/office/drawing/2016/5/14/chartex" xmlns:mc="http://schemas.openxmlformats.org/markup-compatibility/2006" xmlns:aink="http://schemas.microsoft.com/office/drawing/2016/ink" xmlns:am3d="http://schemas.microsoft.com/office/drawing/2017/model3d" xmlns:o="urn:schemas-microsoft-com:office:office" xmlns:oel="http://schemas.microsoft.com/office/2019/extlst" xmlns:r="http://schemas.openxmlformats.org/officeDocument/2006/relationships" xmlns:m="http://schemas.openxmlformats.org/officeDocument/2006/math" xmlns:v="urn:schemas-microsoft-com:vml" xmlns:wp14="http://schemas.microsoft.com/office/word/2010/wordprocessingDrawing" xmlns:wp="http://schemas.openxmlformats.org/drawingml/2006/wordprocessingDrawing" xmlns:w10="urn:schemas-microsoft-com:office:word" xmlns:w="http://schemas.openxmlformats.org/wordprocessingml/2006/main" xmlns:w14="http://schemas.microsoft.com/office/word/2010/wordml" xmlns:w15="http://schemas.microsoft.com/office/word/2012/wordml" xmlns:w16cei="http://schemas.microsoft.com/office/word/2026/wordml/cei" xmlns:w16cex="http://schemas.microsoft.com/office/word/2018/wordml/cex" xmlns:w16cid="http://schemas.microsoft.com/office/word/2016/wordml/cid" xmlns:w16="http://schemas.microsoft.com/office/word/2018/wordml" xmlns:w16du="http://schemas.microsoft.com/office/word/2023/wordml/word16du" xmlns:w16sdtdh="http://schemas.microsoft.com/office/word/2020/wordml/sdtdatahash" xmlns:w16sdtfl="http://schemas.microsoft.com/office/word/2024/wordml/sdtformatlock" xmlns:w16se="http://schemas.microsoft.com/office/word/2015/wordml/symex" xmlns:wpg="http://schemas.microsoft.com/office/word/2010/wordprocessingGroup" xmlns:wpi="http://schemas.microsoft.com/office/word/2010/wordprocessingInk" xmlns:wne="http://schemas.microsoft.com/office/word/2006/wordml" xmlns:wps="http://schemas.microsoft.com/office/word/2010/wordprocessingShape" mc:Ignorable="w14 w15 w16se w16cid w16 w16cex w16sdtdh w16sdtfl w16du wp14">
   <w:body>
     <w:p>
@@ -261,7 +323,7 @@
 </w:document>
 </file>
 
-<file path=word/endnotes.xml><?xml version="1.0" encoding="utf-8"?>
+<file path=word\endnotes.xml><?xml version="1.0" encoding="utf-8"?>
 <w:endnotes xmlns:wpc="http://schemas.microsoft.com/office/word/2010/wordprocessingCanvas" xmlns:cx="http://schemas.microsoft.com/office/drawing/2014/chartex" xmlns:cx1="http://schemas.microsoft.com/office/drawing/2015/9/8/chartex" xmlns:cx2="http://schemas.microsoft.com/office/drawing/2015/10/21/chartex" xmlns:cx3="http://schemas.microsoft.com/office/drawing/2016/5/9/chartex" xmlns:cx4="http://schemas.microsoft.com/office/drawing/2016/5/10/chartex" xmlns:cx5="http://schemas.microsoft.com/office/drawing/2016/5/11/chartex" xmlns:cx6="http://schemas.microsoft.com/office/drawing/2016/5/12/chartex" xmlns:cx7="http://schemas.microsoft.com/office/drawing/2016/5/13/chartex" xmlns:cx8="http://schemas.microsoft.com/office/drawing/2016/5/14/chartex" xmlns:mc="http://schemas.openxmlformats.org/markup-compatibility/2006" xmlns:aink="http://schemas.microsoft.com/office/drawing/2016/ink" xmlns:am3d="http://schemas.microsoft.com/office/drawing/2017/model3d" xmlns:o="urn:schemas-microsoft-com:office:office" xmlns:oel="http://schemas.microsoft.com/office/2019/extlst" xmlns:r="http://schemas.openxmlformats.org/officeDocument/2006/relationships" xmlns:m="http://schemas.openxmlformats.org/officeDocument/2006/math" xmlns:v="urn:schemas-microsoft-com:vml" xmlns:wp14="http://schemas.microsoft.com/office/word/2010/wordprocessingDrawing" xmlns:wp="http://schemas.openxmlformats.org/drawingml/2006/wordprocessingDrawing" xmlns:w10="urn:schemas-microsoft-com:office:word" xmlns:w="http://schemas.openxmlformats.org/wordprocessingml/2006/main" xmlns:w14="http://schemas.microsoft.com/office/word/2010/wordml" xmlns:w15="http://schemas.microsoft.com/office/word/2012/wordml" xmlns:w16cei="http://schemas.microsoft.com/office/word/2026/wordml/cei" xmlns:w16cex="http://schemas.microsoft.com/office/word/2018/wordml/cex" xmlns:w16cid="http://schemas.microsoft.com/office/word/2016/wordml/cid" xmlns:w16="http://schemas.microsoft.com/office/word/2018/wordml" xmlns:w16du="http://schemas.microsoft.com/office/word/2023/wordml/word16du" xmlns:w16sdtdh="http://schemas.microsoft.com/office/word/2020/wordml/sdtdatahash" xmlns:w16sdtfl="http://schemas.microsoft.com/office/word/2024/wordml/sdtformatlock" xmlns:w16se="http://schemas.microsoft.com/office/word/2015/wordml/symex" xmlns:wpg="http://schemas.microsoft.com/office/word/2010/wordprocessingGroup" xmlns:wpi="http://schemas.microsoft.com/office/word/2010/wordprocessingInk" xmlns:wne="http://schemas.microsoft.com/office/word/2006/wordml" xmlns:wps="http://schemas.microsoft.com/office/word/2010/wordprocessingShape" mc:Ignorable="w14 w15 w16se w16cid w16 w16cex w16sdtdh w16sdtfl w16du wp14">
   <w:endnote w:type="separator" w:id="-1">
     <w:p>
@@ -286,7 +348,40 @@
 </w:endnotes>
 </file>
 
-<file path=word/footer1.xml><?xml version="1.0" encoding="utf-8"?>
+<file path=word\fontTable.xml><?xml version="1.0" encoding="utf-8"?>
+<w:fonts xmlns:mc="http://schemas.openxmlformats.org/markup-compatibility/2006" xmlns:r="http://schemas.openxmlformats.org/officeDocument/2006/relationships" xmlns:w="http://schemas.openxmlformats.org/wordprocessingml/2006/main" xmlns:w14="http://schemas.microsoft.com/office/word/2010/wordml" xmlns:w15="http://schemas.microsoft.com/office/word/2012/wordml" xmlns:w16cex="http://schemas.microsoft.com/office/word/2018/wordml/cex" xmlns:w16cid="http://schemas.microsoft.com/office/word/2016/wordml/cid" xmlns:w16="http://schemas.microsoft.com/office/word/2018/wordml" xmlns:w16du="http://schemas.microsoft.com/office/word/2023/wordml/word16du" xmlns:w16sdtdh="http://schemas.microsoft.com/office/word/2020/wordml/sdtdatahash" xmlns:w16sdtfl="http://schemas.microsoft.com/office/word/2024/wordml/sdtformatlock" xmlns:w16se="http://schemas.microsoft.com/office/word/2015/wordml/symex" mc:Ignorable="w14 w15 w16se w16cid w16 w16cex w16sdtdh w16sdtfl w16du">
+  <w:font w:name="Calibri">
+    <w:panose1 w:val="020F0502020204030204"/>
+    <w:charset w:val="00"/>
+    <w:family w:val="swiss"/>
+    <w:pitch w:val="variable"/>
+    <w:sig w:usb0="E4002EFF" w:usb1="C200247B" w:usb2="00000009" w:usb3="00000000" w:csb0="000001FF" w:csb1="00000000"/>
+  </w:font>
+  <w:font w:name="Times New Roman">
+    <w:panose1 w:val="02020603050405020304"/>
+    <w:charset w:val="00"/>
+    <w:family w:val="roman"/>
+    <w:pitch w:val="variable"/>
+    <w:sig w:usb0="E0002EFF" w:usb1="C000785B" w:usb2="00000009" w:usb3="00000000" w:csb0="000001FF" w:csb1="00000000"/>
+  </w:font>
+  <w:font w:name="Bahnschrift SemiCondensed">
+    <w:panose1 w:val="020B0502040204020203"/>
+    <w:charset w:val="00"/>
+    <w:family w:val="swiss"/>
+    <w:pitch w:val="variable"/>
+    <w:sig w:usb0="A00002C7" w:usb1="00000002" w:usb2="00000000" w:usb3="00000000" w:csb0="0000019F" w:csb1="00000000"/>
+  </w:font>
+  <w:font w:name="Calibri Light">
+    <w:panose1 w:val="020F0302020204030204"/>
+    <w:charset w:val="00"/>
+    <w:family w:val="swiss"/>
+    <w:pitch w:val="variable"/>
+    <w:sig w:usb0="E4002EFF" w:usb1="C200247B" w:usb2="00000009" w:usb3="00000000" w:csb0="000001FF" w:csb1="00000000"/>
+  </w:font>
+</w:fonts>
+</file>
+
+<file path=word\footer1.xml><?xml version="1.0" encoding="utf-8"?>
 <w:ftr xmlns:wpc="http://schemas.microsoft.com/office/word/2010/wordprocessingCanvas" xmlns:cx="http://schemas.microsoft.com/office/drawing/2014/chartex" xmlns:cx1="http://schemas.microsoft.com/office/drawing/2015/9/8/chartex" xmlns:cx2="http://schemas.microsoft.com/office/drawing/2015/10/21/chartex" xmlns:cx3="http://schemas.microsoft.com/office/drawing/2016/5/9/chartex" xmlns:cx4="http://schemas.microsoft.com/office/drawing/2016/5/10/chartex" xmlns:cx5="http://schemas.microsoft.com/office/drawing/2016/5/11/chartex" xmlns:cx6="http://schemas.microsoft.com/office/drawing/2016/5/12/chartex" xmlns:cx7="http://schemas.microsoft.com/office/drawing/2016/5/13/chartex" xmlns:cx8="http://schemas.microsoft.com/office/drawing/2016/5/14/chartex" xmlns:mc="http://schemas.openxmlformats.org/markup-compatibility/2006" xmlns:aink="http://schemas.microsoft.com/office/drawing/2016/ink" xmlns:am3d="http://schemas.microsoft.com/office/drawing/2017/model3d" xmlns:o="urn:schemas-microsoft-com:office:office" xmlns:oel="http://schemas.microsoft.com/office/2019/extlst" xmlns:r="http://schemas.openxmlformats.org/officeDocument/2006/relationships" xmlns:m="http://schemas.openxmlformats.org/officeDocument/2006/math" xmlns:v="urn:schemas-microsoft-com:vml" xmlns:wp14="http://schemas.microsoft.com/office/word/2010/wordprocessingDrawing" xmlns:wp="http://schemas.openxmlformats.org/drawingml/2006/wordprocessingDrawing" xmlns:w10="urn:schemas-microsoft-com:office:word" xmlns:w="http://schemas.openxmlformats.org/wordprocessingml/2006/main" xmlns:w14="http://schemas.microsoft.com/office/word/2010/wordml" xmlns:w15="http://schemas.microsoft.com/office/word/2012/wordml" xmlns:w16cei="http://schemas.microsoft.com/office/word/2026/wordml/cei" xmlns:w16cex="http://schemas.microsoft.com/office/word/2018/wordml/cex" xmlns:w16cid="http://schemas.microsoft.com/office/word/2016/wordml/cid" xmlns:w16="http://schemas.microsoft.com/office/word/2018/wordml" xmlns:w16du="http://schemas.microsoft.com/office/word/2023/wordml/word16du" xmlns:w16sdtdh="http://schemas.microsoft.com/office/word/2020/wordml/sdtdatahash" xmlns:w16sdtfl="http://schemas.microsoft.com/office/word/2024/wordml/sdtformatlock" xmlns:w16se="http://schemas.microsoft.com/office/word/2015/wordml/symex" xmlns:wpg="http://schemas.microsoft.com/office/word/2010/wordprocessingGroup" xmlns:wpi="http://schemas.microsoft.com/office/word/2010/wordprocessingInk" xmlns:wne="http://schemas.microsoft.com/office/word/2006/wordml" xmlns:wps="http://schemas.microsoft.com/office/word/2010/wordprocessingShape" mc:Ignorable="w14 w15 w16se w16cid w16 w16cex w16sdtdh w16sdtfl w16du wp14">
   <w:p>
     <w:pPr>
@@ -296,7 +391,7 @@
 </w:ftr>
 </file>
 
-<file path=word/footer2.xml><?xml version="1.0" encoding="utf-8"?>
+<file path=word\footer2.xml><?xml version="1.0" encoding="utf-8"?>
 <w:ftr xmlns:wpc="http://schemas.microsoft.com/office/word/2010/wordprocessingCanvas" xmlns:cx="http://schemas.microsoft.com/office/drawing/2014/chartex" xmlns:cx1="http://schemas.microsoft.com/office/drawing/2015/9/8/chartex" xmlns:cx2="http://schemas.microsoft.com/office/drawing/2015/10/21/chartex" xmlns:cx3="http://schemas.microsoft.com/office/drawing/2016/5/9/chartex" xmlns:cx4="http://schemas.microsoft.com/office/drawing/2016/5/10/chartex" xmlns:cx5="http://schemas.microsoft.com/office/drawing/2016/5/11/chartex" xmlns:cx6="http://schemas.microsoft.com/office/drawing/2016/5/12/chartex" xmlns:cx7="http://schemas.microsoft.com/office/drawing/2016/5/13/chartex" xmlns:cx8="http://schemas.microsoft.com/office/drawing/2016/5/14/chartex" xmlns:mc="http://schemas.openxmlformats.org/markup-compatibility/2006" xmlns:aink="http://schemas.microsoft.com/office/drawing/2016/ink" xmlns:am3d="http://schemas.microsoft.com/office/drawing/2017/model3d" xmlns:o="urn:schemas-microsoft-com:office:office" xmlns:oel="http://schemas.microsoft.com/office/2019/extlst" xmlns:r="http://schemas.openxmlformats.org/officeDocument/2006/relationships" xmlns:m="http://schemas.openxmlformats.org/officeDocument/2006/math" xmlns:v="urn:schemas-microsoft-com:vml" xmlns:wp14="http://schemas.microsoft.com/office/word/2010/wordprocessingDrawing" xmlns:wp="http://schemas.openxmlformats.org/drawingml/2006/wordprocessingDrawing" xmlns:w10="urn:schemas-microsoft-com:office:word" xmlns:w="http://schemas.openxmlformats.org/wordprocessingml/2006/main" xmlns:w14="http://schemas.microsoft.com/office/word/2010/wordml" xmlns:w15="http://schemas.microsoft.com/office/word/2012/wordml" xmlns:w16cei="http://schemas.microsoft.com/office/word/2026/wordml/cei" xmlns:w16cex="http://schemas.microsoft.com/office/word/2018/wordml/cex" xmlns:w16cid="http://schemas.microsoft.com/office/word/2016/wordml/cid" xmlns:w16="http://schemas.microsoft.com/office/word/2018/wordml" xmlns:w16du="http://schemas.microsoft.com/office/word/2023/wordml/word16du" xmlns:w16sdtdh="http://schemas.microsoft.com/office/word/2020/wordml/sdtdatahash" xmlns:w16sdtfl="http://schemas.microsoft.com/office/word/2024/wordml/sdtformatlock" xmlns:w16se="http://schemas.microsoft.com/office/word/2015/wordml/symex" xmlns:wpg="http://schemas.microsoft.com/office/word/2010/wordprocessingGroup" xmlns:wpi="http://schemas.microsoft.com/office/word/2010/wordprocessingInk" xmlns:wne="http://schemas.microsoft.com/office/word/2006/wordml" xmlns:wps="http://schemas.microsoft.com/office/word/2010/wordprocessingShape" mc:Ignorable="w14 w15 w16se w16cid w16 w16cex w16sdtdh w16sdtfl w16du wp14">
   <w:p>
     <w:pPr>
@@ -390,6 +485,7 @@
         <w:color w:val="538135" w:themeColor="accent6" w:themeShade="BF"/>
         <w:sz w:val="18"/>
         <w:szCs w:val="18"/>
+        <w:u w:val="single"/>
       </w:rPr>
     </w:pPr>
     <w:r>
@@ -399,7 +495,65 @@
         <w:sz w:val="18"/>
         <w:szCs w:val="18"/>
       </w:rPr>
-      <w:t>Av. Presidente Arthur da Silva Bernardes, 1514 - Portão, Curitiba - PR, 80320-300</w:t>
+      <w:t xml:space="preserve">R. Padre JosÃ© </w:t>
+    </w:r>
+    <w:proofErr w:type="spellStart"/>
+    <w:r>
+      <w:rPr>
+        <w:rFonts w:ascii="Bahnschrift SemiCondensed" w:hAnsi="Bahnschrift SemiCondensed"/>
+        <w:color w:val="538135" w:themeColor="accent6" w:themeShade="BF"/>
+        <w:sz w:val="18"/>
+        <w:szCs w:val="18"/>
+      </w:rPr>
+      <w:t>Kentenich</w:t>
+    </w:r>
+    <w:proofErr w:type="spellEnd"/>
+    <w:r>
+      <w:rPr>
+        <w:rFonts w:ascii="Bahnschrift SemiCondensed" w:hAnsi="Bahnschrift SemiCondensed"/>
+        <w:color w:val="538135" w:themeColor="accent6" w:themeShade="BF"/>
+        <w:sz w:val="18"/>
+        <w:szCs w:val="18"/>
+      </w:rPr>
+      <w:t xml:space="preserve">, 900, </w:t>
+    </w:r>
+    <w:proofErr w:type="spellStart"/>
+    <w:r>
+      <w:rPr>
+        <w:rFonts w:ascii="Bahnschrift SemiCondensed" w:hAnsi="Bahnschrift SemiCondensed"/>
+        <w:color w:val="538135" w:themeColor="accent6" w:themeShade="BF"/>
+        <w:sz w:val="18"/>
+        <w:szCs w:val="18"/>
+      </w:rPr>
+      <w:t>cs</w:t>
+    </w:r>
+    <w:proofErr w:type="spellEnd"/>
+    <w:r>
+      <w:rPr>
+        <w:rFonts w:ascii="Bahnschrift SemiCondensed" w:hAnsi="Bahnschrift SemiCondensed"/>
+        <w:color w:val="538135" w:themeColor="accent6" w:themeShade="BF"/>
+        <w:sz w:val="18"/>
+        <w:szCs w:val="18"/>
+      </w:rPr>
+      <w:t xml:space="preserve"> 53, </w:t>
+    </w:r>
+    <w:r>
+      <w:rPr>
+        <w:rFonts w:ascii="Bahnschrift SemiCondensed" w:hAnsi="Bahnschrift SemiCondensed"/>
+        <w:color w:val="538135" w:themeColor="accent6" w:themeShade="BF"/>
+        <w:sz w:val="18"/>
+        <w:szCs w:val="18"/>
+      </w:rPr>
+      <w:t xml:space="preserve">Campo Comprido, </w:t>
+    </w:r>
+    <w:r>
+      <w:rPr>
+        <w:rFonts w:ascii="Bahnschrift SemiCondensed" w:hAnsi="Bahnschrift SemiCondensed"/>
+        <w:color w:val="538135" w:themeColor="accent6" w:themeShade="BF"/>
+        <w:sz w:val="18"/>
+        <w:szCs w:val="18"/>
+      </w:rPr>
+      <w:t>Curitiba, PR. CEP 81.210-342</w:t>
     </w:r>
     <w:r>
       <w:rPr>
@@ -414,7 +568,7 @@
 </w:ftr>
 </file>
 
-<file path=word/footer3.xml><?xml version="1.0" encoding="utf-8"?>
+<file path=word\footer3.xml><?xml version="1.0" encoding="utf-8"?>
 <w:ftr xmlns:wpc="http://schemas.microsoft.com/office/word/2010/wordprocessingCanvas" xmlns:cx="http://schemas.microsoft.com/office/drawing/2014/chartex" xmlns:cx1="http://schemas.microsoft.com/office/drawing/2015/9/8/chartex" xmlns:cx2="http://schemas.microsoft.com/office/drawing/2015/10/21/chartex" xmlns:cx3="http://schemas.microsoft.com/office/drawing/2016/5/9/chartex" xmlns:cx4="http://schemas.microsoft.com/office/drawing/2016/5/10/chartex" xmlns:cx5="http://schemas.microsoft.com/office/drawing/2016/5/11/chartex" xmlns:cx6="http://schemas.microsoft.com/office/drawing/2016/5/12/chartex" xmlns:cx7="http://schemas.microsoft.com/office/drawing/2016/5/13/chartex" xmlns:cx8="http://schemas.microsoft.com/office/drawing/2016/5/14/chartex" xmlns:mc="http://schemas.openxmlformats.org/markup-compatibility/2006" xmlns:aink="http://schemas.microsoft.com/office/drawing/2016/ink" xmlns:am3d="http://schemas.microsoft.com/office/drawing/2017/model3d" xmlns:o="urn:schemas-microsoft-com:office:office" xmlns:oel="http://schemas.microsoft.com/office/2019/extlst" xmlns:r="http://schemas.openxmlformats.org/officeDocument/2006/relationships" xmlns:m="http://schemas.openxmlformats.org/officeDocument/2006/math" xmlns:v="urn:schemas-microsoft-com:vml" xmlns:wp14="http://schemas.microsoft.com/office/word/2010/wordprocessingDrawing" xmlns:wp="http://schemas.openxmlformats.org/drawingml/2006/wordprocessingDrawing" xmlns:w10="urn:schemas-microsoft-com:office:word" xmlns:w="http://schemas.openxmlformats.org/wordprocessingml/2006/main" xmlns:w14="http://schemas.microsoft.com/office/word/2010/wordml" xmlns:w15="http://schemas.microsoft.com/office/word/2012/wordml" xmlns:w16cei="http://schemas.microsoft.com/office/word/2026/wordml/cei" xmlns:w16cex="http://schemas.microsoft.com/office/word/2018/wordml/cex" xmlns:w16cid="http://schemas.microsoft.com/office/word/2016/wordml/cid" xmlns:w16="http://schemas.microsoft.com/office/word/2018/wordml" xmlns:w16du="http://schemas.microsoft.com/office/word/2023/wordml/word16du" xmlns:w16sdtdh="http://schemas.microsoft.com/office/word/2020/wordml/sdtdatahash" xmlns:w16sdtfl="http://schemas.microsoft.com/office/word/2024/wordml/sdtformatlock" xmlns:w16se="http://schemas.microsoft.com/office/word/2015/wordml/symex" xmlns:wpg="http://schemas.microsoft.com/office/word/2010/wordprocessingGroup" xmlns:wpi="http://schemas.microsoft.com/office/word/2010/wordprocessingInk" xmlns:wne="http://schemas.microsoft.com/office/word/2006/wordml" xmlns:wps="http://schemas.microsoft.com/office/word/2010/wordprocessingShape" mc:Ignorable="w14 w15 w16se w16cid w16 w16cex w16sdtdh w16sdtfl w16du wp14">
   <w:p>
     <w:pPr>
@@ -424,7 +578,7 @@
 </w:ftr>
 </file>
 
-<file path=word/footnotes.xml><?xml version="1.0" encoding="utf-8"?>
+<file path=word\footnotes.xml><?xml version="1.0" encoding="utf-8"?>
 <w:footnotes xmlns:wpc="http://schemas.microsoft.com/office/word/2010/wordprocessingCanvas" xmlns:cx="http://schemas.microsoft.com/office/drawing/2014/chartex" xmlns:cx1="http://schemas.microsoft.com/office/drawing/2015/9/8/chartex" xmlns:cx2="http://schemas.microsoft.com/office/drawing/2015/10/21/chartex" xmlns:cx3="http://schemas.microsoft.com/office/drawing/2016/5/9/chartex" xmlns:cx4="http://schemas.microsoft.com/office/drawing/2016/5/10/chartex" xmlns:cx5="http://schemas.microsoft.com/office/drawing/2016/5/11/chartex" xmlns:cx6="http://schemas.microsoft.com/office/drawing/2016/5/12/chartex" xmlns:cx7="http://schemas.microsoft.com/office/drawing/2016/5/13/chartex" xmlns:cx8="http://schemas.microsoft.com/office/drawing/2016/5/14/chartex" xmlns:mc="http://schemas.openxmlformats.org/markup-compatibility/2006" xmlns:aink="http://schemas.microsoft.com/office/drawing/2016/ink" xmlns:am3d="http://schemas.microsoft.com/office/drawing/2017/model3d" xmlns:o="urn:schemas-microsoft-com:office:office" xmlns:oel="http://schemas.microsoft.com/office/2019/extlst" xmlns:r="http://schemas.openxmlformats.org/officeDocument/2006/relationships" xmlns:m="http://schemas.openxmlformats.org/officeDocument/2006/math" xmlns:v="urn:schemas-microsoft-com:vml" xmlns:wp14="http://schemas.microsoft.com/office/word/2010/wordprocessingDrawing" xmlns:wp="http://schemas.openxmlformats.org/drawingml/2006/wordprocessingDrawing" xmlns:w10="urn:schemas-microsoft-com:office:word" xmlns:w="http://schemas.openxmlformats.org/wordprocessingml/2006/main" xmlns:w14="http://schemas.microsoft.com/office/word/2010/wordml" xmlns:w15="http://schemas.microsoft.com/office/word/2012/wordml" xmlns:w16cei="http://schemas.microsoft.com/office/word/2026/wordml/cei" xmlns:w16cex="http://schemas.microsoft.com/office/word/2018/wordml/cex" xmlns:w16cid="http://schemas.microsoft.com/office/word/2016/wordml/cid" xmlns:w16="http://schemas.microsoft.com/office/word/2018/wordml" xmlns:w16du="http://schemas.microsoft.com/office/word/2023/wordml/word16du" xmlns:w16sdtdh="http://schemas.microsoft.com/office/word/2020/wordml/sdtdatahash" xmlns:w16sdtfl="http://schemas.microsoft.com/office/word/2024/wordml/sdtformatlock" xmlns:w16se="http://schemas.microsoft.com/office/word/2015/wordml/symex" xmlns:wpg="http://schemas.microsoft.com/office/word/2010/wordprocessingGroup" xmlns:wpi="http://schemas.microsoft.com/office/word/2010/wordprocessingInk" xmlns:wne="http://schemas.microsoft.com/office/word/2006/wordml" xmlns:wps="http://schemas.microsoft.com/office/word/2010/wordprocessingShape" mc:Ignorable="w14 w15 w16se w16cid w16 w16cex w16sdtdh w16sdtfl w16du wp14">
   <w:footnote w:type="separator" w:id="-1">
     <w:p>
@@ -449,7 +603,7 @@
 </w:footnotes>
 </file>
 
-<file path=word/header1.xml><?xml version="1.0" encoding="utf-8"?>
+<file path=word\header1.xml><?xml version="1.0" encoding="utf-8"?>
 <w:hdr xmlns:wpc="http://schemas.microsoft.com/office/word/2010/wordprocessingCanvas" xmlns:cx="http://schemas.microsoft.com/office/drawing/2014/chartex" xmlns:cx1="http://schemas.microsoft.com/office/drawing/2015/9/8/chartex" xmlns:cx2="http://schemas.microsoft.com/office/drawing/2015/10/21/chartex" xmlns:cx3="http://schemas.microsoft.com/office/drawing/2016/5/9/chartex" xmlns:cx4="http://schemas.microsoft.com/office/drawing/2016/5/10/chartex" xmlns:cx5="http://schemas.microsoft.com/office/drawing/2016/5/11/chartex" xmlns:cx6="http://schemas.microsoft.com/office/drawing/2016/5/12/chartex" xmlns:cx7="http://schemas.microsoft.com/office/drawing/2016/5/13/chartex" xmlns:cx8="http://schemas.microsoft.com/office/drawing/2016/5/14/chartex" xmlns:mc="http://schemas.openxmlformats.org/markup-compatibility/2006" xmlns:aink="http://schemas.microsoft.com/office/drawing/2016/ink" xmlns:am3d="http://schemas.microsoft.com/office/drawing/2017/model3d" xmlns:o="urn:schemas-microsoft-com:office:office" xmlns:oel="http://schemas.microsoft.com/office/2019/extlst" xmlns:r="http://schemas.openxmlformats.org/officeDocument/2006/relationships" xmlns:m="http://schemas.openxmlformats.org/officeDocument/2006/math" xmlns:v="urn:schemas-microsoft-com:vml" xmlns:wp14="http://schemas.microsoft.com/office/word/2010/wordprocessingDrawing" xmlns:wp="http://schemas.openxmlformats.org/drawingml/2006/wordprocessingDrawing" xmlns:w10="urn:schemas-microsoft-com:office:word" xmlns:w="http://schemas.openxmlformats.org/wordprocessingml/2006/main" xmlns:w14="http://schemas.microsoft.com/office/word/2010/wordml" xmlns:w15="http://schemas.microsoft.com/office/word/2012/wordml" xmlns:w16cei="http://schemas.microsoft.com/office/word/2026/wordml/cei" xmlns:w16cex="http://schemas.microsoft.com/office/word/2018/wordml/cex" xmlns:w16cid="http://schemas.microsoft.com/office/word/2016/wordml/cid" xmlns:w16="http://schemas.microsoft.com/office/word/2018/wordml" xmlns:w16du="http://schemas.microsoft.com/office/word/2023/wordml/word16du" xmlns:w16sdtdh="http://schemas.microsoft.com/office/word/2020/wordml/sdtdatahash" xmlns:w16sdtfl="http://schemas.microsoft.com/office/word/2024/wordml/sdtformatlock" xmlns:w16se="http://schemas.microsoft.com/office/word/2015/wordml/symex" xmlns:wpg="http://schemas.microsoft.com/office/word/2010/wordprocessingGroup" xmlns:wpi="http://schemas.microsoft.com/office/word/2010/wordprocessingInk" xmlns:wne="http://schemas.microsoft.com/office/word/2006/wordml" xmlns:wps="http://schemas.microsoft.com/office/word/2010/wordprocessingShape" mc:Ignorable="w14 w15 w16se w16cid w16 w16cex w16sdtdh w16sdtfl w16du wp14">
   <w:p>
     <w:pPr>
@@ -459,7 +613,7 @@
 </w:hdr>
 </file>
 
-<file path=word/header2.xml><?xml version="1.0" encoding="utf-8"?>
+<file path=word\header2.xml><?xml version="1.0" encoding="utf-8"?>
 <w:hdr xmlns:wpc="http://schemas.microsoft.com/office/word/2010/wordprocessingCanvas" xmlns:cx="http://schemas.microsoft.com/office/drawing/2014/chartex" xmlns:cx1="http://schemas.microsoft.com/office/drawing/2015/9/8/chartex" xmlns:cx2="http://schemas.microsoft.com/office/drawing/2015/10/21/chartex" xmlns:cx3="http://schemas.microsoft.com/office/drawing/2016/5/9/chartex" xmlns:cx4="http://schemas.microsoft.com/office/drawing/2016/5/10/chartex" xmlns:cx5="http://schemas.microsoft.com/office/drawing/2016/5/11/chartex" xmlns:cx6="http://schemas.microsoft.com/office/drawing/2016/5/12/chartex" xmlns:cx7="http://schemas.microsoft.com/office/drawing/2016/5/13/chartex" xmlns:cx8="http://schemas.microsoft.com/office/drawing/2016/5/14/chartex" xmlns:mc="http://schemas.openxmlformats.org/markup-compatibility/2006" xmlns:aink="http://schemas.microsoft.com/office/drawing/2016/ink" xmlns:am3d="http://schemas.microsoft.com/office/drawing/2017/model3d" xmlns:o="urn:schemas-microsoft-com:office:office" xmlns:oel="http://schemas.microsoft.com/office/2019/extlst" xmlns:r="http://schemas.openxmlformats.org/officeDocument/2006/relationships" xmlns:m="http://schemas.openxmlformats.org/officeDocument/2006/math" xmlns:v="urn:schemas-microsoft-com:vml" xmlns:wp14="http://schemas.microsoft.com/office/word/2010/wordprocessingDrawing" xmlns:wp="http://schemas.openxmlformats.org/drawingml/2006/wordprocessingDrawing" xmlns:w10="urn:schemas-microsoft-com:office:word" xmlns:w="http://schemas.openxmlformats.org/wordprocessingml/2006/main" xmlns:w14="http://schemas.microsoft.com/office/word/2010/wordml" xmlns:w15="http://schemas.microsoft.com/office/word/2012/wordml" xmlns:w16cei="http://schemas.microsoft.com/office/word/2026/wordml/cei" xmlns:w16cex="http://schemas.microsoft.com/office/word/2018/wordml/cex" xmlns:w16cid="http://schemas.microsoft.com/office/word/2016/wordml/cid" xmlns:w16="http://schemas.microsoft.com/office/word/2018/wordml" xmlns:w16du="http://schemas.microsoft.com/office/word/2023/wordml/word16du" xmlns:w16sdtdh="http://schemas.microsoft.com/office/word/2020/wordml/sdtdatahash" xmlns:w16sdtfl="http://schemas.microsoft.com/office/word/2024/wordml/sdtformatlock" xmlns:w16se="http://schemas.microsoft.com/office/word/2015/wordml/symex" xmlns:wpg="http://schemas.microsoft.com/office/word/2010/wordprocessingGroup" xmlns:wpi="http://schemas.microsoft.com/office/word/2010/wordprocessingInk" xmlns:wne="http://schemas.microsoft.com/office/word/2006/wordml" xmlns:wps="http://schemas.microsoft.com/office/word/2010/wordprocessingShape" mc:Ignorable="w14 w15 w16se w16cid w16 w16cex w16sdtdh w16sdtfl w16du wp14">
   <w:p>
     <w:pPr>
@@ -615,7 +769,7 @@
 </w:hdr>
 </file>
 
-<file path=word/header3.xml><?xml version="1.0" encoding="utf-8"?>
+<file path=word\header3.xml><?xml version="1.0" encoding="utf-8"?>
 <w:hdr xmlns:wpc="http://schemas.microsoft.com/office/word/2010/wordprocessingCanvas" xmlns:cx="http://schemas.microsoft.com/office/drawing/2014/chartex" xmlns:cx1="http://schemas.microsoft.com/office/drawing/2015/9/8/chartex" xmlns:cx2="http://schemas.microsoft.com/office/drawing/2015/10/21/chartex" xmlns:cx3="http://schemas.microsoft.com/office/drawing/2016/5/9/chartex" xmlns:cx4="http://schemas.microsoft.com/office/drawing/2016/5/10/chartex" xmlns:cx5="http://schemas.microsoft.com/office/drawing/2016/5/11/chartex" xmlns:cx6="http://schemas.microsoft.com/office/drawing/2016/5/12/chartex" xmlns:cx7="http://schemas.microsoft.com/office/drawing/2016/5/13/chartex" xmlns:cx8="http://schemas.microsoft.com/office/drawing/2016/5/14/chartex" xmlns:mc="http://schemas.openxmlformats.org/markup-compatibility/2006" xmlns:aink="http://schemas.microsoft.com/office/drawing/2016/ink" xmlns:am3d="http://schemas.microsoft.com/office/drawing/2017/model3d" xmlns:o="urn:schemas-microsoft-com:office:office" xmlns:oel="http://schemas.microsoft.com/office/2019/extlst" xmlns:r="http://schemas.openxmlformats.org/officeDocument/2006/relationships" xmlns:m="http://schemas.openxmlformats.org/officeDocument/2006/math" xmlns:v="urn:schemas-microsoft-com:vml" xmlns:wp14="http://schemas.microsoft.com/office/word/2010/wordprocessingDrawing" xmlns:wp="http://schemas.openxmlformats.org/drawingml/2006/wordprocessingDrawing" xmlns:w10="urn:schemas-microsoft-com:office:word" xmlns:w="http://schemas.openxmlformats.org/wordprocessingml/2006/main" xmlns:w14="http://schemas.microsoft.com/office/word/2010/wordml" xmlns:w15="http://schemas.microsoft.com/office/word/2012/wordml" xmlns:w16cei="http://schemas.microsoft.com/office/word/2026/wordml/cei" xmlns:w16cex="http://schemas.microsoft.com/office/word/2018/wordml/cex" xmlns:w16cid="http://schemas.microsoft.com/office/word/2016/wordml/cid" xmlns:w16="http://schemas.microsoft.com/office/word/2018/wordml" xmlns:w16du="http://schemas.microsoft.com/office/word/2023/wordml/word16du" xmlns:w16sdtdh="http://schemas.microsoft.com/office/word/2020/wordml/sdtdatahash" xmlns:w16sdtfl="http://schemas.microsoft.com/office/word/2024/wordml/sdtformatlock" xmlns:w16se="http://schemas.microsoft.com/office/word/2015/wordml/symex" xmlns:wpg="http://schemas.microsoft.com/office/word/2010/wordprocessingGroup" xmlns:wpi="http://schemas.microsoft.com/office/word/2010/wordprocessingInk" xmlns:wne="http://schemas.microsoft.com/office/word/2006/wordml" xmlns:wps="http://schemas.microsoft.com/office/word/2010/wordprocessingShape" mc:Ignorable="w14 w15 w16se w16cid w16 w16cex w16sdtdh w16sdtfl w16du wp14">
   <w:p>
     <w:pPr>
@@ -625,7 +779,77 @@
 </w:hdr>
 </file>
 
-<file path=word/styles.xml><?xml version="1.0" encoding="utf-8"?>
+<file path=word\settings.xml><?xml version="1.0" encoding="utf-8"?>
+<w:settings xmlns:mc="http://schemas.openxmlformats.org/markup-compatibility/2006" xmlns:o="urn:schemas-microsoft-com:office:office" xmlns:r="http://schemas.openxmlformats.org/officeDocument/2006/relationships" xmlns:m="http://schemas.openxmlformats.org/officeDocument/2006/math" xmlns:v="urn:schemas-microsoft-com:vml" xmlns:w10="urn:schemas-microsoft-com:office:word" xmlns:w="http://schemas.openxmlformats.org/wordprocessingml/2006/main" xmlns:w14="http://schemas.microsoft.com/office/word/2010/wordml" xmlns:w15="http://schemas.microsoft.com/office/word/2012/wordml" xmlns:w16cex="http://schemas.microsoft.com/office/word/2018/wordml/cex" xmlns:w16cid="http://schemas.microsoft.com/office/word/2016/wordml/cid" xmlns:w16="http://schemas.microsoft.com/office/word/2018/wordml" xmlns:w16du="http://schemas.microsoft.com/office/word/2023/wordml/word16du" xmlns:w16sdtdh="http://schemas.microsoft.com/office/word/2020/wordml/sdtdatahash" xmlns:w16sdtfl="http://schemas.microsoft.com/office/word/2024/wordml/sdtformatlock" xmlns:w16se="http://schemas.microsoft.com/office/word/2015/wordml/symex" xmlns:sl="http://schemas.openxmlformats.org/schemaLibrary/2006/main" mc:Ignorable="w14 w15 w16se w16cid w16 w16cex w16sdtdh w16sdtfl w16du">
+  <w:zoom w:percent="100"/>
+  <w:defaultTabStop w:val="708"/>
+  <w:hyphenationZone w:val="425"/>
+  <w:characterSpacingControl w:val="doNotCompress"/>
+  <w:hdrShapeDefaults>
+    <o:shapedefaults v:ext="edit" spidmax="2050"/>
+  </w:hdrShapeDefaults>
+  <w:footnotePr>
+    <w:footnote w:id="-1"/>
+    <w:footnote w:id="0"/>
+  </w:footnotePr>
+  <w:endnotePr>
+    <w:endnote w:id="-1"/>
+    <w:endnote w:id="0"/>
+  </w:endnotePr>
+  <w:compat>
+    <w:compatSetting w:name="compatibilityMode" w:uri="http://schemas.microsoft.com/office/word" w:val="15"/>
+    <w:compatSetting w:name="overrideTableStyleFontSizeAndJustification" w:uri="http://schemas.microsoft.com/office/word" w:val="1"/>
+    <w:compatSetting w:name="enableOpenTypeFeatures" w:uri="http://schemas.microsoft.com/office/word" w:val="1"/>
+    <w:compatSetting w:name="doNotFlipMirrorIndents" w:uri="http://schemas.microsoft.com/office/word" w:val="1"/>
+    <w:compatSetting w:name="differentiateMultirowTableHeaders" w:uri="http://schemas.microsoft.com/office/word" w:val="1"/>
+    <w:compatSetting w:name="useWord2013TrackBottomHyphenation" w:uri="http://schemas.microsoft.com/office/word" w:val="0"/>
+  </w:compat>
+  <w:rsids>
+    <w:rsidRoot w:val="004408EB"/>
+    <w:rsid w:val="00093EA6"/>
+    <w:rsid w:val="00114699"/>
+    <w:rsid w:val="00172A06"/>
+    <w:rsid w:val="004408EB"/>
+    <w:rsid w:val="006023C8"/>
+    <w:rsid w:val="007F1FB1"/>
+    <w:rsid w:val="00892A09"/>
+    <w:rsid w:val="008B43CB"/>
+    <w:rsid w:val="00AA4636"/>
+    <w:rsid w:val="00CB3F6B"/>
+    <w:rsid w:val="00D04D69"/>
+    <w:rsid w:val="00EE7EF6"/>
+    <w:rsid w:val="00FA0FD6"/>
+  </w:rsids>
+  <m:mathPr>
+    <m:mathFont m:val="Cambria Math"/>
+    <m:brkBin m:val="before"/>
+    <m:brkBinSub m:val="--"/>
+    <m:smallFrac m:val="0"/>
+    <m:dispDef/>
+    <m:lMargin m:val="0"/>
+    <m:rMargin m:val="0"/>
+    <m:defJc m:val="centerGroup"/>
+    <m:wrapIndent m:val="1440"/>
+    <m:intLim m:val="subSup"/>
+    <m:naryLim m:val="undOvr"/>
+  </m:mathPr>
+  <w:themeFontLang w:val="pt-BR"/>
+  <w:clrSchemeMapping w:bg1="light1" w:t1="dark1" w:bg2="light2" w:t2="dark2" w:accent1="accent1" w:accent2="accent2" w:accent3="accent3" w:accent4="accent4" w:accent5="accent5" w:accent6="accent6" w:hyperlink="hyperlink" w:followedHyperlink="followedHyperlink"/>
+  <w:shapeDefaults>
+    <o:shapedefaults v:ext="edit" spidmax="2050"/>
+    <o:shapelayout v:ext="edit">
+      <o:idmap v:ext="edit" data="2"/>
+    </o:shapelayout>
+  </w:shapeDefaults>
+  <w:decimalSymbol w:val=","/>
+  <w:listSeparator w:val=";"/>
+  <w14:docId w14:val="25157B86"/>
+  <w15:chartTrackingRefBased/>
+  <w15:docId w15:val="{4014595E-6794-4D1A-8CCC-59A262A74AD6}"/>
+</w:settings>
+</file>
+
+<file path=word\styles.xml><?xml version="1.0" encoding="utf-8"?>
 <w:styles xmlns:mc="http://schemas.openxmlformats.org/markup-compatibility/2006" xmlns:r="http://schemas.openxmlformats.org/officeDocument/2006/relationships" xmlns:w="http://schemas.openxmlformats.org/wordprocessingml/2006/main" xmlns:w14="http://schemas.microsoft.com/office/word/2010/wordml" xmlns:w15="http://schemas.microsoft.com/office/word/2012/wordml" xmlns:w16cex="http://schemas.microsoft.com/office/word/2018/wordml/cex" xmlns:w16cid="http://schemas.microsoft.com/office/word/2016/wordml/cid" xmlns:w16="http://schemas.microsoft.com/office/word/2018/wordml" xmlns:w16du="http://schemas.microsoft.com/office/word/2023/wordml/word16du" xmlns:w16sdtdh="http://schemas.microsoft.com/office/word/2020/wordml/sdtdatahash" xmlns:w16sdtfl="http://schemas.microsoft.com/office/word/2024/wordml/sdtformatlock" xmlns:w16se="http://schemas.microsoft.com/office/word/2015/wordml/symex" mc:Ignorable="w14 w15 w16se w16cid w16 w16cex w16sdtdh w16sdtfl w16du">
   <w:docDefaults>
     <w:rPrDefault>
@@ -1098,7 +1322,7 @@
 </w:styles>
 </file>
 
-<file path=word/theme/theme1.xml><?xml version="1.0" encoding="utf-8"?>
+<file path=word\theme\theme1.xml><?xml version="1.0" encoding="utf-8"?>
 <a:theme xmlns:a="http://schemas.openxmlformats.org/drawingml/2006/main" name="Tema do Office">
   <a:themeElements>
     <a:clrScheme name="Office">
@@ -1393,14 +1617,9 @@
 </a:theme>
 </file>
 
-<file path=customXml/item1.xml><?xml version="1.0" encoding="utf-8"?>
-<b:Sources xmlns:b="http://schemas.openxmlformats.org/officeDocument/2006/bibliography" xmlns="http://schemas.openxmlformats.org/officeDocument/2006/bibliography" SelectedStyle="\APASixthEditionOfficeOnline.xsl" StyleName="APA" Version="6"/>
-</file>
-
-<file path=customXml/itemProps1.xml><?xml version="1.0" encoding="utf-8"?>
-<ds:datastoreItem xmlns:ds="http://schemas.openxmlformats.org/officeDocument/2006/customXml" ds:itemID="{A7DD5006-7470-48BE-9D47-026026213AC3}">
-  <ds:schemaRefs>
-    <ds:schemaRef ds:uri="http://schemas.openxmlformats.org/officeDocument/2006/bibliography"/>
-  </ds:schemaRefs>
-</ds:datastoreItem>
+<file path=word\webSettings.xml><?xml version="1.0" encoding="utf-8"?>
+<w:webSettings xmlns:mc="http://schemas.openxmlformats.org/markup-compatibility/2006" xmlns:r="http://schemas.openxmlformats.org/officeDocument/2006/relationships" xmlns:w="http://schemas.openxmlformats.org/wordprocessingml/2006/main" xmlns:w14="http://schemas.microsoft.com/office/word/2010/wordml" xmlns:w15="http://schemas.microsoft.com/office/word/2012/wordml" xmlns:w16cex="http://schemas.microsoft.com/office/word/2018/wordml/cex" xmlns:w16cid="http://schemas.microsoft.com/office/word/2016/wordml/cid" xmlns:w16="http://schemas.microsoft.com/office/word/2018/wordml" xmlns:w16du="http://schemas.microsoft.com/office/word/2023/wordml/word16du" xmlns:w16sdtdh="http://schemas.microsoft.com/office/word/2020/wordml/sdtdatahash" xmlns:w16sdtfl="http://schemas.microsoft.com/office/word/2024/wordml/sdtformatlock" xmlns:w16se="http://schemas.microsoft.com/office/word/2015/wordml/symex" mc:Ignorable="w14 w15 w16se w16cid w16 w16cex w16sdtdh w16sdtfl w16du">
+  <w:optimizeForBrowser/>
+  <w:allowPNG/>
+</w:webSettings>
 </file>
</xml_diff>

<commit_message>
fix: corrigir template.docx de condicionantes com nomes de arquivos validos no zip
</commit_message>
<xml_diff>
--- a/src/lib/templates/relatorio-condicionantes/template.docx
+++ b/src/lib/templates/relatorio-condicionantes/template.docx
@@ -1,67 +1,5 @@
 
-<file path=customXml\item1.xml><?xml version="1.0" encoding="utf-8"?>
-<b:Sources xmlns:b="http://schemas.openxmlformats.org/officeDocument/2006/bibliography" xmlns="http://schemas.openxmlformats.org/officeDocument/2006/bibliography" SelectedStyle="\APASixthEditionOfficeOnline.xsl" StyleName="APA" Version="6"/>
-</file>
-
-<file path=customXml\itemProps1.xml><?xml version="1.0" encoding="utf-8"?>
-<ds:datastoreItem xmlns:ds="http://schemas.openxmlformats.org/officeDocument/2006/customXml" ds:itemID="{A7DD5006-7470-48BE-9D47-026026213AC3}">
-  <ds:schemaRefs>
-    <ds:schemaRef ds:uri="http://schemas.openxmlformats.org/officeDocument/2006/bibliography"/>
-  </ds:schemaRefs>
-</ds:datastoreItem>
-</file>
-
-<file path=docProps\app.xml><?xml version="1.0" encoding="utf-8"?>
-<Properties xmlns="http://schemas.openxmlformats.org/officeDocument/2006/extended-properties" xmlns:vt="http://schemas.openxmlformats.org/officeDocument/2006/docPropsVTypes">
-  <Template>Normal</Template>
-  <TotalTime>26</TotalTime>
-  <Pages>1</Pages>
-  <Words>0</Words>
-  <Characters>0</Characters>
-  <Application>Microsoft Office Word</Application>
-  <DocSecurity>0</DocSecurity>
-  <Lines>0</Lines>
-  <Paragraphs>0</Paragraphs>
-  <ScaleCrop>false</ScaleCrop>
-  <HeadingPairs>
-    <vt:vector size="2" baseType="variant">
-      <vt:variant>
-        <vt:lpstr>Título</vt:lpstr>
-      </vt:variant>
-      <vt:variant>
-        <vt:i4>1</vt:i4>
-      </vt:variant>
-    </vt:vector>
-  </HeadingPairs>
-  <TitlesOfParts>
-    <vt:vector size="1" baseType="lpstr">
-      <vt:lpstr/>
-    </vt:vector>
-  </TitlesOfParts>
-  <Company/>
-  <LinksUpToDate>false</LinksUpToDate>
-  <CharactersWithSpaces>0</CharactersWithSpaces>
-  <SharedDoc>false</SharedDoc>
-  <HyperlinksChanged>false</HyperlinksChanged>
-  <AppVersion>16.0000</AppVersion>
-</Properties>
-</file>
-
-<file path=docProps\core.xml><?xml version="1.0" encoding="utf-8"?>
-<cp:coreProperties xmlns:cp="http://schemas.openxmlformats.org/package/2006/metadata/core-properties" xmlns:dc="http://purl.org/dc/elements/1.1/" xmlns:dcterms="http://purl.org/dc/terms/" xmlns:dcmitype="http://purl.org/dc/dcmitype/" xmlns:xsi="http://www.w3.org/2001/XMLSchema-instance">
-  <dc:title/>
-  <dc:subject/>
-  <dc:creator>André Nagalli</dc:creator>
-  <cp:keywords/>
-  <dc:description/>
-  <cp:lastModifiedBy>André Nagalli</cp:lastModifiedBy>
-  <cp:revision>7</cp:revision>
-  <dcterms:created xsi:type="dcterms:W3CDTF">2020-09-07T14:36:00Z</dcterms:created>
-  <dcterms:modified xsi:type="dcterms:W3CDTF">2026-08-04T14:17:00Z</dcterms:modified>
-</cp:coreProperties>
-</file>
-
-<file path=word\document.xml><?xml version="1.0" encoding="utf-8"?>
+<file path=word/document.xml><?xml version="1.0" encoding="utf-8"?>
 <w:document xmlns:wpc="http://schemas.microsoft.com/office/word/2010/wordprocessingCanvas" xmlns:cx="http://schemas.microsoft.com/office/drawing/2014/chartex" xmlns:cx1="http://schemas.microsoft.com/office/drawing/2015/9/8/chartex" xmlns:cx2="http://schemas.microsoft.com/office/drawing/2015/10/21/chartex" xmlns:cx3="http://schemas.microsoft.com/office/drawing/2016/5/9/chartex" xmlns:cx4="http://schemas.microsoft.com/office/drawing/2016/5/10/chartex" xmlns:cx5="http://schemas.microsoft.com/office/drawing/2016/5/11/chartex" xmlns:cx6="http://schemas.microsoft.com/office/drawing/2016/5/12/chartex" xmlns:cx7="http://schemas.microsoft.com/office/drawing/2016/5/13/chartex" xmlns:cx8="http://schemas.microsoft.com/office/drawing/2016/5/14/chartex" xmlns:mc="http://schemas.openxmlformats.org/markup-compatibility/2006" xmlns:aink="http://schemas.microsoft.com/office/drawing/2016/ink" xmlns:am3d="http://schemas.microsoft.com/office/drawing/2017/model3d" xmlns:o="urn:schemas-microsoft-com:office:office" xmlns:oel="http://schemas.microsoft.com/office/2019/extlst" xmlns:r="http://schemas.openxmlformats.org/officeDocument/2006/relationships" xmlns:m="http://schemas.openxmlformats.org/officeDocument/2006/math" xmlns:v="urn:schemas-microsoft-com:vml" xmlns:wp14="http://schemas.microsoft.com/office/word/2010/wordprocessingDrawing" xmlns:wp="http://schemas.openxmlformats.org/drawingml/2006/wordprocessingDrawing" xmlns:w10="urn:schemas-microsoft-com:office:word" xmlns:w="http://schemas.openxmlformats.org/wordprocessingml/2006/main" xmlns:w14="http://schemas.microsoft.com/office/word/2010/wordml" xmlns:w15="http://schemas.microsoft.com/office/word/2012/wordml" xmlns:w16cei="http://schemas.microsoft.com/office/word/2026/wordml/cei" xmlns:w16cex="http://schemas.microsoft.com/office/word/2018/wordml/cex" xmlns:w16cid="http://schemas.microsoft.com/office/word/2016/wordml/cid" xmlns:w16="http://schemas.microsoft.com/office/word/2018/wordml" xmlns:w16du="http://schemas.microsoft.com/office/word/2023/wordml/word16du" xmlns:w16sdtdh="http://schemas.microsoft.com/office/word/2020/wordml/sdtdatahash" xmlns:w16sdtfl="http://schemas.microsoft.com/office/word/2024/wordml/sdtformatlock" xmlns:w16se="http://schemas.microsoft.com/office/word/2015/wordml/symex" xmlns:wpg="http://schemas.microsoft.com/office/word/2010/wordprocessingGroup" xmlns:wpi="http://schemas.microsoft.com/office/word/2010/wordprocessingInk" xmlns:wne="http://schemas.microsoft.com/office/word/2006/wordml" xmlns:wps="http://schemas.microsoft.com/office/word/2010/wordprocessingShape" mc:Ignorable="w14 w15 w16se w16cid w16 w16cex w16sdtdh w16sdtfl w16du wp14">
   <w:body>
     <w:p>
@@ -85,7 +23,7 @@
           <w:sz w:val="24"/>
           <w:szCs w:val="24"/>
         </w:rPr>
-        <w:t xml:space="preserve">RELATÓRIO DE ATENDIMENTO A CONDICIONANTES</w:t>
+        <w:t xml:space="preserve">RELATÃRIO DE ATENDIMENTO A CONDICIONANTES</w:t>
       </w:r>
     </w:p>
     <w:p>
@@ -107,7 +45,7 @@
           <w:sz w:val="22"/>
           <w:szCs w:val="22"/>
         </w:rPr>
-        <w:t xml:space="preserve">{tipo} Nº {num_licenca}</w:t>
+        <w:t xml:space="preserve">{tipo} NÂº {num_licenca}</w:t>
       </w:r>
     </w:p>
     <w:p>
@@ -125,7 +63,7 @@
           <w:sz w:val="20"/>
           <w:szCs w:val="20"/>
         </w:rPr>
-        <w:t xml:space="preserve">Estão previstos como Detalhamento dos Requisitos de Licenciamento:</w:t>
+        <w:t xml:space="preserve">EstÃ£o previstos como Detalhamento dos Requisitos de Licenciamento:</w:t>
       </w:r>
     </w:p>
     <w:tbl>
@@ -323,7 +261,7 @@
 </w:document>
 </file>
 
-<file path=word\endnotes.xml><?xml version="1.0" encoding="utf-8"?>
+<file path=word/endnotes.xml><?xml version="1.0" encoding="utf-8"?>
 <w:endnotes xmlns:wpc="http://schemas.microsoft.com/office/word/2010/wordprocessingCanvas" xmlns:cx="http://schemas.microsoft.com/office/drawing/2014/chartex" xmlns:cx1="http://schemas.microsoft.com/office/drawing/2015/9/8/chartex" xmlns:cx2="http://schemas.microsoft.com/office/drawing/2015/10/21/chartex" xmlns:cx3="http://schemas.microsoft.com/office/drawing/2016/5/9/chartex" xmlns:cx4="http://schemas.microsoft.com/office/drawing/2016/5/10/chartex" xmlns:cx5="http://schemas.microsoft.com/office/drawing/2016/5/11/chartex" xmlns:cx6="http://schemas.microsoft.com/office/drawing/2016/5/12/chartex" xmlns:cx7="http://schemas.microsoft.com/office/drawing/2016/5/13/chartex" xmlns:cx8="http://schemas.microsoft.com/office/drawing/2016/5/14/chartex" xmlns:mc="http://schemas.openxmlformats.org/markup-compatibility/2006" xmlns:aink="http://schemas.microsoft.com/office/drawing/2016/ink" xmlns:am3d="http://schemas.microsoft.com/office/drawing/2017/model3d" xmlns:o="urn:schemas-microsoft-com:office:office" xmlns:oel="http://schemas.microsoft.com/office/2019/extlst" xmlns:r="http://schemas.openxmlformats.org/officeDocument/2006/relationships" xmlns:m="http://schemas.openxmlformats.org/officeDocument/2006/math" xmlns:v="urn:schemas-microsoft-com:vml" xmlns:wp14="http://schemas.microsoft.com/office/word/2010/wordprocessingDrawing" xmlns:wp="http://schemas.openxmlformats.org/drawingml/2006/wordprocessingDrawing" xmlns:w10="urn:schemas-microsoft-com:office:word" xmlns:w="http://schemas.openxmlformats.org/wordprocessingml/2006/main" xmlns:w14="http://schemas.microsoft.com/office/word/2010/wordml" xmlns:w15="http://schemas.microsoft.com/office/word/2012/wordml" xmlns:w16cei="http://schemas.microsoft.com/office/word/2026/wordml/cei" xmlns:w16cex="http://schemas.microsoft.com/office/word/2018/wordml/cex" xmlns:w16cid="http://schemas.microsoft.com/office/word/2016/wordml/cid" xmlns:w16="http://schemas.microsoft.com/office/word/2018/wordml" xmlns:w16du="http://schemas.microsoft.com/office/word/2023/wordml/word16du" xmlns:w16sdtdh="http://schemas.microsoft.com/office/word/2020/wordml/sdtdatahash" xmlns:w16sdtfl="http://schemas.microsoft.com/office/word/2024/wordml/sdtformatlock" xmlns:w16se="http://schemas.microsoft.com/office/word/2015/wordml/symex" xmlns:wpg="http://schemas.microsoft.com/office/word/2010/wordprocessingGroup" xmlns:wpi="http://schemas.microsoft.com/office/word/2010/wordprocessingInk" xmlns:wne="http://schemas.microsoft.com/office/word/2006/wordml" xmlns:wps="http://schemas.microsoft.com/office/word/2010/wordprocessingShape" mc:Ignorable="w14 w15 w16se w16cid w16 w16cex w16sdtdh w16sdtfl w16du wp14">
   <w:endnote w:type="separator" w:id="-1">
     <w:p>
@@ -348,40 +286,7 @@
 </w:endnotes>
 </file>
 
-<file path=word\fontTable.xml><?xml version="1.0" encoding="utf-8"?>
-<w:fonts xmlns:mc="http://schemas.openxmlformats.org/markup-compatibility/2006" xmlns:r="http://schemas.openxmlformats.org/officeDocument/2006/relationships" xmlns:w="http://schemas.openxmlformats.org/wordprocessingml/2006/main" xmlns:w14="http://schemas.microsoft.com/office/word/2010/wordml" xmlns:w15="http://schemas.microsoft.com/office/word/2012/wordml" xmlns:w16cex="http://schemas.microsoft.com/office/word/2018/wordml/cex" xmlns:w16cid="http://schemas.microsoft.com/office/word/2016/wordml/cid" xmlns:w16="http://schemas.microsoft.com/office/word/2018/wordml" xmlns:w16du="http://schemas.microsoft.com/office/word/2023/wordml/word16du" xmlns:w16sdtdh="http://schemas.microsoft.com/office/word/2020/wordml/sdtdatahash" xmlns:w16sdtfl="http://schemas.microsoft.com/office/word/2024/wordml/sdtformatlock" xmlns:w16se="http://schemas.microsoft.com/office/word/2015/wordml/symex" mc:Ignorable="w14 w15 w16se w16cid w16 w16cex w16sdtdh w16sdtfl w16du">
-  <w:font w:name="Calibri">
-    <w:panose1 w:val="020F0502020204030204"/>
-    <w:charset w:val="00"/>
-    <w:family w:val="swiss"/>
-    <w:pitch w:val="variable"/>
-    <w:sig w:usb0="E4002EFF" w:usb1="C200247B" w:usb2="00000009" w:usb3="00000000" w:csb0="000001FF" w:csb1="00000000"/>
-  </w:font>
-  <w:font w:name="Times New Roman">
-    <w:panose1 w:val="02020603050405020304"/>
-    <w:charset w:val="00"/>
-    <w:family w:val="roman"/>
-    <w:pitch w:val="variable"/>
-    <w:sig w:usb0="E0002EFF" w:usb1="C000785B" w:usb2="00000009" w:usb3="00000000" w:csb0="000001FF" w:csb1="00000000"/>
-  </w:font>
-  <w:font w:name="Bahnschrift SemiCondensed">
-    <w:panose1 w:val="020B0502040204020203"/>
-    <w:charset w:val="00"/>
-    <w:family w:val="swiss"/>
-    <w:pitch w:val="variable"/>
-    <w:sig w:usb0="A00002C7" w:usb1="00000002" w:usb2="00000000" w:usb3="00000000" w:csb0="0000019F" w:csb1="00000000"/>
-  </w:font>
-  <w:font w:name="Calibri Light">
-    <w:panose1 w:val="020F0302020204030204"/>
-    <w:charset w:val="00"/>
-    <w:family w:val="swiss"/>
-    <w:pitch w:val="variable"/>
-    <w:sig w:usb0="E4002EFF" w:usb1="C200247B" w:usb2="00000009" w:usb3="00000000" w:csb0="000001FF" w:csb1="00000000"/>
-  </w:font>
-</w:fonts>
-</file>
-
-<file path=word\footer1.xml><?xml version="1.0" encoding="utf-8"?>
+<file path=word/footer1.xml><?xml version="1.0" encoding="utf-8"?>
 <w:ftr xmlns:wpc="http://schemas.microsoft.com/office/word/2010/wordprocessingCanvas" xmlns:cx="http://schemas.microsoft.com/office/drawing/2014/chartex" xmlns:cx1="http://schemas.microsoft.com/office/drawing/2015/9/8/chartex" xmlns:cx2="http://schemas.microsoft.com/office/drawing/2015/10/21/chartex" xmlns:cx3="http://schemas.microsoft.com/office/drawing/2016/5/9/chartex" xmlns:cx4="http://schemas.microsoft.com/office/drawing/2016/5/10/chartex" xmlns:cx5="http://schemas.microsoft.com/office/drawing/2016/5/11/chartex" xmlns:cx6="http://schemas.microsoft.com/office/drawing/2016/5/12/chartex" xmlns:cx7="http://schemas.microsoft.com/office/drawing/2016/5/13/chartex" xmlns:cx8="http://schemas.microsoft.com/office/drawing/2016/5/14/chartex" xmlns:mc="http://schemas.openxmlformats.org/markup-compatibility/2006" xmlns:aink="http://schemas.microsoft.com/office/drawing/2016/ink" xmlns:am3d="http://schemas.microsoft.com/office/drawing/2017/model3d" xmlns:o="urn:schemas-microsoft-com:office:office" xmlns:oel="http://schemas.microsoft.com/office/2019/extlst" xmlns:r="http://schemas.openxmlformats.org/officeDocument/2006/relationships" xmlns:m="http://schemas.openxmlformats.org/officeDocument/2006/math" xmlns:v="urn:schemas-microsoft-com:vml" xmlns:wp14="http://schemas.microsoft.com/office/word/2010/wordprocessingDrawing" xmlns:wp="http://schemas.openxmlformats.org/drawingml/2006/wordprocessingDrawing" xmlns:w10="urn:schemas-microsoft-com:office:word" xmlns:w="http://schemas.openxmlformats.org/wordprocessingml/2006/main" xmlns:w14="http://schemas.microsoft.com/office/word/2010/wordml" xmlns:w15="http://schemas.microsoft.com/office/word/2012/wordml" xmlns:w16cei="http://schemas.microsoft.com/office/word/2026/wordml/cei" xmlns:w16cex="http://schemas.microsoft.com/office/word/2018/wordml/cex" xmlns:w16cid="http://schemas.microsoft.com/office/word/2016/wordml/cid" xmlns:w16="http://schemas.microsoft.com/office/word/2018/wordml" xmlns:w16du="http://schemas.microsoft.com/office/word/2023/wordml/word16du" xmlns:w16sdtdh="http://schemas.microsoft.com/office/word/2020/wordml/sdtdatahash" xmlns:w16sdtfl="http://schemas.microsoft.com/office/word/2024/wordml/sdtformatlock" xmlns:w16se="http://schemas.microsoft.com/office/word/2015/wordml/symex" xmlns:wpg="http://schemas.microsoft.com/office/word/2010/wordprocessingGroup" xmlns:wpi="http://schemas.microsoft.com/office/word/2010/wordprocessingInk" xmlns:wne="http://schemas.microsoft.com/office/word/2006/wordml" xmlns:wps="http://schemas.microsoft.com/office/word/2010/wordprocessingShape" mc:Ignorable="w14 w15 w16se w16cid w16 w16cex w16sdtdh w16sdtfl w16du wp14">
   <w:p>
     <w:pPr>
@@ -391,184 +296,11 @@
 </w:ftr>
 </file>
 
-<file path=word\footer2.xml><?xml version="1.0" encoding="utf-8"?>
-<w:ftr xmlns:wpc="http://schemas.microsoft.com/office/word/2010/wordprocessingCanvas" xmlns:cx="http://schemas.microsoft.com/office/drawing/2014/chartex" xmlns:cx1="http://schemas.microsoft.com/office/drawing/2015/9/8/chartex" xmlns:cx2="http://schemas.microsoft.com/office/drawing/2015/10/21/chartex" xmlns:cx3="http://schemas.microsoft.com/office/drawing/2016/5/9/chartex" xmlns:cx4="http://schemas.microsoft.com/office/drawing/2016/5/10/chartex" xmlns:cx5="http://schemas.microsoft.com/office/drawing/2016/5/11/chartex" xmlns:cx6="http://schemas.microsoft.com/office/drawing/2016/5/12/chartex" xmlns:cx7="http://schemas.microsoft.com/office/drawing/2016/5/13/chartex" xmlns:cx8="http://schemas.microsoft.com/office/drawing/2016/5/14/chartex" xmlns:mc="http://schemas.openxmlformats.org/markup-compatibility/2006" xmlns:aink="http://schemas.microsoft.com/office/drawing/2016/ink" xmlns:am3d="http://schemas.microsoft.com/office/drawing/2017/model3d" xmlns:o="urn:schemas-microsoft-com:office:office" xmlns:oel="http://schemas.microsoft.com/office/2019/extlst" xmlns:r="http://schemas.openxmlformats.org/officeDocument/2006/relationships" xmlns:m="http://schemas.openxmlformats.org/officeDocument/2006/math" xmlns:v="urn:schemas-microsoft-com:vml" xmlns:wp14="http://schemas.microsoft.com/office/word/2010/wordprocessingDrawing" xmlns:wp="http://schemas.openxmlformats.org/drawingml/2006/wordprocessingDrawing" xmlns:w10="urn:schemas-microsoft-com:office:word" xmlns:w="http://schemas.openxmlformats.org/wordprocessingml/2006/main" xmlns:w14="http://schemas.microsoft.com/office/word/2010/wordml" xmlns:w15="http://schemas.microsoft.com/office/word/2012/wordml" xmlns:w16cei="http://schemas.microsoft.com/office/word/2026/wordml/cei" xmlns:w16cex="http://schemas.microsoft.com/office/word/2018/wordml/cex" xmlns:w16cid="http://schemas.microsoft.com/office/word/2016/wordml/cid" xmlns:w16="http://schemas.microsoft.com/office/word/2018/wordml" xmlns:w16du="http://schemas.microsoft.com/office/word/2023/wordml/word16du" xmlns:w16sdtdh="http://schemas.microsoft.com/office/word/2020/wordml/sdtdatahash" xmlns:w16sdtfl="http://schemas.microsoft.com/office/word/2024/wordml/sdtformatlock" xmlns:w16se="http://schemas.microsoft.com/office/word/2015/wordml/symex" xmlns:wpg="http://schemas.microsoft.com/office/word/2010/wordprocessingGroup" xmlns:wpi="http://schemas.microsoft.com/office/word/2010/wordprocessingInk" xmlns:wne="http://schemas.microsoft.com/office/word/2006/wordml" xmlns:wps="http://schemas.microsoft.com/office/word/2010/wordprocessingShape" mc:Ignorable="w14 w15 w16se w16cid w16 w16cex w16sdtdh w16sdtfl w16du wp14">
-  <w:p>
-    <w:pPr>
-      <w:pStyle w:val="Cabealho"/>
-    </w:pPr>
-    <w:r>
-      <w:rPr>
-        <w:noProof/>
-      </w:rPr>
-      <mc:AlternateContent>
-        <mc:Choice Requires="wps">
-          <w:drawing>
-            <wp:anchor distT="0" distB="0" distL="114300" distR="114300" simplePos="0" relativeHeight="251666432" behindDoc="0" locked="0" layoutInCell="1" allowOverlap="1" wp14:anchorId="04A0C177" wp14:editId="0B88E321">
-              <wp:simplePos x="0" y="0"/>
-              <wp:positionH relativeFrom="column">
-                <wp:posOffset>-3562</wp:posOffset>
-              </wp:positionH>
-              <wp:positionV relativeFrom="paragraph">
-                <wp:posOffset>85642</wp:posOffset>
-              </wp:positionV>
-              <wp:extent cx="5578475" cy="0"/>
-              <wp:effectExtent l="19050" t="19050" r="98425" b="114300"/>
-              <wp:wrapNone/>
-              <wp:docPr id="195" name="Conector reto 195"/>
-              <wp:cNvGraphicFramePr/>
-              <a:graphic xmlns:a="http://schemas.openxmlformats.org/drawingml/2006/main">
-                <a:graphicData uri="http://schemas.microsoft.com/office/word/2010/wordprocessingShape">
-                  <wps:wsp>
-                    <wps:cNvCnPr/>
-                    <wps:spPr>
-                      <a:xfrm>
-                        <a:off x="0" y="0"/>
-                        <a:ext cx="5578475" cy="0"/>
-                      </a:xfrm>
-                      <a:prstGeom prst="line">
-                        <a:avLst/>
-                      </a:prstGeom>
-                      <a:effectLst>
-                        <a:outerShdw blurRad="50800" dist="50800" dir="2400000" algn="ctr" rotWithShape="0">
-                          <a:schemeClr val="accent1">
-                            <a:lumMod val="60000"/>
-                            <a:lumOff val="40000"/>
-                          </a:schemeClr>
-                        </a:outerShdw>
-                      </a:effectLst>
-                    </wps:spPr>
-                    <wps:style>
-                      <a:lnRef idx="3">
-                        <a:schemeClr val="accent6"/>
-                      </a:lnRef>
-                      <a:fillRef idx="0">
-                        <a:schemeClr val="accent6"/>
-                      </a:fillRef>
-                      <a:effectRef idx="2">
-                        <a:schemeClr val="accent6"/>
-                      </a:effectRef>
-                      <a:fontRef idx="minor">
-                        <a:schemeClr val="tx1"/>
-                      </a:fontRef>
-                    </wps:style>
-                    <wps:bodyPr/>
-                  </wps:wsp>
-                </a:graphicData>
-              </a:graphic>
-              <wp14:sizeRelH relativeFrom="margin">
-                <wp14:pctWidth>0</wp14:pctWidth>
-              </wp14:sizeRelH>
-            </wp:anchor>
-          </w:drawing>
-        </mc:Choice>
-        <mc:Fallback>
-          <w:pict>
-            <v:line w14:anchorId="52925A08" id="Conector reto 195" o:spid="_x0000_s1026" style="position:absolute;z-index:251666432;visibility:visible;mso-wrap-style:square;mso-width-percent:0;mso-wrap-distance-left:9pt;mso-wrap-distance-top:0;mso-wrap-distance-right:9pt;mso-wrap-distance-bottom:0;mso-position-horizontal:absolute;mso-position-horizontal-relative:text;mso-position-vertical:absolute;mso-position-vertical-relative:text;mso-width-percent:0;mso-width-relative:margin" from="-.3pt,6.75pt" to="438.95pt,6.75pt" o:gfxdata="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" strokecolor="#70ad47 [3209]" strokeweight="1.5pt">
-              <v:stroke joinstyle="miter"/>
-              <v:shadow on="t" color="#8eaadb [1940]" offset="1.081mm,.90706mm"/>
-            </v:line>
-          </w:pict>
-        </mc:Fallback>
-      </mc:AlternateContent>
-    </w:r>
-    <w:r>
-      <w:t xml:space="preserve">   </w:t>
-    </w:r>
-  </w:p>
-  <w:p>
-    <w:pPr>
-      <w:pStyle w:val="Cabealho"/>
-      <w:jc w:val="center"/>
-      <w:rPr>
-        <w:rFonts w:ascii="Bahnschrift SemiCondensed" w:hAnsi="Bahnschrift SemiCondensed"/>
-        <w:color w:val="538135" w:themeColor="accent6" w:themeShade="BF"/>
-        <w:sz w:val="18"/>
-        <w:szCs w:val="18"/>
-        <w:u w:val="single"/>
-      </w:rPr>
-    </w:pPr>
-    <w:r>
-      <w:rPr>
-        <w:rFonts w:ascii="Bahnschrift SemiCondensed" w:hAnsi="Bahnschrift SemiCondensed"/>
-        <w:color w:val="538135" w:themeColor="accent6" w:themeShade="BF"/>
-        <w:sz w:val="18"/>
-        <w:szCs w:val="18"/>
-      </w:rPr>
-      <w:t xml:space="preserve">R. Padre JosÃ© </w:t>
-    </w:r>
-    <w:proofErr w:type="spellStart"/>
-    <w:r>
-      <w:rPr>
-        <w:rFonts w:ascii="Bahnschrift SemiCondensed" w:hAnsi="Bahnschrift SemiCondensed"/>
-        <w:color w:val="538135" w:themeColor="accent6" w:themeShade="BF"/>
-        <w:sz w:val="18"/>
-        <w:szCs w:val="18"/>
-      </w:rPr>
-      <w:t>Kentenich</w:t>
-    </w:r>
-    <w:proofErr w:type="spellEnd"/>
-    <w:r>
-      <w:rPr>
-        <w:rFonts w:ascii="Bahnschrift SemiCondensed" w:hAnsi="Bahnschrift SemiCondensed"/>
-        <w:color w:val="538135" w:themeColor="accent6" w:themeShade="BF"/>
-        <w:sz w:val="18"/>
-        <w:szCs w:val="18"/>
-      </w:rPr>
-      <w:t xml:space="preserve">, 900, </w:t>
-    </w:r>
-    <w:proofErr w:type="spellStart"/>
-    <w:r>
-      <w:rPr>
-        <w:rFonts w:ascii="Bahnschrift SemiCondensed" w:hAnsi="Bahnschrift SemiCondensed"/>
-        <w:color w:val="538135" w:themeColor="accent6" w:themeShade="BF"/>
-        <w:sz w:val="18"/>
-        <w:szCs w:val="18"/>
-      </w:rPr>
-      <w:t>cs</w:t>
-    </w:r>
-    <w:proofErr w:type="spellEnd"/>
-    <w:r>
-      <w:rPr>
-        <w:rFonts w:ascii="Bahnschrift SemiCondensed" w:hAnsi="Bahnschrift SemiCondensed"/>
-        <w:color w:val="538135" w:themeColor="accent6" w:themeShade="BF"/>
-        <w:sz w:val="18"/>
-        <w:szCs w:val="18"/>
-      </w:rPr>
-      <w:t xml:space="preserve"> 53, </w:t>
-    </w:r>
-    <w:r>
-      <w:rPr>
-        <w:rFonts w:ascii="Bahnschrift SemiCondensed" w:hAnsi="Bahnschrift SemiCondensed"/>
-        <w:color w:val="538135" w:themeColor="accent6" w:themeShade="BF"/>
-        <w:sz w:val="18"/>
-        <w:szCs w:val="18"/>
-      </w:rPr>
-      <w:t xml:space="preserve">Campo Comprido, </w:t>
-    </w:r>
-    <w:r>
-      <w:rPr>
-        <w:rFonts w:ascii="Bahnschrift SemiCondensed" w:hAnsi="Bahnschrift SemiCondensed"/>
-        <w:color w:val="538135" w:themeColor="accent6" w:themeShade="BF"/>
-        <w:sz w:val="18"/>
-        <w:szCs w:val="18"/>
-      </w:rPr>
-      <w:t>Curitiba, PR. CEP 81.210-342</w:t>
-    </w:r>
-    <w:r>
-      <w:rPr>
-        <w:rFonts w:ascii="Bahnschrift SemiCondensed" w:hAnsi="Bahnschrift SemiCondensed"/>
-        <w:color w:val="538135" w:themeColor="accent6" w:themeShade="BF"/>
-        <w:sz w:val="18"/>
-        <w:szCs w:val="18"/>
-      </w:rPr>
-      <w:t>. E-mail: nagalliambiental@gmail.com</w:t>
-    </w:r>
-  </w:p>
-</w:ftr>
+<file path=word/footer2.xml>ï»¿<?xml version="1.0" encoding="UTF-8" standalone="yes"?>
+<w:ftr xmlns:wpc="http://schemas.microsoft.com/office/word/2010/wordprocessingCanvas" xmlns:cx="http://schemas.microsoft.com/office/drawing/2014/chartex" xmlns:cx1="http://schemas.microsoft.com/office/drawing/2015/9/8/chartex" xmlns:cx2="http://schemas.microsoft.com/office/drawing/2015/10/21/chartex" xmlns:cx3="http://schemas.microsoft.com/office/drawing/2016/5/9/chartex" xmlns:cx4="http://schemas.microsoft.com/office/drawing/2016/5/10/chartex" xmlns:cx5="http://schemas.microsoft.com/office/drawing/2016/5/11/chartex" xmlns:cx6="http://schemas.microsoft.com/office/drawing/2016/5/12/chartex" xmlns:cx7="http://schemas.microsoft.com/office/drawing/2016/5/13/chartex" xmlns:cx8="http://schemas.microsoft.com/office/drawing/2016/5/14/chartex" xmlns:mc="http://schemas.openxmlformats.org/markup-compatibility/2006" xmlns:aink="http://schemas.microsoft.com/office/drawing/2016/ink" xmlns:am3d="http://schemas.microsoft.com/office/drawing/2017/model3d" xmlns:o="urn:schemas-microsoft-com:office:office" xmlns:oel="http://schemas.microsoft.com/office/2019/extlst" xmlns:r="http://schemas.openxmlformats.org/officeDocument/2006/relationships" xmlns:m="http://schemas.openxmlformats.org/officeDocument/2006/math" xmlns:v="urn:schemas-microsoft-com:vml" xmlns:wp14="http://schemas.microsoft.com/office/word/2010/wordprocessingDrawing" xmlns:wp="http://schemas.openxmlformats.org/drawingml/2006/wordprocessingDrawing" xmlns:w10="urn:schemas-microsoft-com:office:word" xmlns:w="http://schemas.openxmlformats.org/wordprocessingml/2006/main" xmlns:w14="http://schemas.microsoft.com/office/word/2010/wordml" xmlns:w15="http://schemas.microsoft.com/office/word/2012/wordml" xmlns:w16cei="http://schemas.microsoft.com/office/word/2026/wordml/cei" xmlns:w16cex="http://schemas.microsoft.com/office/word/2018/wordml/cex" xmlns:w16cid="http://schemas.microsoft.com/office/word/2016/wordml/cid" xmlns:w16="http://schemas.microsoft.com/office/word/2018/wordml" xmlns:w16du="http://schemas.microsoft.com/office/word/2023/wordml/word16du" xmlns:w16sdtdh="http://schemas.microsoft.com/office/word/2020/wordml/sdtdatahash" xmlns:w16sdtfl="http://schemas.microsoft.com/office/word/2024/wordml/sdtformatlock" xmlns:w16se="http://schemas.microsoft.com/office/word/2015/wordml/symex" xmlns:wpg="http://schemas.microsoft.com/office/word/2010/wordprocessingGroup" xmlns:wpi="http://schemas.microsoft.com/office/word/2010/wordprocessingInk" xmlns:wne="http://schemas.microsoft.com/office/word/2006/wordml" xmlns:wps="http://schemas.microsoft.com/office/word/2010/wordprocessingShape" mc:Ignorable="w14 w15 w16se w16cid w16 w16cex w16sdtdh w16sdtfl w16du wp14"><w:p><w:pPr><w:pStyle w:val="Cabealho"/></w:pPr><w:r><w:rPr><w:noProof/></w:rPr><mc:AlternateContent><mc:Choice Requires="wps"><w:drawing><wp:anchor distT="0" distB="0" distL="114300" distR="114300" simplePos="0" relativeHeight="251666432" behindDoc="0" locked="0" layoutInCell="1" allowOverlap="1" wp14:anchorId="04A0C177" wp14:editId="0B88E321"><wp:simplePos x="0" y="0"/><wp:positionH relativeFrom="column"><wp:posOffset>-3562</wp:posOffset></wp:positionH><wp:positionV relativeFrom="paragraph"><wp:posOffset>85642</wp:posOffset></wp:positionV><wp:extent cx="5578475" cy="0"/><wp:effectExtent l="19050" t="19050" r="98425" b="114300"/><wp:wrapNone/><wp:docPr id="195" name="Conector reto 195"/><wp:cNvGraphicFramePr/><a:graphic xmlns:a="http://schemas.openxmlformats.org/drawingml/2006/main"><a:graphicData uri="http://schemas.microsoft.com/office/word/2010/wordprocessingShape"><wps:wsp><wps:cNvCnPr/><wps:spPr><a:xfrm><a:off x="0" y="0"/><a:ext cx="5578475" cy="0"/></a:xfrm><a:prstGeom prst="line"><a:avLst/></a:prstGeom><a:effectLst><a:outerShdw blurRad="50800" dist="50800" dir="2400000" algn="ctr" rotWithShape="0"><a:schemeClr val="accent1"><a:lumMod val="60000"/><a:lumOff val="40000"/></a:schemeClr></a:outerShdw></a:effectLst></wps:spPr><wps:style><a:lnRef idx="3"><a:schemeClr val="accent6"/></a:lnRef><a:fillRef idx="0"><a:schemeClr val="accent6"/></a:fillRef><a:effectRef idx="2"><a:schemeClr val="accent6"/></a:effectRef><a:fontRef idx="minor"><a:schemeClr val="tx1"/></a:fontRef></wps:style><wps:bodyPr/></wps:wsp></a:graphicData></a:graphic><wp14:sizeRelH relativeFrom="margin"><wp14:pctWidth>0</wp14:pctWidth></wp14:sizeRelH></wp:anchor></w:drawing></mc:Choice><mc:Fallback><w:pict><v:line w14:anchorId="52925A08" id="Conector reto 195" o:spid="_x0000_s1026" style="position:absolute;z-index:251666432;visibility:visible;mso-wrap-style:square;mso-width-percent:0;mso-wrap-distance-left:9pt;mso-wrap-distance-top:0;mso-wrap-distance-right:9pt;mso-wrap-distance-bottom:0;mso-position-horizontal:absolute;mso-position-horizontal-relative:text;mso-position-vertical:absolute;mso-position-vertical-relative:text;mso-width-percent:0;mso-width-relative:margin" from="-.3pt,6.75pt" to="438.95pt,6.75pt" o:gfxdata="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" strokecolor="#70ad47 [3209]" strokeweight="1.5pt"><v:stroke joinstyle="miter"/><v:shadow on="t" color="#8eaadb [1940]" offset="1.081mm,.90706mm"/></v:line></w:pict></mc:Fallback></mc:AlternateContent></w:r><w:r><w:t xml:space="preserve">   </w:t></w:r></w:p><w:p><w:pPr><w:pStyle w:val="Cabealho"/><w:jc w:val="center"/><w:rPr><w:rFonts w:ascii="Bahnschrift SemiCondensed" w:hAnsi="Bahnschrift SemiCondensed"/><w:color w:val="538135" w:themeColor="accent6" w:themeShade="BF"/><w:sz w:val="18"/><w:szCs w:val="18"/><w:u w:val="single"/></w:rPr></w:pPr><w:r><w:rPr><w:rFonts w:ascii="Bahnschrift SemiCondensed" w:hAnsi="Bahnschrift SemiCondensed"/><w:color w:val="538135" w:themeColor="accent6" w:themeShade="BF"/><w:sz w:val="18"/><w:szCs w:val="18"/></w:rPr><w:t xml:space="preserve">R. Padre JosÃÂ© </w:t></w:r><w:proofErr w:type="spellStart"/><w:r><w:rPr><w:rFonts w:ascii="Bahnschrift SemiCondensed" w:hAnsi="Bahnschrift SemiCondensed"/><w:color w:val="538135" w:themeColor="accent6" w:themeShade="BF"/><w:sz w:val="18"/><w:szCs w:val="18"/></w:rPr><w:t>Kentenich</w:t></w:r><w:proofErr w:type="spellEnd"/><w:r><w:rPr><w:rFonts w:ascii="Bahnschrift SemiCondensed" w:hAnsi="Bahnschrift SemiCondensed"/><w:color w:val="538135" w:themeColor="accent6" w:themeShade="BF"/><w:sz w:val="18"/><w:szCs w:val="18"/></w:rPr><w:t xml:space="preserve">, 900, </w:t></w:r><w:proofErr w:type="spellStart"/><w:r><w:rPr><w:rFonts w:ascii="Bahnschrift SemiCondensed" w:hAnsi="Bahnschrift SemiCondensed"/><w:color w:val="538135" w:themeColor="accent6" w:themeShade="BF"/><w:sz w:val="18"/><w:szCs w:val="18"/></w:rPr><w:t>cs</w:t></w:r><w:proofErr w:type="spellEnd"/><w:r><w:rPr><w:rFonts w:ascii="Bahnschrift SemiCondensed" w:hAnsi="Bahnschrift SemiCondensed"/><w:color w:val="538135" w:themeColor="accent6" w:themeShade="BF"/><w:sz w:val="18"/><w:szCs w:val="18"/></w:rPr><w:t xml:space="preserve"> 53, </w:t></w:r><w:r><w:rPr><w:rFonts w:ascii="Bahnschrift SemiCondensed" w:hAnsi="Bahnschrift SemiCondensed"/><w:color w:val="538135" w:themeColor="accent6" w:themeShade="BF"/><w:sz w:val="18"/><w:szCs w:val="18"/></w:rPr><w:t xml:space="preserve">Campo Comprido, </w:t></w:r><w:r><w:rPr><w:rFonts w:ascii="Bahnschrift SemiCondensed" w:hAnsi="Bahnschrift SemiCondensed"/><w:color w:val="538135" w:themeColor="accent6" w:themeShade="BF"/><w:sz w:val="18"/><w:szCs w:val="18"/></w:rPr><w:t>Curitiba, PR. CEP 81.210-342</w:t></w:r><w:r><w:rPr><w:rFonts w:ascii="Bahnschrift SemiCondensed" w:hAnsi="Bahnschrift SemiCondensed"/><w:color w:val="538135" w:themeColor="accent6" w:themeShade="BF"/><w:sz w:val="18"/><w:szCs w:val="18"/></w:rPr><w:t>. E-mail: nagalliambiental@gmail.com</w:t></w:r></w:p></w:ftr>
 </file>
 
-<file path=word\footer3.xml><?xml version="1.0" encoding="utf-8"?>
+<file path=word/footer3.xml><?xml version="1.0" encoding="utf-8"?>
 <w:ftr xmlns:wpc="http://schemas.microsoft.com/office/word/2010/wordprocessingCanvas" xmlns:cx="http://schemas.microsoft.com/office/drawing/2014/chartex" xmlns:cx1="http://schemas.microsoft.com/office/drawing/2015/9/8/chartex" xmlns:cx2="http://schemas.microsoft.com/office/drawing/2015/10/21/chartex" xmlns:cx3="http://schemas.microsoft.com/office/drawing/2016/5/9/chartex" xmlns:cx4="http://schemas.microsoft.com/office/drawing/2016/5/10/chartex" xmlns:cx5="http://schemas.microsoft.com/office/drawing/2016/5/11/chartex" xmlns:cx6="http://schemas.microsoft.com/office/drawing/2016/5/12/chartex" xmlns:cx7="http://schemas.microsoft.com/office/drawing/2016/5/13/chartex" xmlns:cx8="http://schemas.microsoft.com/office/drawing/2016/5/14/chartex" xmlns:mc="http://schemas.openxmlformats.org/markup-compatibility/2006" xmlns:aink="http://schemas.microsoft.com/office/drawing/2016/ink" xmlns:am3d="http://schemas.microsoft.com/office/drawing/2017/model3d" xmlns:o="urn:schemas-microsoft-com:office:office" xmlns:oel="http://schemas.microsoft.com/office/2019/extlst" xmlns:r="http://schemas.openxmlformats.org/officeDocument/2006/relationships" xmlns:m="http://schemas.openxmlformats.org/officeDocument/2006/math" xmlns:v="urn:schemas-microsoft-com:vml" xmlns:wp14="http://schemas.microsoft.com/office/word/2010/wordprocessingDrawing" xmlns:wp="http://schemas.openxmlformats.org/drawingml/2006/wordprocessingDrawing" xmlns:w10="urn:schemas-microsoft-com:office:word" xmlns:w="http://schemas.openxmlformats.org/wordprocessingml/2006/main" xmlns:w14="http://schemas.microsoft.com/office/word/2010/wordml" xmlns:w15="http://schemas.microsoft.com/office/word/2012/wordml" xmlns:w16cei="http://schemas.microsoft.com/office/word/2026/wordml/cei" xmlns:w16cex="http://schemas.microsoft.com/office/word/2018/wordml/cex" xmlns:w16cid="http://schemas.microsoft.com/office/word/2016/wordml/cid" xmlns:w16="http://schemas.microsoft.com/office/word/2018/wordml" xmlns:w16du="http://schemas.microsoft.com/office/word/2023/wordml/word16du" xmlns:w16sdtdh="http://schemas.microsoft.com/office/word/2020/wordml/sdtdatahash" xmlns:w16sdtfl="http://schemas.microsoft.com/office/word/2024/wordml/sdtformatlock" xmlns:w16se="http://schemas.microsoft.com/office/word/2015/wordml/symex" xmlns:wpg="http://schemas.microsoft.com/office/word/2010/wordprocessingGroup" xmlns:wpi="http://schemas.microsoft.com/office/word/2010/wordprocessingInk" xmlns:wne="http://schemas.microsoft.com/office/word/2006/wordml" xmlns:wps="http://schemas.microsoft.com/office/word/2010/wordprocessingShape" mc:Ignorable="w14 w15 w16se w16cid w16 w16cex w16sdtdh w16sdtfl w16du wp14">
   <w:p>
     <w:pPr>
@@ -578,7 +310,7 @@
 </w:ftr>
 </file>
 
-<file path=word\footnotes.xml><?xml version="1.0" encoding="utf-8"?>
+<file path=word/footnotes.xml><?xml version="1.0" encoding="utf-8"?>
 <w:footnotes xmlns:wpc="http://schemas.microsoft.com/office/word/2010/wordprocessingCanvas" xmlns:cx="http://schemas.microsoft.com/office/drawing/2014/chartex" xmlns:cx1="http://schemas.microsoft.com/office/drawing/2015/9/8/chartex" xmlns:cx2="http://schemas.microsoft.com/office/drawing/2015/10/21/chartex" xmlns:cx3="http://schemas.microsoft.com/office/drawing/2016/5/9/chartex" xmlns:cx4="http://schemas.microsoft.com/office/drawing/2016/5/10/chartex" xmlns:cx5="http://schemas.microsoft.com/office/drawing/2016/5/11/chartex" xmlns:cx6="http://schemas.microsoft.com/office/drawing/2016/5/12/chartex" xmlns:cx7="http://schemas.microsoft.com/office/drawing/2016/5/13/chartex" xmlns:cx8="http://schemas.microsoft.com/office/drawing/2016/5/14/chartex" xmlns:mc="http://schemas.openxmlformats.org/markup-compatibility/2006" xmlns:aink="http://schemas.microsoft.com/office/drawing/2016/ink" xmlns:am3d="http://schemas.microsoft.com/office/drawing/2017/model3d" xmlns:o="urn:schemas-microsoft-com:office:office" xmlns:oel="http://schemas.microsoft.com/office/2019/extlst" xmlns:r="http://schemas.openxmlformats.org/officeDocument/2006/relationships" xmlns:m="http://schemas.openxmlformats.org/officeDocument/2006/math" xmlns:v="urn:schemas-microsoft-com:vml" xmlns:wp14="http://schemas.microsoft.com/office/word/2010/wordprocessingDrawing" xmlns:wp="http://schemas.openxmlformats.org/drawingml/2006/wordprocessingDrawing" xmlns:w10="urn:schemas-microsoft-com:office:word" xmlns:w="http://schemas.openxmlformats.org/wordprocessingml/2006/main" xmlns:w14="http://schemas.microsoft.com/office/word/2010/wordml" xmlns:w15="http://schemas.microsoft.com/office/word/2012/wordml" xmlns:w16cei="http://schemas.microsoft.com/office/word/2026/wordml/cei" xmlns:w16cex="http://schemas.microsoft.com/office/word/2018/wordml/cex" xmlns:w16cid="http://schemas.microsoft.com/office/word/2016/wordml/cid" xmlns:w16="http://schemas.microsoft.com/office/word/2018/wordml" xmlns:w16du="http://schemas.microsoft.com/office/word/2023/wordml/word16du" xmlns:w16sdtdh="http://schemas.microsoft.com/office/word/2020/wordml/sdtdatahash" xmlns:w16sdtfl="http://schemas.microsoft.com/office/word/2024/wordml/sdtformatlock" xmlns:w16se="http://schemas.microsoft.com/office/word/2015/wordml/symex" xmlns:wpg="http://schemas.microsoft.com/office/word/2010/wordprocessingGroup" xmlns:wpi="http://schemas.microsoft.com/office/word/2010/wordprocessingInk" xmlns:wne="http://schemas.microsoft.com/office/word/2006/wordml" xmlns:wps="http://schemas.microsoft.com/office/word/2010/wordprocessingShape" mc:Ignorable="w14 w15 w16se w16cid w16 w16cex w16sdtdh w16sdtfl w16du wp14">
   <w:footnote w:type="separator" w:id="-1">
     <w:p>
@@ -603,7 +335,7 @@
 </w:footnotes>
 </file>
 
-<file path=word\header1.xml><?xml version="1.0" encoding="utf-8"?>
+<file path=word/header1.xml><?xml version="1.0" encoding="utf-8"?>
 <w:hdr xmlns:wpc="http://schemas.microsoft.com/office/word/2010/wordprocessingCanvas" xmlns:cx="http://schemas.microsoft.com/office/drawing/2014/chartex" xmlns:cx1="http://schemas.microsoft.com/office/drawing/2015/9/8/chartex" xmlns:cx2="http://schemas.microsoft.com/office/drawing/2015/10/21/chartex" xmlns:cx3="http://schemas.microsoft.com/office/drawing/2016/5/9/chartex" xmlns:cx4="http://schemas.microsoft.com/office/drawing/2016/5/10/chartex" xmlns:cx5="http://schemas.microsoft.com/office/drawing/2016/5/11/chartex" xmlns:cx6="http://schemas.microsoft.com/office/drawing/2016/5/12/chartex" xmlns:cx7="http://schemas.microsoft.com/office/drawing/2016/5/13/chartex" xmlns:cx8="http://schemas.microsoft.com/office/drawing/2016/5/14/chartex" xmlns:mc="http://schemas.openxmlformats.org/markup-compatibility/2006" xmlns:aink="http://schemas.microsoft.com/office/drawing/2016/ink" xmlns:am3d="http://schemas.microsoft.com/office/drawing/2017/model3d" xmlns:o="urn:schemas-microsoft-com:office:office" xmlns:oel="http://schemas.microsoft.com/office/2019/extlst" xmlns:r="http://schemas.openxmlformats.org/officeDocument/2006/relationships" xmlns:m="http://schemas.openxmlformats.org/officeDocument/2006/math" xmlns:v="urn:schemas-microsoft-com:vml" xmlns:wp14="http://schemas.microsoft.com/office/word/2010/wordprocessingDrawing" xmlns:wp="http://schemas.openxmlformats.org/drawingml/2006/wordprocessingDrawing" xmlns:w10="urn:schemas-microsoft-com:office:word" xmlns:w="http://schemas.openxmlformats.org/wordprocessingml/2006/main" xmlns:w14="http://schemas.microsoft.com/office/word/2010/wordml" xmlns:w15="http://schemas.microsoft.com/office/word/2012/wordml" xmlns:w16cei="http://schemas.microsoft.com/office/word/2026/wordml/cei" xmlns:w16cex="http://schemas.microsoft.com/office/word/2018/wordml/cex" xmlns:w16cid="http://schemas.microsoft.com/office/word/2016/wordml/cid" xmlns:w16="http://schemas.microsoft.com/office/word/2018/wordml" xmlns:w16du="http://schemas.microsoft.com/office/word/2023/wordml/word16du" xmlns:w16sdtdh="http://schemas.microsoft.com/office/word/2020/wordml/sdtdatahash" xmlns:w16sdtfl="http://schemas.microsoft.com/office/word/2024/wordml/sdtformatlock" xmlns:w16se="http://schemas.microsoft.com/office/word/2015/wordml/symex" xmlns:wpg="http://schemas.microsoft.com/office/word/2010/wordprocessingGroup" xmlns:wpi="http://schemas.microsoft.com/office/word/2010/wordprocessingInk" xmlns:wne="http://schemas.microsoft.com/office/word/2006/wordml" xmlns:wps="http://schemas.microsoft.com/office/word/2010/wordprocessingShape" mc:Ignorable="w14 w15 w16se w16cid w16 w16cex w16sdtdh w16sdtfl w16du wp14">
   <w:p>
     <w:pPr>
@@ -613,7 +345,7 @@
 </w:hdr>
 </file>
 
-<file path=word\header2.xml><?xml version="1.0" encoding="utf-8"?>
+<file path=word/header2.xml><?xml version="1.0" encoding="utf-8"?>
 <w:hdr xmlns:wpc="http://schemas.microsoft.com/office/word/2010/wordprocessingCanvas" xmlns:cx="http://schemas.microsoft.com/office/drawing/2014/chartex" xmlns:cx1="http://schemas.microsoft.com/office/drawing/2015/9/8/chartex" xmlns:cx2="http://schemas.microsoft.com/office/drawing/2015/10/21/chartex" xmlns:cx3="http://schemas.microsoft.com/office/drawing/2016/5/9/chartex" xmlns:cx4="http://schemas.microsoft.com/office/drawing/2016/5/10/chartex" xmlns:cx5="http://schemas.microsoft.com/office/drawing/2016/5/11/chartex" xmlns:cx6="http://schemas.microsoft.com/office/drawing/2016/5/12/chartex" xmlns:cx7="http://schemas.microsoft.com/office/drawing/2016/5/13/chartex" xmlns:cx8="http://schemas.microsoft.com/office/drawing/2016/5/14/chartex" xmlns:mc="http://schemas.openxmlformats.org/markup-compatibility/2006" xmlns:aink="http://schemas.microsoft.com/office/drawing/2016/ink" xmlns:am3d="http://schemas.microsoft.com/office/drawing/2017/model3d" xmlns:o="urn:schemas-microsoft-com:office:office" xmlns:oel="http://schemas.microsoft.com/office/2019/extlst" xmlns:r="http://schemas.openxmlformats.org/officeDocument/2006/relationships" xmlns:m="http://schemas.openxmlformats.org/officeDocument/2006/math" xmlns:v="urn:schemas-microsoft-com:vml" xmlns:wp14="http://schemas.microsoft.com/office/word/2010/wordprocessingDrawing" xmlns:wp="http://schemas.openxmlformats.org/drawingml/2006/wordprocessingDrawing" xmlns:w10="urn:schemas-microsoft-com:office:word" xmlns:w="http://schemas.openxmlformats.org/wordprocessingml/2006/main" xmlns:w14="http://schemas.microsoft.com/office/word/2010/wordml" xmlns:w15="http://schemas.microsoft.com/office/word/2012/wordml" xmlns:w16cei="http://schemas.microsoft.com/office/word/2026/wordml/cei" xmlns:w16cex="http://schemas.microsoft.com/office/word/2018/wordml/cex" xmlns:w16cid="http://schemas.microsoft.com/office/word/2016/wordml/cid" xmlns:w16="http://schemas.microsoft.com/office/word/2018/wordml" xmlns:w16du="http://schemas.microsoft.com/office/word/2023/wordml/word16du" xmlns:w16sdtdh="http://schemas.microsoft.com/office/word/2020/wordml/sdtdatahash" xmlns:w16sdtfl="http://schemas.microsoft.com/office/word/2024/wordml/sdtformatlock" xmlns:w16se="http://schemas.microsoft.com/office/word/2015/wordml/symex" xmlns:wpg="http://schemas.microsoft.com/office/word/2010/wordprocessingGroup" xmlns:wpi="http://schemas.microsoft.com/office/word/2010/wordprocessingInk" xmlns:wne="http://schemas.microsoft.com/office/word/2006/wordml" xmlns:wps="http://schemas.microsoft.com/office/word/2010/wordprocessingShape" mc:Ignorable="w14 w15 w16se w16cid w16 w16cex w16sdtdh w16sdtfl w16du wp14">
   <w:p>
     <w:pPr>
@@ -769,7 +501,7 @@
 </w:hdr>
 </file>
 
-<file path=word\header3.xml><?xml version="1.0" encoding="utf-8"?>
+<file path=word/header3.xml><?xml version="1.0" encoding="utf-8"?>
 <w:hdr xmlns:wpc="http://schemas.microsoft.com/office/word/2010/wordprocessingCanvas" xmlns:cx="http://schemas.microsoft.com/office/drawing/2014/chartex" xmlns:cx1="http://schemas.microsoft.com/office/drawing/2015/9/8/chartex" xmlns:cx2="http://schemas.microsoft.com/office/drawing/2015/10/21/chartex" xmlns:cx3="http://schemas.microsoft.com/office/drawing/2016/5/9/chartex" xmlns:cx4="http://schemas.microsoft.com/office/drawing/2016/5/10/chartex" xmlns:cx5="http://schemas.microsoft.com/office/drawing/2016/5/11/chartex" xmlns:cx6="http://schemas.microsoft.com/office/drawing/2016/5/12/chartex" xmlns:cx7="http://schemas.microsoft.com/office/drawing/2016/5/13/chartex" xmlns:cx8="http://schemas.microsoft.com/office/drawing/2016/5/14/chartex" xmlns:mc="http://schemas.openxmlformats.org/markup-compatibility/2006" xmlns:aink="http://schemas.microsoft.com/office/drawing/2016/ink" xmlns:am3d="http://schemas.microsoft.com/office/drawing/2017/model3d" xmlns:o="urn:schemas-microsoft-com:office:office" xmlns:oel="http://schemas.microsoft.com/office/2019/extlst" xmlns:r="http://schemas.openxmlformats.org/officeDocument/2006/relationships" xmlns:m="http://schemas.openxmlformats.org/officeDocument/2006/math" xmlns:v="urn:schemas-microsoft-com:vml" xmlns:wp14="http://schemas.microsoft.com/office/word/2010/wordprocessingDrawing" xmlns:wp="http://schemas.openxmlformats.org/drawingml/2006/wordprocessingDrawing" xmlns:w10="urn:schemas-microsoft-com:office:word" xmlns:w="http://schemas.openxmlformats.org/wordprocessingml/2006/main" xmlns:w14="http://schemas.microsoft.com/office/word/2010/wordml" xmlns:w15="http://schemas.microsoft.com/office/word/2012/wordml" xmlns:w16cei="http://schemas.microsoft.com/office/word/2026/wordml/cei" xmlns:w16cex="http://schemas.microsoft.com/office/word/2018/wordml/cex" xmlns:w16cid="http://schemas.microsoft.com/office/word/2016/wordml/cid" xmlns:w16="http://schemas.microsoft.com/office/word/2018/wordml" xmlns:w16du="http://schemas.microsoft.com/office/word/2023/wordml/word16du" xmlns:w16sdtdh="http://schemas.microsoft.com/office/word/2020/wordml/sdtdatahash" xmlns:w16sdtfl="http://schemas.microsoft.com/office/word/2024/wordml/sdtformatlock" xmlns:w16se="http://schemas.microsoft.com/office/word/2015/wordml/symex" xmlns:wpg="http://schemas.microsoft.com/office/word/2010/wordprocessingGroup" xmlns:wpi="http://schemas.microsoft.com/office/word/2010/wordprocessingInk" xmlns:wne="http://schemas.microsoft.com/office/word/2006/wordml" xmlns:wps="http://schemas.microsoft.com/office/word/2010/wordprocessingShape" mc:Ignorable="w14 w15 w16se w16cid w16 w16cex w16sdtdh w16sdtfl w16du wp14">
   <w:p>
     <w:pPr>
@@ -779,77 +511,7 @@
 </w:hdr>
 </file>
 
-<file path=word\settings.xml><?xml version="1.0" encoding="utf-8"?>
-<w:settings xmlns:mc="http://schemas.openxmlformats.org/markup-compatibility/2006" xmlns:o="urn:schemas-microsoft-com:office:office" xmlns:r="http://schemas.openxmlformats.org/officeDocument/2006/relationships" xmlns:m="http://schemas.openxmlformats.org/officeDocument/2006/math" xmlns:v="urn:schemas-microsoft-com:vml" xmlns:w10="urn:schemas-microsoft-com:office:word" xmlns:w="http://schemas.openxmlformats.org/wordprocessingml/2006/main" xmlns:w14="http://schemas.microsoft.com/office/word/2010/wordml" xmlns:w15="http://schemas.microsoft.com/office/word/2012/wordml" xmlns:w16cex="http://schemas.microsoft.com/office/word/2018/wordml/cex" xmlns:w16cid="http://schemas.microsoft.com/office/word/2016/wordml/cid" xmlns:w16="http://schemas.microsoft.com/office/word/2018/wordml" xmlns:w16du="http://schemas.microsoft.com/office/word/2023/wordml/word16du" xmlns:w16sdtdh="http://schemas.microsoft.com/office/word/2020/wordml/sdtdatahash" xmlns:w16sdtfl="http://schemas.microsoft.com/office/word/2024/wordml/sdtformatlock" xmlns:w16se="http://schemas.microsoft.com/office/word/2015/wordml/symex" xmlns:sl="http://schemas.openxmlformats.org/schemaLibrary/2006/main" mc:Ignorable="w14 w15 w16se w16cid w16 w16cex w16sdtdh w16sdtfl w16du">
-  <w:zoom w:percent="100"/>
-  <w:defaultTabStop w:val="708"/>
-  <w:hyphenationZone w:val="425"/>
-  <w:characterSpacingControl w:val="doNotCompress"/>
-  <w:hdrShapeDefaults>
-    <o:shapedefaults v:ext="edit" spidmax="2050"/>
-  </w:hdrShapeDefaults>
-  <w:footnotePr>
-    <w:footnote w:id="-1"/>
-    <w:footnote w:id="0"/>
-  </w:footnotePr>
-  <w:endnotePr>
-    <w:endnote w:id="-1"/>
-    <w:endnote w:id="0"/>
-  </w:endnotePr>
-  <w:compat>
-    <w:compatSetting w:name="compatibilityMode" w:uri="http://schemas.microsoft.com/office/word" w:val="15"/>
-    <w:compatSetting w:name="overrideTableStyleFontSizeAndJustification" w:uri="http://schemas.microsoft.com/office/word" w:val="1"/>
-    <w:compatSetting w:name="enableOpenTypeFeatures" w:uri="http://schemas.microsoft.com/office/word" w:val="1"/>
-    <w:compatSetting w:name="doNotFlipMirrorIndents" w:uri="http://schemas.microsoft.com/office/word" w:val="1"/>
-    <w:compatSetting w:name="differentiateMultirowTableHeaders" w:uri="http://schemas.microsoft.com/office/word" w:val="1"/>
-    <w:compatSetting w:name="useWord2013TrackBottomHyphenation" w:uri="http://schemas.microsoft.com/office/word" w:val="0"/>
-  </w:compat>
-  <w:rsids>
-    <w:rsidRoot w:val="004408EB"/>
-    <w:rsid w:val="00093EA6"/>
-    <w:rsid w:val="00114699"/>
-    <w:rsid w:val="00172A06"/>
-    <w:rsid w:val="004408EB"/>
-    <w:rsid w:val="006023C8"/>
-    <w:rsid w:val="007F1FB1"/>
-    <w:rsid w:val="00892A09"/>
-    <w:rsid w:val="008B43CB"/>
-    <w:rsid w:val="00AA4636"/>
-    <w:rsid w:val="00CB3F6B"/>
-    <w:rsid w:val="00D04D69"/>
-    <w:rsid w:val="00EE7EF6"/>
-    <w:rsid w:val="00FA0FD6"/>
-  </w:rsids>
-  <m:mathPr>
-    <m:mathFont m:val="Cambria Math"/>
-    <m:brkBin m:val="before"/>
-    <m:brkBinSub m:val="--"/>
-    <m:smallFrac m:val="0"/>
-    <m:dispDef/>
-    <m:lMargin m:val="0"/>
-    <m:rMargin m:val="0"/>
-    <m:defJc m:val="centerGroup"/>
-    <m:wrapIndent m:val="1440"/>
-    <m:intLim m:val="subSup"/>
-    <m:naryLim m:val="undOvr"/>
-  </m:mathPr>
-  <w:themeFontLang w:val="pt-BR"/>
-  <w:clrSchemeMapping w:bg1="light1" w:t1="dark1" w:bg2="light2" w:t2="dark2" w:accent1="accent1" w:accent2="accent2" w:accent3="accent3" w:accent4="accent4" w:accent5="accent5" w:accent6="accent6" w:hyperlink="hyperlink" w:followedHyperlink="followedHyperlink"/>
-  <w:shapeDefaults>
-    <o:shapedefaults v:ext="edit" spidmax="2050"/>
-    <o:shapelayout v:ext="edit">
-      <o:idmap v:ext="edit" data="2"/>
-    </o:shapelayout>
-  </w:shapeDefaults>
-  <w:decimalSymbol w:val=","/>
-  <w:listSeparator w:val=";"/>
-  <w14:docId w14:val="25157B86"/>
-  <w15:chartTrackingRefBased/>
-  <w15:docId w15:val="{4014595E-6794-4D1A-8CCC-59A262A74AD6}"/>
-</w:settings>
-</file>
-
-<file path=word\styles.xml><?xml version="1.0" encoding="utf-8"?>
+<file path=word/styles.xml><?xml version="1.0" encoding="utf-8"?>
 <w:styles xmlns:mc="http://schemas.openxmlformats.org/markup-compatibility/2006" xmlns:r="http://schemas.openxmlformats.org/officeDocument/2006/relationships" xmlns:w="http://schemas.openxmlformats.org/wordprocessingml/2006/main" xmlns:w14="http://schemas.microsoft.com/office/word/2010/wordml" xmlns:w15="http://schemas.microsoft.com/office/word/2012/wordml" xmlns:w16cex="http://schemas.microsoft.com/office/word/2018/wordml/cex" xmlns:w16cid="http://schemas.microsoft.com/office/word/2016/wordml/cid" xmlns:w16="http://schemas.microsoft.com/office/word/2018/wordml" xmlns:w16du="http://schemas.microsoft.com/office/word/2023/wordml/word16du" xmlns:w16sdtdh="http://schemas.microsoft.com/office/word/2020/wordml/sdtdatahash" xmlns:w16sdtfl="http://schemas.microsoft.com/office/word/2024/wordml/sdtformatlock" xmlns:w16se="http://schemas.microsoft.com/office/word/2015/wordml/symex" mc:Ignorable="w14 w15 w16se w16cid w16 w16cex w16sdtdh w16sdtfl w16du">
   <w:docDefaults>
     <w:rPrDefault>
@@ -1291,7 +953,7 @@
     </w:pPr>
   </w:style>
   <w:style w:type="character" w:customStyle="1" w:styleId="CabealhoChar">
-    <w:name w:val="Cabeçalho Char"/>
+    <w:name w:val="CabeÃ§alho Char"/>
     <w:basedOn w:val="Fontepargpadro"/>
     <w:link w:val="Cabealho"/>
     <w:uiPriority w:val="99"/>
@@ -1313,7 +975,7 @@
     </w:pPr>
   </w:style>
   <w:style w:type="character" w:customStyle="1" w:styleId="RodapChar">
-    <w:name w:val="Rodapé Char"/>
+    <w:name w:val="RodapÃ© Char"/>
     <w:basedOn w:val="Fontepargpadro"/>
     <w:link w:val="Rodap"/>
     <w:uiPriority w:val="99"/>
@@ -1322,7 +984,7 @@
 </w:styles>
 </file>
 
-<file path=word\theme\theme1.xml><?xml version="1.0" encoding="utf-8"?>
+<file path=word/theme/theme1.xml><?xml version="1.0" encoding="utf-8"?>
 <a:theme xmlns:a="http://schemas.openxmlformats.org/drawingml/2006/main" name="Tema do Office">
   <a:themeElements>
     <a:clrScheme name="Office">
@@ -1368,10 +1030,10 @@
         <a:latin typeface="Calibri Light" panose="020F0302020204030204"/>
         <a:ea typeface=""/>
         <a:cs typeface=""/>
-        <a:font script="Jpan" typeface="游ゴシック Light"/>
-        <a:font script="Hang" typeface="맑은 고딕"/>
-        <a:font script="Hans" typeface="等线 Light"/>
-        <a:font script="Hant" typeface="新細明體"/>
+        <a:font script="Jpan" typeface="æ¸¸ã´ã·ãã¯ Light"/>
+        <a:font script="Hang" typeface="ë§ì ê³ ë"/>
+        <a:font script="Hans" typeface="ç­çº¿ Light"/>
+        <a:font script="Hant" typeface="æ°ç´°æé«"/>
         <a:font script="Arab" typeface="Times New Roman"/>
         <a:font script="Hebr" typeface="Times New Roman"/>
         <a:font script="Thai" typeface="Angsana New"/>
@@ -1420,10 +1082,10 @@
         <a:latin typeface="Calibri" panose="020F0502020204030204"/>
         <a:ea typeface=""/>
         <a:cs typeface=""/>
-        <a:font script="Jpan" typeface="游明朝"/>
-        <a:font script="Hang" typeface="맑은 고딕"/>
-        <a:font script="Hans" typeface="等线"/>
-        <a:font script="Hant" typeface="新細明體"/>
+        <a:font script="Jpan" typeface="æ¸¸ææ"/>
+        <a:font script="Hang" typeface="ë§ì ê³ ë"/>
+        <a:font script="Hans" typeface="ç­çº¿"/>
+        <a:font script="Hant" typeface="æ°ç´°æé«"/>
         <a:font script="Arab" typeface="Arial"/>
         <a:font script="Hebr" typeface="Arial"/>
         <a:font script="Thai" typeface="Cordia New"/>
@@ -1617,9 +1279,14 @@
 </a:theme>
 </file>
 
-<file path=word\webSettings.xml><?xml version="1.0" encoding="utf-8"?>
-<w:webSettings xmlns:mc="http://schemas.openxmlformats.org/markup-compatibility/2006" xmlns:r="http://schemas.openxmlformats.org/officeDocument/2006/relationships" xmlns:w="http://schemas.openxmlformats.org/wordprocessingml/2006/main" xmlns:w14="http://schemas.microsoft.com/office/word/2010/wordml" xmlns:w15="http://schemas.microsoft.com/office/word/2012/wordml" xmlns:w16cex="http://schemas.microsoft.com/office/word/2018/wordml/cex" xmlns:w16cid="http://schemas.microsoft.com/office/word/2016/wordml/cid" xmlns:w16="http://schemas.microsoft.com/office/word/2018/wordml" xmlns:w16du="http://schemas.microsoft.com/office/word/2023/wordml/word16du" xmlns:w16sdtdh="http://schemas.microsoft.com/office/word/2020/wordml/sdtdatahash" xmlns:w16sdtfl="http://schemas.microsoft.com/office/word/2024/wordml/sdtformatlock" xmlns:w16se="http://schemas.microsoft.com/office/word/2015/wordml/symex" mc:Ignorable="w14 w15 w16se w16cid w16 w16cex w16sdtdh w16sdtfl w16du">
-  <w:optimizeForBrowser/>
-  <w:allowPNG/>
-</w:webSettings>
+<file path=customXml/item1.xml><?xml version="1.0" encoding="utf-8"?>
+<b:Sources xmlns:b="http://schemas.openxmlformats.org/officeDocument/2006/bibliography" xmlns="http://schemas.openxmlformats.org/officeDocument/2006/bibliography" SelectedStyle="\APASixthEditionOfficeOnline.xsl" StyleName="APA" Version="6"/>
+</file>
+
+<file path=customXml/itemProps1.xml><?xml version="1.0" encoding="utf-8"?>
+<ds:datastoreItem xmlns:ds="http://schemas.openxmlformats.org/officeDocument/2006/customXml" ds:itemID="{A7DD5006-7470-48BE-9D47-026026213AC3}">
+  <ds:schemaRefs>
+    <ds:schemaRef ds:uri="http://schemas.openxmlformats.org/officeDocument/2006/bibliography"/>
+  </ds:schemaRefs>
+</ds:datastoreItem>
 </file>
</xml_diff>

<commit_message>
fix: gerar DOCX de condicionantes valido no Word e nomear exportacao com o empreendimento
</commit_message>
<xml_diff>
--- a/src/lib/templates/relatorio-condicionantes/template.docx
+++ b/src/lib/templates/relatorio-condicionantes/template.docx
@@ -23,7 +23,7 @@
           <w:sz w:val="24"/>
           <w:szCs w:val="24"/>
         </w:rPr>
-        <w:t xml:space="preserve">RELATÃRIO DE ATENDIMENTO A CONDICIONANTES</w:t>
+        <w:t xml:space="preserve">RELATÓRIO DE ATENDIMENTO A CONDICIONANTES</w:t>
       </w:r>
     </w:p>
     <w:p>
@@ -45,7 +45,7 @@
           <w:sz w:val="22"/>
           <w:szCs w:val="22"/>
         </w:rPr>
-        <w:t xml:space="preserve">{tipo} NÂº {num_licenca}</w:t>
+        <w:t xml:space="preserve">{tipo} Nº {num_licenca}</w:t>
       </w:r>
     </w:p>
     <w:p>
@@ -63,7 +63,7 @@
           <w:sz w:val="20"/>
           <w:szCs w:val="20"/>
         </w:rPr>
-        <w:t xml:space="preserve">EstÃ£o previstos como Detalhamento dos Requisitos de Licenciamento:</w:t>
+        <w:t xml:space="preserve">Estão previstos como Detalhamento dos Requisitos de Licenciamento:</w:t>
       </w:r>
     </w:p>
     <w:tbl>
@@ -296,8 +296,181 @@
 </w:ftr>
 </file>
 
-<file path=word/footer2.xml>ï»¿<?xml version="1.0" encoding="UTF-8" standalone="yes"?>
-<w:ftr xmlns:wpc="http://schemas.microsoft.com/office/word/2010/wordprocessingCanvas" xmlns:cx="http://schemas.microsoft.com/office/drawing/2014/chartex" xmlns:cx1="http://schemas.microsoft.com/office/drawing/2015/9/8/chartex" xmlns:cx2="http://schemas.microsoft.com/office/drawing/2015/10/21/chartex" xmlns:cx3="http://schemas.microsoft.com/office/drawing/2016/5/9/chartex" xmlns:cx4="http://schemas.microsoft.com/office/drawing/2016/5/10/chartex" xmlns:cx5="http://schemas.microsoft.com/office/drawing/2016/5/11/chartex" xmlns:cx6="http://schemas.microsoft.com/office/drawing/2016/5/12/chartex" xmlns:cx7="http://schemas.microsoft.com/office/drawing/2016/5/13/chartex" xmlns:cx8="http://schemas.microsoft.com/office/drawing/2016/5/14/chartex" xmlns:mc="http://schemas.openxmlformats.org/markup-compatibility/2006" xmlns:aink="http://schemas.microsoft.com/office/drawing/2016/ink" xmlns:am3d="http://schemas.microsoft.com/office/drawing/2017/model3d" xmlns:o="urn:schemas-microsoft-com:office:office" xmlns:oel="http://schemas.microsoft.com/office/2019/extlst" xmlns:r="http://schemas.openxmlformats.org/officeDocument/2006/relationships" xmlns:m="http://schemas.openxmlformats.org/officeDocument/2006/math" xmlns:v="urn:schemas-microsoft-com:vml" xmlns:wp14="http://schemas.microsoft.com/office/word/2010/wordprocessingDrawing" xmlns:wp="http://schemas.openxmlformats.org/drawingml/2006/wordprocessingDrawing" xmlns:w10="urn:schemas-microsoft-com:office:word" xmlns:w="http://schemas.openxmlformats.org/wordprocessingml/2006/main" xmlns:w14="http://schemas.microsoft.com/office/word/2010/wordml" xmlns:w15="http://schemas.microsoft.com/office/word/2012/wordml" xmlns:w16cei="http://schemas.microsoft.com/office/word/2026/wordml/cei" xmlns:w16cex="http://schemas.microsoft.com/office/word/2018/wordml/cex" xmlns:w16cid="http://schemas.microsoft.com/office/word/2016/wordml/cid" xmlns:w16="http://schemas.microsoft.com/office/word/2018/wordml" xmlns:w16du="http://schemas.microsoft.com/office/word/2023/wordml/word16du" xmlns:w16sdtdh="http://schemas.microsoft.com/office/word/2020/wordml/sdtdatahash" xmlns:w16sdtfl="http://schemas.microsoft.com/office/word/2024/wordml/sdtformatlock" xmlns:w16se="http://schemas.microsoft.com/office/word/2015/wordml/symex" xmlns:wpg="http://schemas.microsoft.com/office/word/2010/wordprocessingGroup" xmlns:wpi="http://schemas.microsoft.com/office/word/2010/wordprocessingInk" xmlns:wne="http://schemas.microsoft.com/office/word/2006/wordml" xmlns:wps="http://schemas.microsoft.com/office/word/2010/wordprocessingShape" mc:Ignorable="w14 w15 w16se w16cid w16 w16cex w16sdtdh w16sdtfl w16du wp14"><w:p><w:pPr><w:pStyle w:val="Cabealho"/></w:pPr><w:r><w:rPr><w:noProof/></w:rPr><mc:AlternateContent><mc:Choice Requires="wps"><w:drawing><wp:anchor distT="0" distB="0" distL="114300" distR="114300" simplePos="0" relativeHeight="251666432" behindDoc="0" locked="0" layoutInCell="1" allowOverlap="1" wp14:anchorId="04A0C177" wp14:editId="0B88E321"><wp:simplePos x="0" y="0"/><wp:positionH relativeFrom="column"><wp:posOffset>-3562</wp:posOffset></wp:positionH><wp:positionV relativeFrom="paragraph"><wp:posOffset>85642</wp:posOffset></wp:positionV><wp:extent cx="5578475" cy="0"/><wp:effectExtent l="19050" t="19050" r="98425" b="114300"/><wp:wrapNone/><wp:docPr id="195" name="Conector reto 195"/><wp:cNvGraphicFramePr/><a:graphic xmlns:a="http://schemas.openxmlformats.org/drawingml/2006/main"><a:graphicData uri="http://schemas.microsoft.com/office/word/2010/wordprocessingShape"><wps:wsp><wps:cNvCnPr/><wps:spPr><a:xfrm><a:off x="0" y="0"/><a:ext cx="5578475" cy="0"/></a:xfrm><a:prstGeom prst="line"><a:avLst/></a:prstGeom><a:effectLst><a:outerShdw blurRad="50800" dist="50800" dir="2400000" algn="ctr" rotWithShape="0"><a:schemeClr val="accent1"><a:lumMod val="60000"/><a:lumOff val="40000"/></a:schemeClr></a:outerShdw></a:effectLst></wps:spPr><wps:style><a:lnRef idx="3"><a:schemeClr val="accent6"/></a:lnRef><a:fillRef idx="0"><a:schemeClr val="accent6"/></a:fillRef><a:effectRef idx="2"><a:schemeClr val="accent6"/></a:effectRef><a:fontRef idx="minor"><a:schemeClr val="tx1"/></a:fontRef></wps:style><wps:bodyPr/></wps:wsp></a:graphicData></a:graphic><wp14:sizeRelH relativeFrom="margin"><wp14:pctWidth>0</wp14:pctWidth></wp14:sizeRelH></wp:anchor></w:drawing></mc:Choice><mc:Fallback><w:pict><v:line w14:anchorId="52925A08" id="Conector reto 195" o:spid="_x0000_s1026" style="position:absolute;z-index:251666432;visibility:visible;mso-wrap-style:square;mso-width-percent:0;mso-wrap-distance-left:9pt;mso-wrap-distance-top:0;mso-wrap-distance-right:9pt;mso-wrap-distance-bottom:0;mso-position-horizontal:absolute;mso-position-horizontal-relative:text;mso-position-vertical:absolute;mso-position-vertical-relative:text;mso-width-percent:0;mso-width-relative:margin" from="-.3pt,6.75pt" to="438.95pt,6.75pt" o:gfxdata="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" strokecolor="#70ad47 [3209]" strokeweight="1.5pt"><v:stroke joinstyle="miter"/><v:shadow on="t" color="#8eaadb [1940]" offset="1.081mm,.90706mm"/></v:line></w:pict></mc:Fallback></mc:AlternateContent></w:r><w:r><w:t xml:space="preserve">   </w:t></w:r></w:p><w:p><w:pPr><w:pStyle w:val="Cabealho"/><w:jc w:val="center"/><w:rPr><w:rFonts w:ascii="Bahnschrift SemiCondensed" w:hAnsi="Bahnschrift SemiCondensed"/><w:color w:val="538135" w:themeColor="accent6" w:themeShade="BF"/><w:sz w:val="18"/><w:szCs w:val="18"/><w:u w:val="single"/></w:rPr></w:pPr><w:r><w:rPr><w:rFonts w:ascii="Bahnschrift SemiCondensed" w:hAnsi="Bahnschrift SemiCondensed"/><w:color w:val="538135" w:themeColor="accent6" w:themeShade="BF"/><w:sz w:val="18"/><w:szCs w:val="18"/></w:rPr><w:t xml:space="preserve">R. Padre JosÃÂ© </w:t></w:r><w:proofErr w:type="spellStart"/><w:r><w:rPr><w:rFonts w:ascii="Bahnschrift SemiCondensed" w:hAnsi="Bahnschrift SemiCondensed"/><w:color w:val="538135" w:themeColor="accent6" w:themeShade="BF"/><w:sz w:val="18"/><w:szCs w:val="18"/></w:rPr><w:t>Kentenich</w:t></w:r><w:proofErr w:type="spellEnd"/><w:r><w:rPr><w:rFonts w:ascii="Bahnschrift SemiCondensed" w:hAnsi="Bahnschrift SemiCondensed"/><w:color w:val="538135" w:themeColor="accent6" w:themeShade="BF"/><w:sz w:val="18"/><w:szCs w:val="18"/></w:rPr><w:t xml:space="preserve">, 900, </w:t></w:r><w:proofErr w:type="spellStart"/><w:r><w:rPr><w:rFonts w:ascii="Bahnschrift SemiCondensed" w:hAnsi="Bahnschrift SemiCondensed"/><w:color w:val="538135" w:themeColor="accent6" w:themeShade="BF"/><w:sz w:val="18"/><w:szCs w:val="18"/></w:rPr><w:t>cs</w:t></w:r><w:proofErr w:type="spellEnd"/><w:r><w:rPr><w:rFonts w:ascii="Bahnschrift SemiCondensed" w:hAnsi="Bahnschrift SemiCondensed"/><w:color w:val="538135" w:themeColor="accent6" w:themeShade="BF"/><w:sz w:val="18"/><w:szCs w:val="18"/></w:rPr><w:t xml:space="preserve"> 53, </w:t></w:r><w:r><w:rPr><w:rFonts w:ascii="Bahnschrift SemiCondensed" w:hAnsi="Bahnschrift SemiCondensed"/><w:color w:val="538135" w:themeColor="accent6" w:themeShade="BF"/><w:sz w:val="18"/><w:szCs w:val="18"/></w:rPr><w:t xml:space="preserve">Campo Comprido, </w:t></w:r><w:r><w:rPr><w:rFonts w:ascii="Bahnschrift SemiCondensed" w:hAnsi="Bahnschrift SemiCondensed"/><w:color w:val="538135" w:themeColor="accent6" w:themeShade="BF"/><w:sz w:val="18"/><w:szCs w:val="18"/></w:rPr><w:t>Curitiba, PR. CEP 81.210-342</w:t></w:r><w:r><w:rPr><w:rFonts w:ascii="Bahnschrift SemiCondensed" w:hAnsi="Bahnschrift SemiCondensed"/><w:color w:val="538135" w:themeColor="accent6" w:themeShade="BF"/><w:sz w:val="18"/><w:szCs w:val="18"/></w:rPr><w:t>. E-mail: nagalliambiental@gmail.com</w:t></w:r></w:p></w:ftr>
+<file path=word/footer2.xml><?xml version="1.0" encoding="utf-8"?>
+<w:ftr xmlns:wpc="http://schemas.microsoft.com/office/word/2010/wordprocessingCanvas" xmlns:cx="http://schemas.microsoft.com/office/drawing/2014/chartex" xmlns:cx1="http://schemas.microsoft.com/office/drawing/2015/9/8/chartex" xmlns:cx2="http://schemas.microsoft.com/office/drawing/2015/10/21/chartex" xmlns:cx3="http://schemas.microsoft.com/office/drawing/2016/5/9/chartex" xmlns:cx4="http://schemas.microsoft.com/office/drawing/2016/5/10/chartex" xmlns:cx5="http://schemas.microsoft.com/office/drawing/2016/5/11/chartex" xmlns:cx6="http://schemas.microsoft.com/office/drawing/2016/5/12/chartex" xmlns:cx7="http://schemas.microsoft.com/office/drawing/2016/5/13/chartex" xmlns:cx8="http://schemas.microsoft.com/office/drawing/2016/5/14/chartex" xmlns:mc="http://schemas.openxmlformats.org/markup-compatibility/2006" xmlns:aink="http://schemas.microsoft.com/office/drawing/2016/ink" xmlns:am3d="http://schemas.microsoft.com/office/drawing/2017/model3d" xmlns:o="urn:schemas-microsoft-com:office:office" xmlns:oel="http://schemas.microsoft.com/office/2019/extlst" xmlns:r="http://schemas.openxmlformats.org/officeDocument/2006/relationships" xmlns:m="http://schemas.openxmlformats.org/officeDocument/2006/math" xmlns:v="urn:schemas-microsoft-com:vml" xmlns:wp14="http://schemas.microsoft.com/office/word/2010/wordprocessingDrawing" xmlns:wp="http://schemas.openxmlformats.org/drawingml/2006/wordprocessingDrawing" xmlns:w10="urn:schemas-microsoft-com:office:word" xmlns:w="http://schemas.openxmlformats.org/wordprocessingml/2006/main" xmlns:w14="http://schemas.microsoft.com/office/word/2010/wordml" xmlns:w15="http://schemas.microsoft.com/office/word/2012/wordml" xmlns:w16cei="http://schemas.microsoft.com/office/word/2026/wordml/cei" xmlns:w16cex="http://schemas.microsoft.com/office/word/2018/wordml/cex" xmlns:w16cid="http://schemas.microsoft.com/office/word/2016/wordml/cid" xmlns:w16="http://schemas.microsoft.com/office/word/2018/wordml" xmlns:w16du="http://schemas.microsoft.com/office/word/2023/wordml/word16du" xmlns:w16sdtdh="http://schemas.microsoft.com/office/word/2020/wordml/sdtdatahash" xmlns:w16sdtfl="http://schemas.microsoft.com/office/word/2024/wordml/sdtformatlock" xmlns:w16se="http://schemas.microsoft.com/office/word/2015/wordml/symex" xmlns:wpg="http://schemas.microsoft.com/office/word/2010/wordprocessingGroup" xmlns:wpi="http://schemas.microsoft.com/office/word/2010/wordprocessingInk" xmlns:wne="http://schemas.microsoft.com/office/word/2006/wordml" xmlns:wps="http://schemas.microsoft.com/office/word/2010/wordprocessingShape" mc:Ignorable="w14 w15 w16se w16cid w16 w16cex w16sdtdh w16sdtfl w16du wp14">
+  <w:p>
+    <w:pPr>
+      <w:pStyle w:val="Cabealho"/>
+    </w:pPr>
+    <w:r>
+      <w:rPr>
+        <w:noProof/>
+      </w:rPr>
+      <mc:AlternateContent>
+        <mc:Choice Requires="wps">
+          <w:drawing>
+            <wp:anchor distT="0" distB="0" distL="114300" distR="114300" simplePos="0" relativeHeight="251666432" behindDoc="0" locked="0" layoutInCell="1" allowOverlap="1" wp14:anchorId="04A0C177" wp14:editId="0B88E321">
+              <wp:simplePos x="0" y="0"/>
+              <wp:positionH relativeFrom="column">
+                <wp:posOffset>-3562</wp:posOffset>
+              </wp:positionH>
+              <wp:positionV relativeFrom="paragraph">
+                <wp:posOffset>85642</wp:posOffset>
+              </wp:positionV>
+              <wp:extent cx="5578475" cy="0"/>
+              <wp:effectExtent l="19050" t="19050" r="98425" b="114300"/>
+              <wp:wrapNone/>
+              <wp:docPr id="195" name="Conector reto 195"/>
+              <wp:cNvGraphicFramePr/>
+              <a:graphic xmlns:a="http://schemas.openxmlformats.org/drawingml/2006/main">
+                <a:graphicData uri="http://schemas.microsoft.com/office/word/2010/wordprocessingShape">
+                  <wps:wsp>
+                    <wps:cNvCnPr/>
+                    <wps:spPr>
+                      <a:xfrm>
+                        <a:off x="0" y="0"/>
+                        <a:ext cx="5578475" cy="0"/>
+                      </a:xfrm>
+                      <a:prstGeom prst="line">
+                        <a:avLst/>
+                      </a:prstGeom>
+                      <a:effectLst>
+                        <a:outerShdw blurRad="50800" dist="50800" dir="2400000" algn="ctr" rotWithShape="0">
+                          <a:schemeClr val="accent1">
+                            <a:lumMod val="60000"/>
+                            <a:lumOff val="40000"/>
+                          </a:schemeClr>
+                        </a:outerShdw>
+                      </a:effectLst>
+                    </wps:spPr>
+                    <wps:style>
+                      <a:lnRef idx="3">
+                        <a:schemeClr val="accent6"/>
+                      </a:lnRef>
+                      <a:fillRef idx="0">
+                        <a:schemeClr val="accent6"/>
+                      </a:fillRef>
+                      <a:effectRef idx="2">
+                        <a:schemeClr val="accent6"/>
+                      </a:effectRef>
+                      <a:fontRef idx="minor">
+                        <a:schemeClr val="tx1"/>
+                      </a:fontRef>
+                    </wps:style>
+                    <wps:bodyPr/>
+                  </wps:wsp>
+                </a:graphicData>
+              </a:graphic>
+              <wp14:sizeRelH relativeFrom="margin">
+                <wp14:pctWidth>0</wp14:pctWidth>
+              </wp14:sizeRelH>
+            </wp:anchor>
+          </w:drawing>
+        </mc:Choice>
+        <mc:Fallback>
+          <w:pict>
+            <v:line w14:anchorId="52925A08" id="Conector reto 195" o:spid="_x0000_s1026" style="position:absolute;z-index:251666432;visibility:visible;mso-wrap-style:square;mso-width-percent:0;mso-wrap-distance-left:9pt;mso-wrap-distance-top:0;mso-wrap-distance-right:9pt;mso-wrap-distance-bottom:0;mso-position-horizontal:absolute;mso-position-horizontal-relative:text;mso-position-vertical:absolute;mso-position-vertical-relative:text;mso-width-percent:0;mso-width-relative:margin" from="-.3pt,6.75pt" to="438.95pt,6.75pt" o:gfxdata="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" strokecolor="#70ad47 [3209]" strokeweight="1.5pt">
+              <v:stroke joinstyle="miter"/>
+              <v:shadow on="t" color="#8eaadb [1940]" offset="1.081mm,.90706mm"/>
+            </v:line>
+          </w:pict>
+        </mc:Fallback>
+      </mc:AlternateContent>
+    </w:r>
+    <w:r>
+      <w:t xml:space="preserve">   </w:t>
+    </w:r>
+  </w:p>
+  <w:p>
+    <w:pPr>
+      <w:pStyle w:val="Cabealho"/>
+      <w:jc w:val="center"/>
+      <w:rPr>
+        <w:rFonts w:ascii="Bahnschrift SemiCondensed" w:hAnsi="Bahnschrift SemiCondensed"/>
+        <w:color w:val="538135" w:themeColor="accent6" w:themeShade="BF"/>
+        <w:sz w:val="18"/>
+        <w:szCs w:val="18"/>
+        <w:u w:val="single"/>
+      </w:rPr>
+    </w:pPr>
+    <w:r>
+      <w:rPr>
+        <w:rFonts w:ascii="Bahnschrift SemiCondensed" w:hAnsi="Bahnschrift SemiCondensed"/>
+        <w:color w:val="538135" w:themeColor="accent6" w:themeShade="BF"/>
+        <w:sz w:val="18"/>
+        <w:szCs w:val="18"/>
+      </w:rPr>
+      <w:t xml:space="preserve">R. Padre JosÃ© </w:t>
+    </w:r>
+    <w:proofErr w:type="spellStart"/>
+    <w:r>
+      <w:rPr>
+        <w:rFonts w:ascii="Bahnschrift SemiCondensed" w:hAnsi="Bahnschrift SemiCondensed"/>
+        <w:color w:val="538135" w:themeColor="accent6" w:themeShade="BF"/>
+        <w:sz w:val="18"/>
+        <w:szCs w:val="18"/>
+      </w:rPr>
+      <w:t>Kentenich</w:t>
+    </w:r>
+    <w:proofErr w:type="spellEnd"/>
+    <w:r>
+      <w:rPr>
+        <w:rFonts w:ascii="Bahnschrift SemiCondensed" w:hAnsi="Bahnschrift SemiCondensed"/>
+        <w:color w:val="538135" w:themeColor="accent6" w:themeShade="BF"/>
+        <w:sz w:val="18"/>
+        <w:szCs w:val="18"/>
+      </w:rPr>
+      <w:t xml:space="preserve">, 900, </w:t>
+    </w:r>
+    <w:proofErr w:type="spellStart"/>
+    <w:r>
+      <w:rPr>
+        <w:rFonts w:ascii="Bahnschrift SemiCondensed" w:hAnsi="Bahnschrift SemiCondensed"/>
+        <w:color w:val="538135" w:themeColor="accent6" w:themeShade="BF"/>
+        <w:sz w:val="18"/>
+        <w:szCs w:val="18"/>
+      </w:rPr>
+      <w:t>cs</w:t>
+    </w:r>
+    <w:proofErr w:type="spellEnd"/>
+    <w:r>
+      <w:rPr>
+        <w:rFonts w:ascii="Bahnschrift SemiCondensed" w:hAnsi="Bahnschrift SemiCondensed"/>
+        <w:color w:val="538135" w:themeColor="accent6" w:themeShade="BF"/>
+        <w:sz w:val="18"/>
+        <w:szCs w:val="18"/>
+      </w:rPr>
+      <w:t xml:space="preserve"> 53, </w:t>
+    </w:r>
+    <w:r>
+      <w:rPr>
+        <w:rFonts w:ascii="Bahnschrift SemiCondensed" w:hAnsi="Bahnschrift SemiCondensed"/>
+        <w:color w:val="538135" w:themeColor="accent6" w:themeShade="BF"/>
+        <w:sz w:val="18"/>
+        <w:szCs w:val="18"/>
+      </w:rPr>
+      <w:t xml:space="preserve">Campo Comprido, </w:t>
+    </w:r>
+    <w:r>
+      <w:rPr>
+        <w:rFonts w:ascii="Bahnschrift SemiCondensed" w:hAnsi="Bahnschrift SemiCondensed"/>
+        <w:color w:val="538135" w:themeColor="accent6" w:themeShade="BF"/>
+        <w:sz w:val="18"/>
+        <w:szCs w:val="18"/>
+      </w:rPr>
+      <w:t>Curitiba, PR. CEP 81.210-342</w:t>
+    </w:r>
+    <w:r>
+      <w:rPr>
+        <w:rFonts w:ascii="Bahnschrift SemiCondensed" w:hAnsi="Bahnschrift SemiCondensed"/>
+        <w:color w:val="538135" w:themeColor="accent6" w:themeShade="BF"/>
+        <w:sz w:val="18"/>
+        <w:szCs w:val="18"/>
+      </w:rPr>
+      <w:t>. E-mail: nagalliambiental@gmail.com</w:t>
+    </w:r>
+  </w:p>
+</w:ftr>
 </file>
 
 <file path=word/footer3.xml><?xml version="1.0" encoding="utf-8"?>
@@ -953,7 +1126,7 @@
     </w:pPr>
   </w:style>
   <w:style w:type="character" w:customStyle="1" w:styleId="CabealhoChar">
-    <w:name w:val="CabeÃ§alho Char"/>
+    <w:name w:val="Cabeçalho Char"/>
     <w:basedOn w:val="Fontepargpadro"/>
     <w:link w:val="Cabealho"/>
     <w:uiPriority w:val="99"/>
@@ -975,7 +1148,7 @@
     </w:pPr>
   </w:style>
   <w:style w:type="character" w:customStyle="1" w:styleId="RodapChar">
-    <w:name w:val="RodapÃ© Char"/>
+    <w:name w:val="Rodapé Char"/>
     <w:basedOn w:val="Fontepargpadro"/>
     <w:link w:val="Rodap"/>
     <w:uiPriority w:val="99"/>
@@ -1030,10 +1203,10 @@
         <a:latin typeface="Calibri Light" panose="020F0302020204030204"/>
         <a:ea typeface=""/>
         <a:cs typeface=""/>
-        <a:font script="Jpan" typeface="æ¸¸ã´ã·ãã¯ Light"/>
-        <a:font script="Hang" typeface="ë§ì ê³ ë"/>
-        <a:font script="Hans" typeface="ç­çº¿ Light"/>
-        <a:font script="Hant" typeface="æ°ç´°æé«"/>
+        <a:font script="Jpan" typeface="游ゴシック Light"/>
+        <a:font script="Hang" typeface="맑은 고딕"/>
+        <a:font script="Hans" typeface="等线 Light"/>
+        <a:font script="Hant" typeface="新細明體"/>
         <a:font script="Arab" typeface="Times New Roman"/>
         <a:font script="Hebr" typeface="Times New Roman"/>
         <a:font script="Thai" typeface="Angsana New"/>
@@ -1082,10 +1255,10 @@
         <a:latin typeface="Calibri" panose="020F0502020204030204"/>
         <a:ea typeface=""/>
         <a:cs typeface=""/>
-        <a:font script="Jpan" typeface="æ¸¸ææ"/>
-        <a:font script="Hang" typeface="ë§ì ê³ ë"/>
-        <a:font script="Hans" typeface="ç­çº¿"/>
-        <a:font script="Hant" typeface="æ°ç´°æé«"/>
+        <a:font script="Jpan" typeface="游明朝"/>
+        <a:font script="Hang" typeface="맑은 고딕"/>
+        <a:font script="Hans" typeface="等线"/>
+        <a:font script="Hant" typeface="新細明體"/>
         <a:font script="Arab" typeface="Arial"/>
         <a:font script="Hebr" typeface="Arial"/>
         <a:font script="Thai" typeface="Cordia New"/>

</xml_diff>